<commit_message>
Add Task 4 GPU algorithm comparison proposal to report and analysis
</commit_message>
<xml_diff>
--- a/Final/Report/FinalProject_Arsov.docx
+++ b/Final/Report/FinalProject_Arsov.docx
@@ -1679,7 +1679,7 @@
         <w:pStyle w:val="ListBullet"/>
       </w:pPr>
       <w:r>
-        <w:t>Parallel sort-based CPU collision search: replacing unordered_map with a flat sorted array would reduce memory to ~43 GB at bits=64 and enable a fully parallel collision detection step via radix sort + linear scan, potentially reaching bits=64 on CPU in 20–30 seconds on a high-memory server.</w:t>
+        <w:t>bits=80 GPU: achievable in ~30 minutes but exceeds Euler's 40-minute instruction partition limit. Running on a partition with longer wall-clock limits would extend the speedup curve one more data point to bits=80.</w:t>
       </w:r>
     </w:p>
     <w:p>
@@ -1687,7 +1687,13 @@
         <w:pStyle w:val="ListBullet"/>
       </w:pPr>
       <w:r>
-        <w:t>bits=80 GPU: achievable in ~30 minutes but exceeds Euler's 40-minute instruction partition limit. Running on a partition with longer wall-clock limits would extend the speedup curve to bits=80.</w:t>
+        <w:t>Parallel sort-based CPU collision search: replacing unordered_map with a flat sorted array reduces memory to ~43 GB at bits=64. A fully parallel radix sort + linear scan could reach bits=64 on CPU in 20–30 seconds on a high-memory server, narrowing the algorithmic gap with Pollard's rho.</w:t>
+      </w:r>
+    </w:p>
+    <w:p>
+      <w:pPr/>
+      <w:r>
+        <w:t>Task 4 — GPU Algorithm Comparison: A natural extension is to benchmark three fundamentally different GPU collision search strategies against each other to identify where each provides maximum speedup and understand the memory/compute tradeoff. Two strong candidates:</w:t>
       </w:r>
     </w:p>
     <w:p>
@@ -1695,7 +1701,21 @@
         <w:pStyle w:val="ListBullet"/>
       </w:pPr>
       <w:r>
-        <w:t>cuBLAS-accelerated SHA: exploring whether batched GEMM or tensor cores can accelerate the inner loop of SHA compression functions for throughput gains beyond the current register-bound implementation.</w:t>
+        <w:t>GPU Birthday Attack with device-side concurrent hash table. Allocate a large open-addressing hash table directly in GPU VRAM and have all 65,536 threads insert (truncated_hash → index) pairs in parallel using atomicCAS for lock-free collision detection. No CPU-side merge step is needed — the collision is detected on-device the moment two threads map to the same slot. Expected behavior: at small bit widths (bits≤48) where the entire table fits in GPU VRAM (8 GB GPU holds 2^29 × 8B = 4 GB), this approach should be faster than Pollard's rho because it eliminates the chain-walking overhead and the DP detection round-trips. At bits≥56 the table exceeds VRAM and Pollard's rho with O(1) memory wins. The crossover point is the main finding. Implementation: a flat uint64_t[2^(bits/2+2)] device array, atomicCAS for insert, a single __global__ kernel with early-exit via a device-side flag.</w:t>
+      </w:r>
+    </w:p>
+    <w:p>
+      <w:pPr>
+        <w:pStyle w:val="ListBullet"/>
+      </w:pPr>
+      <w:r>
+        <w:t>GPU Thrust Parallel Sort. Hash a full batch of N = sqrt(pi/2) * 2^(bits/2) inputs on GPU, store (hash, index) pairs in device memory, then use thrust::sort_by_key to sort by hash, and a final kernel to scan for adjacent equal-hash pairs. This is entirely GPU-resident — no CPU merge bottleneck — and directly parallelizes the sort-based approach that would improve CPU performance. Expected behavior: faster than Pollard's rho at small bits (sort is O(N log N) but fully parallel and cache-friendly); slower at large bits where N exceeds VRAM. Thrust radix sort on GPU achieves ~1 GB/s for 64-bit keys, placing bits=48 (16M pairs × 16B = 256 MB) at ~0.3 seconds sort time, well under Pollard's 544 ms. The crossover with Pollard's rho is expected around bits=52–56, where the Thrust sort working set saturates VRAM. Implementation: thrust::device_vector&lt;thrust::pair&lt;uint64_t,uint64_t&gt;&gt;, thrust::sort_by_key, then thrust::adjacent_difference to flag duplicates.</w:t>
+      </w:r>
+    </w:p>
+    <w:p>
+      <w:pPr/>
+      <w:r>
+        <w:t>Together, Tasks 3 and 4 would establish a complete GPU algorithm selection guide: Thrust sort wins at bits≤50, GPU birthday table wins at bits≤56 (given sufficient VRAM), and Pollard's rho with distinguished points wins at bits≥56 where O(1) memory is the only feasible approach.</w:t>
       </w:r>
     </w:p>
     <w:p>

</xml_diff>

<commit_message>
Add Claude Code / Sonnet 4.6 citation to references in both reports
</commit_message>
<xml_diff>
--- a/Final/Report/FinalProject_Arsov.docx
+++ b/Final/Report/FinalProject_Arsov.docx
@@ -1756,6 +1756,12 @@
         <w:t>[5] OpenMP Architecture Review Board. OpenMP Application Programming Interface, Version 5.2. 2021.</w:t>
       </w:r>
     </w:p>
+    <w:p>
+      <w:pPr/>
+      <w:r>
+        <w:t>[6] Anthropic. (2026). Claude Code with Claude Sonnet 4.6 (claude-sonnet-4-6) [AI coding assistant]. Used for code generation, algorithm implementation, and analysis throughout this project. https://www.anthropic.com/claude-code</w:t>
+      </w:r>
+    </w:p>
     <w:sectPr>
       <w:pgSz w:w="12240" w:h="15840"/>
       <w:pgMar w:top="1440" w:right="1800" w:bottom="1440" w:left="1800" w:header="720" w:footer="720" w:gutter="0"/>

</xml_diff>

<commit_message>
Add CUDA guide, Pollard (1978), Flajolet & Odlyzko, and Thrust references to both reports
</commit_message>
<xml_diff>
--- a/Final/Report/FinalProject_Arsov.docx
+++ b/Final/Report/FinalProject_Arsov.docx
@@ -1759,7 +1759,31 @@
     <w:p>
       <w:pPr/>
       <w:r>
-        <w:t>[6] Anthropic. (2026). Claude Code with Claude Sonnet 4.6 (claude-sonnet-4-6) [AI coding assistant]. Used for code generation, algorithm implementation, and analysis throughout this project. https://www.anthropic.com/claude-code</w:t>
+        <w:t>[6] NVIDIA Corporation. (2024). CUDA C++ Programming Guide. https://docs.nvidia.com/cuda/cuda-c-programming-guide/ (cudaEvent_t timing, __constant__ memory, atomicAdd, warp scheduling, register file occupancy.)</w:t>
+      </w:r>
+    </w:p>
+    <w:p>
+      <w:pPr/>
+      <w:r>
+        <w:t>[7] Pollard, J. M. (1978). Monte Carlo methods for index computation mod p. Mathematics of Computation, 32(143), 918–924. (Original rho cycle-detection algorithm; extended by van Oorschot &amp; Wiener [3].)</w:t>
+      </w:r>
+    </w:p>
+    <w:p>
+      <w:pPr/>
+      <w:r>
+        <w:t>[8] Flajolet, P., &amp; Odlyzko, A. (1990). Random mapping statistics. Advances in Cryptology – EUROCRYPT '89, Lecture Notes in Computer Science, vol. 434, pp. 329–354. Springer. (Source for birthday paradox collision expectation E ≈ √(π/2) · 2^(N/2).)</w:t>
+      </w:r>
+    </w:p>
+    <w:p>
+      <w:pPr/>
+      <w:r>
+        <w:t>[9] Bell, N., &amp; Hoberock, J. (2011). Thrust: A productivity-oriented library for CUDA. GPU Computing Gems Jade Edition, pp. 359–371. Morgan Kaufmann. (Referenced in Task 4 proposal for GPU parallel sort-based collision search.)</w:t>
+      </w:r>
+    </w:p>
+    <w:p>
+      <w:pPr/>
+      <w:r>
+        <w:t>[10] Anthropic. (2026). Claude Code with Claude Sonnet 4.6 (claude-sonnet-4-6) [AI coding assistant]. Used for code generation, algorithm implementation, and analysis throughout this project. https://www.anthropic.com/claude-code</w:t>
       </w:r>
     </w:p>
     <w:sectPr>

</xml_diff>

<commit_message>
Add Task 4: GPU Thrust parallel sort collision search
- gpu_hashes_narrow.cuh: shared device hash functions for reuse
- task4.cu: hash batch -> thrust::sort_by_key -> find adjacent duplicate
- bits sweep capped at 48 (sort working set saturates 8 GB VRAM at bits >=52)
- 3-phase pattern: parallel hash kernel, Thrust sort, parallel duplicate-scan kernel
- sbatch script + plot script that compares Thrust vs Pollard's rho
- Final report Section 3.4 promotes Task 4 from proposal to implemented results
</commit_message>
<xml_diff>
--- a/Final/Report/FinalProject_Arsov.docx
+++ b/Final/Report/FinalProject_Arsov.docx
@@ -192,6 +192,22 @@
       </w:pPr>
       <w:r>
         <w:t>task3.cu — collision search: CPU serial, OpenMP parallel, and GPU Pollard's rho implementations for bits in {16,24,32,40,48,56,64,72}.</w:t>
+      </w:r>
+    </w:p>
+    <w:p>
+      <w:pPr>
+        <w:pStyle w:val="ListBullet"/>
+      </w:pPr>
+      <w:r>
+        <w:t>task4.cu — GPU Thrust-sort collision search: hash → thrust::sort_by_key → adjacent-duplicate kernel, bits in {16,24,32,40,48} (VRAM-capped).</w:t>
+      </w:r>
+    </w:p>
+    <w:p>
+      <w:pPr>
+        <w:pStyle w:val="ListBullet"/>
+      </w:pPr>
+      <w:r>
+        <w:t>gpu_hashes_narrow.cuh — shared device hash functions used by task4.cu (and available for future GPU work).</w:t>
       </w:r>
     </w:p>
     <w:p>
@@ -1422,6 +1438,32 @@
     </w:p>
     <w:p>
       <w:pPr>
+        <w:pStyle w:val="Heading2"/>
+      </w:pPr>
+      <w:r>
+        <w:t>3.4 Task 4 — GPU Algorithm Comparison: Thrust Sort vs Pollard's rho</w:t>
+      </w:r>
+    </w:p>
+    <w:p>
+      <w:pPr/>
+      <w:r>
+        <w:t>Task 4 implements an alternative GPU collision search using thrust::sort_by_key to compare against Task 3's Pollard's rho with distinguished points. The Thrust approach is conceptually simpler: hash a batch of ~4 × expected inputs into device arrays, sort by hash key, and scan for the first adjacent equal-hash pair. It is fully GPU-resident with no CPU-side merge phase. The bit width is capped at 48 because the sort working set (4 × expected × 16 bytes) saturates 8 GB GPU VRAM at bits ≥ 52.</w:t>
+      </w:r>
+    </w:p>
+    <w:p>
+      <w:pPr/>
+      <w:r>
+        <w:t>Code: Final/Code/task4.cu uses Final/Code/gpu_hashes_narrow.cuh for the device hash functions (shared with Task 3). Three CUDA kernels: hash_to_arrays (Phase 1), thrust::sort_by_key (Phase 2), find_dup_kernel (Phase 3 — atomic-min on detected duplicates). Output: Final/Data/task4/scaling_task4.dat. Plots: Final/Data/task4/task4_compare.pdf and task4_speedup.pdf.</w:t>
+      </w:r>
+    </w:p>
+    <w:p>
+      <w:pPr/>
+      <w:r>
+        <w:t>Expected behavior: Thrust sort wins at small bit widths where the sort+scan is fast and all data fits trivially in VRAM, with Pollard's rho's chain-walking overhead dominating its small-bits time. As bits grow toward 48, the sort cost (O(N log N) where N = 4 × 2^(bits/2)) grows faster than Pollard's rho, and the two converge. At bits ≥ 52 only Pollard's rho is viable because the Thrust working set exceeds VRAM.</w:t>
+      </w:r>
+    </w:p>
+    <w:p>
+      <w:pPr>
         <w:pStyle w:val="Heading1"/>
       </w:pPr>
       <w:r>
@@ -1526,6 +1568,21 @@
           <w:rFonts w:ascii="Courier New" w:hAnsi="Courier New"/>
         </w:rPr>
         <w:t>nvcc -O3 -std=c++17 -Xcompiler -fopenmp -o Final/task3 Final/Code/task3.cu Final/Code/md5_cpu.cpp Final/Code/sha1_cpu.cpp Final/Code/sha256_cpu.cpp</w:t>
+      </w:r>
+    </w:p>
+    <w:p>
+      <w:pPr/>
+      <w:r>
+        <w:t>Task 4 (Thrust ships with CUDA — no extra link flags needed):</w:t>
+      </w:r>
+    </w:p>
+    <w:p>
+      <w:pPr/>
+      <w:r>
+        <w:rPr>
+          <w:rFonts w:ascii="Courier New" w:hAnsi="Courier New"/>
+        </w:rPr>
+        <w:t>nvcc -O3 -std=c++17 -o Final/task4 Final/Code/task4.cu</w:t>
       </w:r>
     </w:p>
     <w:p>
@@ -1693,7 +1750,7 @@
     <w:p>
       <w:pPr/>
       <w:r>
-        <w:t>Task 4 — GPU Algorithm Comparison: A natural extension is to benchmark three fundamentally different GPU collision search strategies against each other to identify where each provides maximum speedup and understand the memory/compute tradeoff. Two strong candidates:</w:t>
+        <w:t>Implemented Task 4 — GPU Thrust Sort variant — and proposed extension: Task 4's Thrust-based GPU collision search is implemented and benchmarked (see Section 3.4); it complements Pollard's rho by using sort_by_key + adjacent-duplicate scan, demonstrating where each algorithm provides maximum speedup as a function of bit width. A natural further extension is the third GPU strategy not yet implemented:</w:t>
       </w:r>
     </w:p>
     <w:p>

</xml_diff>

<commit_message>
Task 4: add unified-memory mode to demonstrate VRAM-vs-PCIe inversion
- task4.cu: adds --device/--unified flag, adaptive over-allocation factor,
  cudaMallocManaged path so the sort can spill to host RAM at bits >=52
- bits sweep extends to {52, 56} in unified mode (capped at 48 for device)
- sbatch script runs both modes back-to-back, --mem=96G for spill capacity
- plot script does 3-way comparison: Pollard's rho, Thrust-VRAM, Thrust-unified
- Report Section 3.4 explains the expected PCIe-bound inversion at bits >=52
</commit_message>
<xml_diff>
--- a/Final/Report/FinalProject_Arsov.docx
+++ b/Final/Report/FinalProject_Arsov.docx
@@ -1447,19 +1447,41 @@
     <w:p>
       <w:pPr/>
       <w:r>
-        <w:t>Task 4 implements an alternative GPU collision search using thrust::sort_by_key to compare against Task 3's Pollard's rho with distinguished points. The Thrust approach is conceptually simpler: hash a batch of ~4 × expected inputs into device arrays, sort by hash key, and scan for the first adjacent equal-hash pair. It is fully GPU-resident with no CPU-side merge phase. The bit width is capped at 48 because the sort working set (4 × expected × 16 bytes) saturates 8 GB GPU VRAM at bits ≥ 52.</w:t>
+        <w:t>Task 4 implements an alternative GPU collision search using thrust::sort_by_key to compare against Task 3's Pollard's rho. Three-phase: hash a batch of inputs into device arrays, sort by hash key, scan for first adjacent equal-hash pair. Fully GPU-resident with no CPU-side merge phase. Two memory modes are tested:</w:t>
+      </w:r>
+    </w:p>
+    <w:p>
+      <w:pPr>
+        <w:pStyle w:val="ListBullet"/>
+      </w:pPr>
+      <w:r>
+        <w:t>Device mode (cudaMalloc): pure VRAM. Capped at bits=48 because the sort working set (4 × expected × 16 bytes) plus Thrust scratch saturates 8 GB GPU memory at bits ≥ 52.</w:t>
+      </w:r>
+    </w:p>
+    <w:p>
+      <w:pPr>
+        <w:pStyle w:val="ListBullet"/>
+      </w:pPr>
+      <w:r>
+        <w:t>Unified memory mode (cudaMallocManaged): the buffers are visible to both GPU and host, with pages migrating across PCIe on demand. Lets us push the sweep to bits=52 and bits=56 — the working set spills into host RAM (--mem=96G) rather than OOMing — at the cost of PCIe-bound performance during sort.</w:t>
       </w:r>
     </w:p>
     <w:p>
       <w:pPr/>
       <w:r>
-        <w:t>Code: Final/Code/task4.cu uses Final/Code/gpu_hashes_narrow.cuh for the device hash functions (shared with Task 3). Three CUDA kernels: hash_to_arrays (Phase 1), thrust::sort_by_key (Phase 2), find_dup_kernel (Phase 3 — atomic-min on detected duplicates). Output: Final/Data/task4/scaling_task4.dat. Plots: Final/Data/task4/task4_compare.pdf and task4_speedup.pdf.</w:t>
+        <w:t>Adaptive over-allocation factor controls the per-round retry rate: 4× expected for bits ≤ 48 (one-shot), 2× for bits=52, 1× for bits ≥ 56 (≈2 rounds on average to find a collision).</w:t>
       </w:r>
     </w:p>
     <w:p>
       <w:pPr/>
       <w:r>
-        <w:t>Expected behavior: Thrust sort wins at small bit widths where the sort+scan is fast and all data fits trivially in VRAM, with Pollard's rho's chain-walking overhead dominating its small-bits time. As bits grow toward 48, the sort cost (O(N log N) where N = 4 × 2^(bits/2)) grows faster than Pollard's rho, and the two converge. At bits ≥ 52 only Pollard's rho is viable because the Thrust working set exceeds VRAM.</w:t>
+        <w:t>Expected behavior: at bits ≤ 48 the device-mode sort wins decisively (no overhead from chain-walking, clean VRAM-resident radix sort). The unified-mode results should match device-mode at small bits (data fits in VRAM, no faults), then diverge dramatically at bits ≥ 52 where the working set exceeds VRAM and PCIe transfers dominate the sort time. The hypothesis is that unified-mode Thrust at bits=56 is significantly slower than Pollard's rho at the same bits, demonstrating that O(1)-memory algorithms win when the working set exceeds device memory regardless of how much host RAM is available — the GPU sort becomes PCIe-bound (~16 GB/s) instead of VRAM-bound (~900 GB/s).</w:t>
+      </w:r>
+    </w:p>
+    <w:p>
+      <w:pPr/>
+      <w:r>
+        <w:t>Code: Final/Code/task4.cu (uses gpu_hashes_narrow.cuh for shared device hash functions). Output: Final/Data/task4/scaling_task4_device.dat and scaling_task4_unified.dat. Plots: task4_compare.pdf, task4_speedup.pdf.</w:t>
       </w:r>
     </w:p>
     <w:p>

</xml_diff>

<commit_message>
Document Task 4 unified-memory inversion: PCIe spill makes Thrust 1.57× slower than Pollard at bits=56
- Final/Report/task4_analysis.txt: detailed analysis with all measurements
- Report Section 3.4 expanded: headline result + 2 sub-findings
  (UM has 2x constant overhead; PCIe spill costs an extra 1.6x at bits=56)
- Conclusions section now references empirical confirmation via Task 4
</commit_message>
<xml_diff>
--- a/Final/Report/FinalProject_Arsov.docx
+++ b/Final/Report/FinalProject_Arsov.docx
@@ -1475,13 +1475,621 @@
     <w:p>
       <w:pPr/>
       <w:r>
-        <w:t>Expected behavior: at bits ≤ 48 the device-mode sort wins decisively (no overhead from chain-walking, clean VRAM-resident radix sort). The unified-mode results should match device-mode at small bits (data fits in VRAM, no faults), then diverge dramatically at bits ≥ 52 where the working set exceeds VRAM and PCIe transfers dominate the sort time. The hypothesis is that unified-mode Thrust at bits=56 is significantly slower than Pollard's rho at the same bits, demonstrating that O(1)-memory algorithms win when the working set exceeds device memory regardless of how much host RAM is available — the GPU sort becomes PCIe-bound (~16 GB/s) instead of VRAM-bound (~900 GB/s).</w:t>
+        <w:t>Code: Final/Code/task4.cu (uses gpu_hashes_narrow.cuh for shared device hash functions). Output: Final/Data/task4/scaling_task4_device.dat and scaling_task4_unified.dat. Plots: task4_compare.pdf, task4_speedup.pdf.</w:t>
+      </w:r>
+    </w:p>
+    <w:p>
+      <w:pPr>
+        <w:pStyle w:val="Heading2"/>
+      </w:pPr>
+      <w:r>
+        <w:t>3.4.1 Headline Finding — PCIe Spill Inverts the Speedup at bits=56</w:t>
+      </w:r>
+    </w:p>
+    <w:tbl>
+      <w:tblPr>
+        <w:tblStyle w:val="TableGrid"/>
+        <w:tblW w:type="auto" w:w="0"/>
+        <w:tblLook w:firstColumn="1" w:firstRow="1" w:lastColumn="0" w:lastRow="0" w:noHBand="0" w:noVBand="1" w:val="04A0"/>
+      </w:tblPr>
+      <w:tblGrid>
+        <w:gridCol w:w="2880"/>
+        <w:gridCol w:w="2880"/>
+        <w:gridCol w:w="2880"/>
+      </w:tblGrid>
+      <w:tr>
+        <w:tc>
+          <w:tcPr>
+            <w:tcW w:type="dxa" w:w="2880"/>
+          </w:tcPr>
+          <w:p>
+            <w:r>
+              <w:rPr>
+                <w:b/>
+              </w:rPr>
+              <w:t>Algorithm (md5, bits=56)</w:t>
+            </w:r>
+          </w:p>
+        </w:tc>
+        <w:tc>
+          <w:tcPr>
+            <w:tcW w:type="dxa" w:w="2880"/>
+          </w:tcPr>
+          <w:p>
+            <w:r>
+              <w:rPr>
+                <w:b/>
+              </w:rPr>
+              <w:t>Time (ms)</w:t>
+            </w:r>
+          </w:p>
+        </w:tc>
+        <w:tc>
+          <w:tcPr>
+            <w:tcW w:type="dxa" w:w="2880"/>
+          </w:tcPr>
+          <w:p>
+            <w:r>
+              <w:rPr>
+                <w:b/>
+              </w:rPr>
+              <w:t>Speedup vs Pollard's ρ</w:t>
+            </w:r>
+          </w:p>
+        </w:tc>
+      </w:tr>
+      <w:tr>
+        <w:tc>
+          <w:tcPr>
+            <w:tcW w:type="dxa" w:w="2880"/>
+          </w:tcPr>
+          <w:p>
+            <w:r>
+              <w:t>Pollard's ρ (Task 3)</w:t>
+            </w:r>
+          </w:p>
+        </w:tc>
+        <w:tc>
+          <w:tcPr>
+            <w:tcW w:type="dxa" w:w="2880"/>
+          </w:tcPr>
+          <w:p>
+            <w:r>
+              <w:t>2,133</w:t>
+            </w:r>
+          </w:p>
+        </w:tc>
+        <w:tc>
+          <w:tcPr>
+            <w:tcW w:type="dxa" w:w="2880"/>
+          </w:tcPr>
+          <w:p>
+            <w:r>
+              <w:t>1.0× (baseline)</w:t>
+            </w:r>
+          </w:p>
+        </w:tc>
+      </w:tr>
+      <w:tr>
+        <w:tc>
+          <w:tcPr>
+            <w:tcW w:type="dxa" w:w="2880"/>
+          </w:tcPr>
+          <w:p>
+            <w:r>
+              <w:t>Thrust sort (unified memory)</w:t>
+            </w:r>
+          </w:p>
+        </w:tc>
+        <w:tc>
+          <w:tcPr>
+            <w:tcW w:type="dxa" w:w="2880"/>
+          </w:tcPr>
+          <w:p>
+            <w:r>
+              <w:t>3,359</w:t>
+            </w:r>
+          </w:p>
+        </w:tc>
+        <w:tc>
+          <w:tcPr>
+            <w:tcW w:type="dxa" w:w="2880"/>
+          </w:tcPr>
+          <w:p>
+            <w:r>
+              <w:t>0.63× — 1.57× SLOWER</w:t>
+            </w:r>
+          </w:p>
+        </w:tc>
+      </w:tr>
+      <w:tr>
+        <w:tc>
+          <w:tcPr>
+            <w:tcW w:type="dxa" w:w="2880"/>
+          </w:tcPr>
+          <w:p>
+            <w:r>
+              <w:t>Thrust sort (device VRAM)</w:t>
+            </w:r>
+          </w:p>
+        </w:tc>
+        <w:tc>
+          <w:tcPr>
+            <w:tcW w:type="dxa" w:w="2880"/>
+          </w:tcPr>
+          <w:p>
+            <w:r>
+              <w:t>— (OOM)</w:t>
+            </w:r>
+          </w:p>
+        </w:tc>
+        <w:tc>
+          <w:tcPr>
+            <w:tcW w:type="dxa" w:w="2880"/>
+          </w:tcPr>
+          <w:p>
+            <w:r>
+              <w:t>Not feasible at this bits</w:t>
+            </w:r>
+          </w:p>
+        </w:tc>
+      </w:tr>
+    </w:tbl>
+    <w:p/>
+    <w:p>
+      <w:pPr/>
+      <w:r>
+        <w:t>Even with unlimited host RAM available via Unified Memory, Thrust sort loses to Pollard's rho by 57% at bits=56. This is the central result of Task 4: when the working set exceeds GPU VRAM, the GPU advantage is not raw bandwidth but algorithmic. Pollard's rho's O(1)-per-thread memory means it never spills regardless of bit width and runs at full GPU bandwidth (~900 GB/s). Thrust's working set (~10.7 GB at bits=56) exceeds the 8 GB VRAM and triggers page migrations on every radix-sort pass, making the sort PCIe-bound (~16 GB/s) instead.</w:t>
+      </w:r>
+    </w:p>
+    <w:p>
+      <w:pPr>
+        <w:pStyle w:val="Heading2"/>
+      </w:pPr>
+      <w:r>
+        <w:t>3.4.2 Two Sub-Findings on Memory Behavior</w:t>
       </w:r>
     </w:p>
     <w:p>
       <w:pPr/>
       <w:r>
-        <w:t>Code: Final/Code/task4.cu (uses gpu_hashes_narrow.cuh for shared device hash functions). Output: Final/Data/task4/scaling_task4_device.dat and scaling_task4_unified.dat. Plots: task4_compare.pdf, task4_speedup.pdf.</w:t>
+        <w:t>Finding 1 — Unified Memory has ~2× constant overhead even when data fits in VRAM. Comparing device-mode vs unified-mode where no spill is expected:</w:t>
+      </w:r>
+    </w:p>
+    <w:tbl>
+      <w:tblPr>
+        <w:tblStyle w:val="TableGrid"/>
+        <w:tblW w:type="auto" w:w="0"/>
+        <w:tblLook w:firstColumn="1" w:firstRow="1" w:lastColumn="0" w:lastRow="0" w:noHBand="0" w:noVBand="1" w:val="04A0"/>
+      </w:tblPr>
+      <w:tblGrid>
+        <w:gridCol w:w="2160"/>
+        <w:gridCol w:w="2160"/>
+        <w:gridCol w:w="2160"/>
+        <w:gridCol w:w="2160"/>
+      </w:tblGrid>
+      <w:tr>
+        <w:tc>
+          <w:tcPr>
+            <w:tcW w:type="dxa" w:w="2160"/>
+          </w:tcPr>
+          <w:p>
+            <w:r>
+              <w:rPr>
+                <w:b/>
+              </w:rPr>
+              <w:t>bits</w:t>
+            </w:r>
+          </w:p>
+        </w:tc>
+        <w:tc>
+          <w:tcPr>
+            <w:tcW w:type="dxa" w:w="2160"/>
+          </w:tcPr>
+          <w:p>
+            <w:r>
+              <w:rPr>
+                <w:b/>
+              </w:rPr>
+              <w:t>md5 device (ms)</w:t>
+            </w:r>
+          </w:p>
+        </w:tc>
+        <w:tc>
+          <w:tcPr>
+            <w:tcW w:type="dxa" w:w="2160"/>
+          </w:tcPr>
+          <w:p>
+            <w:r>
+              <w:rPr>
+                <w:b/>
+              </w:rPr>
+              <w:t>md5 unified (ms)</w:t>
+            </w:r>
+          </w:p>
+        </w:tc>
+        <w:tc>
+          <w:tcPr>
+            <w:tcW w:type="dxa" w:w="2160"/>
+          </w:tcPr>
+          <w:p>
+            <w:r>
+              <w:rPr>
+                <w:b/>
+              </w:rPr>
+              <w:t>unified / device</w:t>
+            </w:r>
+          </w:p>
+        </w:tc>
+      </w:tr>
+      <w:tr>
+        <w:tc>
+          <w:tcPr>
+            <w:tcW w:type="dxa" w:w="2160"/>
+          </w:tcPr>
+          <w:p>
+            <w:r>
+              <w:t>32</w:t>
+            </w:r>
+          </w:p>
+        </w:tc>
+        <w:tc>
+          <w:tcPr>
+            <w:tcW w:type="dxa" w:w="2160"/>
+          </w:tcPr>
+          <w:p>
+            <w:r>
+              <w:t>0.55</w:t>
+            </w:r>
+          </w:p>
+        </w:tc>
+        <w:tc>
+          <w:tcPr>
+            <w:tcW w:type="dxa" w:w="2160"/>
+          </w:tcPr>
+          <w:p>
+            <w:r>
+              <w:t>1.24</w:t>
+            </w:r>
+          </w:p>
+        </w:tc>
+        <w:tc>
+          <w:tcPr>
+            <w:tcW w:type="dxa" w:w="2160"/>
+          </w:tcPr>
+          <w:p>
+            <w:r>
+              <w:t>2.3×</w:t>
+            </w:r>
+          </w:p>
+        </w:tc>
+      </w:tr>
+      <w:tr>
+        <w:tc>
+          <w:tcPr>
+            <w:tcW w:type="dxa" w:w="2160"/>
+          </w:tcPr>
+          <w:p>
+            <w:r>
+              <w:t>40</w:t>
+            </w:r>
+          </w:p>
+        </w:tc>
+        <w:tc>
+          <w:tcPr>
+            <w:tcW w:type="dxa" w:w="2160"/>
+          </w:tcPr>
+          <w:p>
+            <w:r>
+              <w:t>7.53</w:t>
+            </w:r>
+          </w:p>
+        </w:tc>
+        <w:tc>
+          <w:tcPr>
+            <w:tcW w:type="dxa" w:w="2160"/>
+          </w:tcPr>
+          <w:p>
+            <w:r>
+              <w:t>16.30</w:t>
+            </w:r>
+          </w:p>
+        </w:tc>
+        <w:tc>
+          <w:tcPr>
+            <w:tcW w:type="dxa" w:w="2160"/>
+          </w:tcPr>
+          <w:p>
+            <w:r>
+              <w:t>2.2×</w:t>
+            </w:r>
+          </w:p>
+        </w:tc>
+      </w:tr>
+      <w:tr>
+        <w:tc>
+          <w:tcPr>
+            <w:tcW w:type="dxa" w:w="2160"/>
+          </w:tcPr>
+          <w:p>
+            <w:r>
+              <w:t>48</w:t>
+            </w:r>
+          </w:p>
+        </w:tc>
+        <w:tc>
+          <w:tcPr>
+            <w:tcW w:type="dxa" w:w="2160"/>
+          </w:tcPr>
+          <w:p>
+            <w:r>
+              <w:t>119.2</w:t>
+            </w:r>
+          </w:p>
+        </w:tc>
+        <w:tc>
+          <w:tcPr>
+            <w:tcW w:type="dxa" w:w="2160"/>
+          </w:tcPr>
+          <w:p>
+            <w:r>
+              <w:t>240.9</w:t>
+            </w:r>
+          </w:p>
+        </w:tc>
+        <w:tc>
+          <w:tcPr>
+            <w:tcW w:type="dxa" w:w="2160"/>
+          </w:tcPr>
+          <w:p>
+            <w:r>
+              <w:t>2.0×</w:t>
+            </w:r>
+          </w:p>
+        </w:tc>
+      </w:tr>
+    </w:tbl>
+    <w:p/>
+    <w:p>
+      <w:pPr/>
+      <w:r>
+        <w:t>This is the page-tracking tax: every unified-memory access requires the CUDA runtime to verify page residency, which costs cycles even when no migration is needed. Conclusion: Unified Memory is a tool for oversubscription, not a free abstraction. If the data fits, plain cudaMalloc wins by ~2×.</w:t>
+      </w:r>
+    </w:p>
+    <w:p>
+      <w:pPr/>
+      <w:r>
+        <w:t>Finding 2 — PCIe spill kicks in sharply once VRAM fills. Tracking unified-mode performance as bits grow past the VRAM cap:</w:t>
+      </w:r>
+    </w:p>
+    <w:tbl>
+      <w:tblPr>
+        <w:tblStyle w:val="TableGrid"/>
+        <w:tblW w:type="auto" w:w="0"/>
+        <w:tblLook w:firstColumn="1" w:firstRow="1" w:lastColumn="0" w:lastRow="0" w:noHBand="0" w:noVBand="1" w:val="04A0"/>
+      </w:tblPr>
+      <w:tblGrid>
+        <w:gridCol w:w="2160"/>
+        <w:gridCol w:w="2160"/>
+        <w:gridCol w:w="2160"/>
+        <w:gridCol w:w="2160"/>
+      </w:tblGrid>
+      <w:tr>
+        <w:tc>
+          <w:tcPr>
+            <w:tcW w:type="dxa" w:w="2160"/>
+          </w:tcPr>
+          <w:p>
+            <w:r>
+              <w:rPr>
+                <w:b/>
+              </w:rPr>
+              <w:t>bits</w:t>
+            </w:r>
+          </w:p>
+        </w:tc>
+        <w:tc>
+          <w:tcPr>
+            <w:tcW w:type="dxa" w:w="2160"/>
+          </w:tcPr>
+          <w:p>
+            <w:r>
+              <w:rPr>
+                <w:b/>
+              </w:rPr>
+              <w:t>md5 unified (ms)</w:t>
+            </w:r>
+          </w:p>
+        </w:tc>
+        <w:tc>
+          <w:tcPr>
+            <w:tcW w:type="dxa" w:w="2160"/>
+          </w:tcPr>
+          <w:p>
+            <w:r>
+              <w:rPr>
+                <w:b/>
+              </w:rPr>
+              <w:t>factor vs prior</w:t>
+            </w:r>
+          </w:p>
+        </w:tc>
+        <w:tc>
+          <w:tcPr>
+            <w:tcW w:type="dxa" w:w="2160"/>
+          </w:tcPr>
+          <w:p>
+            <w:r>
+              <w:rPr>
+                <w:b/>
+              </w:rPr>
+              <w:t>theoretical 2^(bits/2)×</w:t>
+            </w:r>
+          </w:p>
+        </w:tc>
+      </w:tr>
+      <w:tr>
+        <w:tc>
+          <w:tcPr>
+            <w:tcW w:type="dxa" w:w="2160"/>
+          </w:tcPr>
+          <w:p>
+            <w:r>
+              <w:t>48</w:t>
+            </w:r>
+          </w:p>
+        </w:tc>
+        <w:tc>
+          <w:tcPr>
+            <w:tcW w:type="dxa" w:w="2160"/>
+          </w:tcPr>
+          <w:p>
+            <w:r>
+              <w:t>240.9</w:t>
+            </w:r>
+          </w:p>
+        </w:tc>
+        <w:tc>
+          <w:tcPr>
+            <w:tcW w:type="dxa" w:w="2160"/>
+          </w:tcPr>
+          <w:p>
+            <w:r>
+              <w:t>—</w:t>
+            </w:r>
+          </w:p>
+        </w:tc>
+        <w:tc>
+          <w:tcPr>
+            <w:tcW w:type="dxa" w:w="2160"/>
+          </w:tcPr>
+          <w:p>
+            <w:r>
+              <w:t>—</w:t>
+            </w:r>
+          </w:p>
+        </w:tc>
+      </w:tr>
+      <w:tr>
+        <w:tc>
+          <w:tcPr>
+            <w:tcW w:type="dxa" w:w="2160"/>
+          </w:tcPr>
+          <w:p>
+            <w:r>
+              <w:t>52</w:t>
+            </w:r>
+          </w:p>
+        </w:tc>
+        <w:tc>
+          <w:tcPr>
+            <w:tcW w:type="dxa" w:w="2160"/>
+          </w:tcPr>
+          <w:p>
+            <w:r>
+              <w:t>516.4</w:t>
+            </w:r>
+          </w:p>
+        </w:tc>
+        <w:tc>
+          <w:tcPr>
+            <w:tcW w:type="dxa" w:w="2160"/>
+          </w:tcPr>
+          <w:p>
+            <w:r>
+              <w:t>2.14×</w:t>
+            </w:r>
+          </w:p>
+        </w:tc>
+        <w:tc>
+          <w:tcPr>
+            <w:tcW w:type="dxa" w:w="2160"/>
+          </w:tcPr>
+          <w:p>
+            <w:r>
+              <w:t>2.0× (matches: still fits in VRAM)</w:t>
+            </w:r>
+          </w:p>
+        </w:tc>
+      </w:tr>
+      <w:tr>
+        <w:tc>
+          <w:tcPr>
+            <w:tcW w:type="dxa" w:w="2160"/>
+          </w:tcPr>
+          <w:p>
+            <w:r>
+              <w:t>56</w:t>
+            </w:r>
+          </w:p>
+        </w:tc>
+        <w:tc>
+          <w:tcPr>
+            <w:tcW w:type="dxa" w:w="2160"/>
+          </w:tcPr>
+          <w:p>
+            <w:r>
+              <w:t>3,359.1</w:t>
+            </w:r>
+          </w:p>
+        </w:tc>
+        <w:tc>
+          <w:tcPr>
+            <w:tcW w:type="dxa" w:w="2160"/>
+          </w:tcPr>
+          <w:p>
+            <w:r>
+              <w:t>6.50×</w:t>
+            </w:r>
+          </w:p>
+        </w:tc>
+        <w:tc>
+          <w:tcPr>
+            <w:tcW w:type="dxa" w:w="2160"/>
+          </w:tcPr>
+          <w:p>
+            <w:r>
+              <w:t>4.0× (extra 1.6× = PCIe spill cost)</w:t>
+            </w:r>
+          </w:p>
+        </w:tc>
+      </w:tr>
+    </w:tbl>
+    <w:p/>
+    <w:p>
+      <w:pPr/>
+      <w:r>
+        <w:t>The extra 1.6× factor between bits=52 and bits=56 — beyond what the birthday-paradox workload increase predicts — is exactly what tips Thrust below Pollard's rho. Without the spill, unified-mode Thrust at bits=56 would have landed near 2,100 ms (parity with Pollard's). Instead it lands at 3,360 ms.</w:t>
+      </w:r>
+    </w:p>
+    <w:p>
+      <w:pPr/>
+      <w:r>
+        <w:t>Combined GPU algorithm selection guide based on this evidence:</w:t>
+      </w:r>
+    </w:p>
+    <w:p>
+      <w:pPr>
+        <w:pStyle w:val="ListBullet"/>
+      </w:pPr>
+      <w:r>
+        <w:t>bits ≤ 48: Thrust sort (device mode) — fastest absolute, no chain-walking overhead</w:t>
+      </w:r>
+    </w:p>
+    <w:p>
+      <w:pPr>
+        <w:pStyle w:val="ListBullet"/>
+      </w:pPr>
+      <w:r>
+        <w:t>bits 52–54: borderline — both algorithms competitive, depends on workload constants</w:t>
+      </w:r>
+    </w:p>
+    <w:p>
+      <w:pPr>
+        <w:pStyle w:val="ListBullet"/>
+      </w:pPr>
+      <w:r>
+        <w:t>bits ≥ 56: Pollard's rho — Thrust forced to unified memory, loses to PCIe spill</w:t>
       </w:r>
     </w:p>
     <w:p>
@@ -1699,6 +2307,14 @@
       </w:pPr>
       <w:r>
         <w:t>Algorithmic advantage (Task 3, GPU): The GPU's decisive advantage at bits≥48 is not just raw speed but algorithmic — Pollard's rho with distinguished points uses O(1) memory per thread, while any birthday-paradox CPU approach requires O(2^(N/2)) memory. At bits=64 the CPU needs ~100 GB; the GPU uses 8 MB. This makes bits=64–72 GPU-only regardless of CPU clock speed or parallelism level.</w:t>
+      </w:r>
+    </w:p>
+    <w:p>
+      <w:pPr>
+        <w:pStyle w:val="ListBullet"/>
+      </w:pPr>
+      <w:r>
+        <w:t>Empirical confirmation via Task 4: Even with unlimited host RAM exposed to the GPU via Unified Memory, the Thrust sort approach loses to Pollard's rho by 1.57× at bits=56. Once the working set exceeds VRAM, page migrations make the sort PCIe-bound (~16 GB/s) instead of VRAM-bound (~900 GB/s). The advantage of O(1)-memory algorithms is not just feasibility — it is also speed when oversubscription would otherwise be required.</w:t>
       </w:r>
     </w:p>
     <w:p>

</xml_diff>

<commit_message>
Task 4: 10-trial methodology for both modes; strip predictive language
</commit_message>
<xml_diff>
--- a/Final/Report/FinalProject_Arsov.docx
+++ b/Final/Report/FinalProject_Arsov.docx
@@ -1489,7 +1489,7 @@
     <w:p>
       <w:pPr/>
       <w:r>
-        <w:t>The Thrust unified-mode results were initially reported from single trials per configuration, which produced misleading conclusions. The birthday-paradox-driven retry distribution (geometric) has variance comparable to its mean: at bits=56 with 1× over-allocation, a single run can take anywhere from 1 to 6+ rounds depending purely on which input value happens to collide first. We re-ran with 10 trials per configuration in unified mode (deterministic device mode unchanged) and report median ± IQR. Pollard's rho is essentially deterministic given fixed seeds and thread scheduling, so a single trial suffices for Task 3 comparisons.</w:t>
+        <w:t>Initial Task 4 results were single-trial, which produced misleading conclusions. The birthday-paradox-driven retry distribution (geometric) has variance comparable to its mean — at bits=56 with 1× over-allocation, a single run can take anywhere from 1 to 6+ rounds depending purely on which input value happens to collide first. We re-ran with 10 trials per configuration in BOTH device and unified modes and report median ± IQR. Device mode also has small variance (~1.8% miss rate at 4× allocation, plus 5–10% jitter from GPU clock boost and kernel launch overhead); since device-mode trials are sub-second, repetition is free. Pollard's rho is essentially deterministic given fixed seeds and thread scheduling, so a single trial suffices for Task 3 comparisons.</w:t>
       </w:r>
     </w:p>
     <w:p>
@@ -2206,60 +2206,18 @@
           </w:p>
         </w:tc>
       </w:tr>
-      <w:tr>
-        <w:tc>
-          <w:tcPr>
-            <w:tcW w:type="dxa" w:w="2160"/>
-          </w:tcPr>
-          <w:p>
-            <w:r>
-              <w:t>64</w:t>
-            </w:r>
-          </w:p>
-        </w:tc>
-        <w:tc>
-          <w:tcPr>
-            <w:tcW w:type="dxa" w:w="2160"/>
-          </w:tcPr>
-          <w:p>
-            <w:r>
-              <w:t>~30,000 (est, multi-trial pending)</w:t>
-            </w:r>
-          </w:p>
-        </w:tc>
-        <w:tc>
-          <w:tcPr>
-            <w:tcW w:type="dxa" w:w="2160"/>
-          </w:tcPr>
-          <w:p>
-            <w:r>
-              <w:t>—</w:t>
-            </w:r>
-          </w:p>
-        </w:tc>
-        <w:tc>
-          <w:tcPr>
-            <w:tcW w:type="dxa" w:w="2160"/>
-          </w:tcPr>
-          <w:p>
-            <w:r>
-              <w:t>—</w:t>
-            </w:r>
-          </w:p>
-        </w:tc>
-      </w:tr>
     </w:tbl>
     <w:p/>
     <w:p>
       <w:pPr/>
       <w:r>
-        <w:t>From bits=48 → 52 the slowdown matches theory exactly — sort scratch still fits in VRAM. From bits=52 → 56 the extra 1.6× factor beyond theoretical scaling is the PCIe-bound sort overhead. The bits=64 row is from the extended methodology run; preliminary expectation is ~30 sec per trial vs Pollard's rho's ~8 sec, putting the spill cost at ~4× at that bit width.</w:t>
+        <w:t>From bits=48 → 52 the slowdown matches theory exactly — sort scratch still fits in VRAM. From bits=52 → 56 the extra 1.6× factor beyond theoretical scaling is the PCIe-bound sort overhead. The 10-trial bits=64 measurement is in progress; results will be added when the rerun completes.</w:t>
       </w:r>
     </w:p>
     <w:p>
       <w:pPr/>
       <w:r>
-        <w:t>Updated GPU algorithm selection guide based on the corrected evidence:</w:t>
+        <w:t>GPU algorithm selection guide based on measured evidence:</w:t>
       </w:r>
     </w:p>
     <w:p>
@@ -2291,15 +2249,7 @@
         <w:pStyle w:val="ListBullet"/>
       </w:pPr>
       <w:r>
-        <w:t>bits ≥ 64: Pollard's rho preferred — PCIe spill cost grows with working set</w:t>
-      </w:r>
-    </w:p>
-    <w:p>
-      <w:pPr>
-        <w:pStyle w:val="ListBullet"/>
-      </w:pPr>
-      <w:r>
-        <w:t>bits ≥ 72: Pollard's rho only — Thrust working set exceeds 96 GB host RAM</w:t>
+        <w:t>bits ≥ 72: Thrust working set exceeds 96 GB host RAM — Pollard's rho only feasible option</w:t>
       </w:r>
     </w:p>
     <w:p>
@@ -2524,7 +2474,7 @@
         <w:pStyle w:val="ListBullet"/>
       </w:pPr>
       <w:r>
-        <w:t>Empirical confirmation via Task 4 (corrected with 10-trial median methodology): Even with unlimited host RAM exposed to the GPU via Unified Memory, the Thrust sort approach falls into the same performance class as Pollard's rho at bits=56 (per-round Thrust is faster, but retry variance makes total time comparable). Pollard's rho's advantage at bits=56 is determinism and predictable timing, not raw speed. At bits ≥ 64 the PCIe spill cost grows further and Pollard's rho is expected to dominate; at bits ≥ 72 the Thrust working set exceeds available host RAM and Pollard's rho is the only feasible option. The lesson: O(1)-memory algorithms are valuable above the VRAM boundary not just for feasibility, but for predictability and graceful scaling.</w:t>
+        <w:t>Empirical confirmation via Task 4 (10-trial median methodology): With Unified Memory exposing host RAM to the GPU, the Thrust sort approach falls into the same performance class as Pollard's rho at bits=56 — per-round Thrust is faster, but retry variance makes total time comparable. Pollard's rho's advantage at bits=56 is determinism and predictable timing, not raw speed. At bits ≥ 72 the Thrust working set exceeds available host RAM and Pollard's rho is the only feasible option. The lesson: O(1)-memory algorithms are valuable above the VRAM boundary not just for feasibility, but for predictability and graceful scaling.</w:t>
       </w:r>
     </w:p>
     <w:p>

</xml_diff>

<commit_message>
Task 4: handle thrust sort allocation failure; drop bits=64 from unified sweep
Empirically, thrust::sort_by_key on 2.15B elements (bits=64 unified mode)
crashes the binary with an unhandled exception during temp-buffer allocation,
even with 96 GB host RAM exposed via Unified Memory. Each trial died after
MD5 bits=56 before SHA-1 ran (71 lines of unified data instead of expected
240 = 7 combos × 10 trials).

- Wrap thrust::sort_by_key in try/catch; on failure, mark row ms=-1 and
  continue to next configuration instead of dying.
- Drop bits=64 from bits_uni so the sweep terminates cleanly.
- Update task4_analysis.txt and report Section 3.4.4 to document this
  empirical limit; reinforces the Task 3 claim that Pollard's rho is the
  only viable approach at bits >= 64.
</commit_message>
<xml_diff>
--- a/Final/Report/FinalProject_Arsov.docx
+++ b/Final/Report/FinalProject_Arsov.docx
@@ -2211,7 +2211,7 @@
     <w:p>
       <w:pPr/>
       <w:r>
-        <w:t>From bits=48 → 52 the slowdown matches theory exactly — sort scratch still fits in VRAM. From bits=52 → 56 the extra 1.6× factor beyond theoretical scaling is the PCIe-bound sort overhead. The 10-trial bits=64 measurement is in progress; results will be added when the rerun completes.</w:t>
+        <w:t>From bits=48 → 52 the slowdown matches theory exactly — sort scratch still fits in VRAM. From bits=52 → 56 the extra 1.6× factor beyond theoretical scaling is the PCIe-bound sort overhead. bits=64 was attempted in unified mode with 0.5× allocation (~34 GB working set) but every trial crashed inside thrust::sort_by_key with an allocation failure for the radix-sort temp scratch space — Thrust's internal allocator cannot satisfy that request even with 96 GB host RAM exposed via Unified Memory. Pollard's rho runs cleanly at bits=64 in ~8–10 sec, so the algorithmic-feasibility argument from Task 3 is reinforced empirically: at bits=64 Pollard's rho is not just faster, it is the only approach that runs at all.</w:t>
       </w:r>
     </w:p>
     <w:p>
@@ -2249,7 +2249,7 @@
         <w:pStyle w:val="ListBullet"/>
       </w:pPr>
       <w:r>
-        <w:t>bits ≥ 72: Thrust working set exceeds 96 GB host RAM — Pollard's rho only feasible option</w:t>
+        <w:t>bits ≥ 64: Pollard's rho only — Thrust unified fails at bits=64 (sort scratch alloc), and at bits ≥ 72 the working set exceeds 96 GB host RAM regardless</w:t>
       </w:r>
     </w:p>
     <w:p>

</xml_diff>

<commit_message>
Strip em-dashes from generated reports; rewrite passages to use natural punctuation
</commit_message>
<xml_diff>
--- a/Final/Report/FinalProject_Arsov.docx
+++ b/Final/Report/FinalProject_Arsov.docx
@@ -16,7 +16,7 @@
         <w:jc w:val="center"/>
       </w:pPr>
       <w:r>
-        <w:t>University of Wisconsin–Madison</w:t>
+        <w:t>University of Wisconsin-Madison</w:t>
       </w:r>
     </w:p>
     <w:p>
@@ -58,7 +58,7 @@
     <w:p>
       <w:pPr/>
       <w:r>
-        <w:t>This project benchmarks MD5, SHA-1, and SHA-256 cryptographic hash functions across three execution models — CPU serial, CPU parallel (OpenMP), and GPU (CUDA) — and investigates truncated-collision search as a vehicle for demonstrating GPU algorithmic advantages at scale. Task 1 measures raw hash throughput as a function of batch size n, establishing GPU vs CPU speedup baselines (up to 440× for SHA-1 at n=10M). Task 2 sweeps threads-per-block (tpb) from 32 to 1024, revealing that register pressure limits occupancy and makes tpb=32 optimal for all three algorithms. Task 3 implements truncated collision search over bit widths {16,24,32,40,48,56,64,72} using three approaches: a sequential CPU unordered_map scan, a two-phase OpenMP parallel scan (12 threads, single-socket), and GPU Pollard's rho with distinguished points using 65,536 CUDA threads and O(1) memory per thread. The GPU is the only implementation capable of running at bits≥64; at bits=56 it achieves 260× speedup over CPU serial for MD5. A 128-bit arithmetic extension enables the GPU to reach bits=72, a range completely infeasible for any CPU approach. The OpenMP sweet spot at 12 threads is explained by NUMA topology, Amdahl's serial merge bottleneck, and L3 cache pressure. All experiments ran on the UW–Madison Euler cluster (NVIDIA GPU, CUDA 13.0, dual-socket CPU node).</w:t>
+        <w:t>This project benchmarks MD5, SHA-1, and SHA-256 cryptographic hash functions across three execution models (CPU serial, CPU parallel via OpenMP, and GPU via CUDA), and uses truncated-collision search as a vehicle for showing where the GPU's algorithmic advantages become decisive at scale. Task 1 measures raw hash throughput as a function of batch size n and establishes GPU vs CPU speedup baselines (up to 440x for SHA-1 at n=10M). Task 2 sweeps threads-per-block (tpb) from 32 to 1024 and finds that register pressure limits occupancy, making tpb=32 optimal for all three algorithms. Task 3 implements truncated collision search over bit widths {16, 24, 32, 40, 48, 56, 64, 72} using three approaches: a sequential CPU unordered_map scan, a two-phase OpenMP parallel scan with 12 threads on a single socket, and GPU Pollard's rho with distinguished points using 65,536 CUDA threads and O(1) memory per thread. The GPU is the only implementation capable of running at bit widths of 64 or higher, and at bits=56 it achieves 260x speedup over CPU serial for MD5. A 128-bit arithmetic extension lets the GPU reach bits=72, a range that is completely infeasible for any CPU approach. The OpenMP sweet spot at 12 threads is explained by NUMA topology, the Amdahl's serial merge bottleneck, and L3 cache pressure. Task 4 compares Pollard's rho against an alternative GPU strategy (Thrust parallel sort) in two memory modes, with 10 trials each, and shows that Pollard's rho's main advantage above the VRAM boundary is determinism rather than raw speed. All experiments ran on the UW-Madison Euler cluster with an NVIDIA GPU, CUDA 13.0, and a dual-socket CPU node.</w:t>
       </w:r>
     </w:p>
     <w:p>
@@ -139,13 +139,13 @@
     <w:p>
       <w:pPr/>
       <w:r>
-        <w:t>Cryptographic hash functions — MD5, SHA-1, and SHA-256 — are the computational backbone of password hashing, digital signatures, file integrity verification, and certificate chains. Their security rests on two properties: preimage resistance (hard to find input given output) and collision resistance (hard to find two inputs with the same output). While the full-length versions of these algorithms are cryptographically strong, truncated variants appear in many practical systems: SSH host key fingerprints use truncated MD5 or SHA-256; Git object IDs use truncated SHA-1; many authentication protocols use only the first N bits of a digest to reduce bandwidth.</w:t>
+        <w:t>Cryptographic hash functions (MD5, SHA-1, SHA-256) are the computational backbone of password hashing, digital signatures, file integrity verification, and certificate chains. Their security rests on two properties: preimage resistance (hard to find input given output) and collision resistance (hard to find two inputs with the same output). While the full-length versions of these algorithms are cryptographically strong, truncated variants appear in many practical systems. SSH host key fingerprints use truncated MD5 or SHA-256. Git object IDs use truncated SHA-1. Many authentication protocols use only the first N bits of a digest to reduce bandwidth.</w:t>
       </w:r>
     </w:p>
     <w:p>
       <w:pPr/>
       <w:r>
-        <w:t>This project asks two questions: (1) How does GPU parallelism affect raw hash throughput relative to serial and OpenMP CPU implementations, and how does this vary by algorithm complexity and configuration? (2) How does GPU parallelism change the feasibility of truncated collision search — finding two distinct inputs whose N-bit truncated hashes collide — and at what bit width does the GPU's algorithmic advantage become decisive? The motivation is to understand the practical boundary between CPU-feasible and GPU-only cryptanalysis tasks, directly relevant to password cracking, rainbow table construction, and certificate spoofing scenarios.</w:t>
+        <w:t>This project asks two questions. First, how does GPU parallelism affect raw hash throughput relative to serial and OpenMP CPU implementations, and how does the answer vary by algorithm complexity and configuration? Second, how does GPU parallelism change the feasibility of truncated collision search (finding two distinct inputs whose N-bit truncated hashes collide), and at what bit width does the GPU's algorithmic advantage become decisive? The motivation is to understand the practical boundary between CPU-feasible and GPU-only cryptanalysis tasks, which is directly relevant to password cracking, rainbow table construction, and certificate spoofing scenarios.</w:t>
       </w:r>
     </w:p>
     <w:p>
@@ -175,7 +175,7 @@
         <w:pStyle w:val="ListBullet"/>
       </w:pPr>
       <w:r>
-        <w:t>task1.cu — GPU throughput benchmark: launches n parallel hash kernels, measures time via cudaEvent_t, reports MH/s for each algorithm and tpb=256.</w:t>
+        <w:t>task1.cu: GPU throughput benchmark. Launches n parallel hash kernels, measures time via cudaEvent_t, reports MH/s for each algorithm at tpb=256.</w:t>
       </w:r>
     </w:p>
     <w:p>
@@ -183,7 +183,7 @@
         <w:pStyle w:val="ListBullet"/>
       </w:pPr>
       <w:r>
-        <w:t>task2.cu — tpb sweep: same workload as Task 1 but varies threads-per-block from 32 to 1024, reporting throughput at each configuration.</w:t>
+        <w:t>task2.cu: tpb sweep. Same workload as Task 1 but varies threads-per-block from 32 to 1024, reporting throughput at each configuration.</w:t>
       </w:r>
     </w:p>
     <w:p>
@@ -191,7 +191,7 @@
         <w:pStyle w:val="ListBullet"/>
       </w:pPr>
       <w:r>
-        <w:t>task3.cu — collision search: CPU serial, OpenMP parallel, and GPU Pollard's rho implementations for bits in {16,24,32,40,48,56,64,72}.</w:t>
+        <w:t>task3.cu: collision search. CPU serial, OpenMP parallel, and GPU Pollard's rho implementations for bits in {16, 24, 32, 40, 48, 56, 64, 72}.</w:t>
       </w:r>
     </w:p>
     <w:p>
@@ -199,7 +199,7 @@
         <w:pStyle w:val="ListBullet"/>
       </w:pPr>
       <w:r>
-        <w:t>task4.cu — GPU Thrust-sort collision search: hash → thrust::sort_by_key → adjacent-duplicate kernel, bits in {16,24,32,40,48} (VRAM-capped).</w:t>
+        <w:t>task4.cu: GPU Thrust-sort collision search. Hash, then thrust::sort_by_key, then adjacent-duplicate kernel. Bits in {16, 24, 32, 40, 48} for device mode and {16, 24, 32, 40, 48, 52, 56} for unified-memory mode.</w:t>
       </w:r>
     </w:p>
     <w:p>
@@ -207,7 +207,7 @@
         <w:pStyle w:val="ListBullet"/>
       </w:pPr>
       <w:r>
-        <w:t>gpu_hashes_narrow.cuh — shared device hash functions used by task4.cu (and available for future GPU work).</w:t>
+        <w:t>gpu_hashes_narrow.cuh: shared device hash functions used by task4.cu.</w:t>
       </w:r>
     </w:p>
     <w:p>
@@ -215,7 +215,7 @@
         <w:pStyle w:val="ListBullet"/>
       </w:pPr>
       <w:r>
-        <w:t>md5_cpu.cpp / sha1_cpu.cpp / sha256_cpu.cpp — portable CPU reference implementations used by both CPU and OpenMP paths in Task 3.</w:t>
+        <w:t>md5_cpu.cpp / sha1_cpu.cpp / sha256_cpu.cpp: portable CPU reference implementations used by both CPU and OpenMP paths in Task 3.</w:t>
       </w:r>
     </w:p>
     <w:p>
@@ -223,7 +223,7 @@
         <w:pStyle w:val="ListBullet"/>
       </w:pPr>
       <w:r>
-        <w:t>md5_cpu.h / sha1_cpu.h / sha256_cpu.h — headers for the above.</w:t>
+        <w:t>md5_cpu.h / sha1_cpu.h / sha256_cpu.h: headers for the above.</w:t>
       </w:r>
     </w:p>
     <w:p>
@@ -231,13 +231,13 @@
         <w:pStyle w:val="Heading2"/>
       </w:pPr>
       <w:r>
-        <w:t>2.2 Task 1 — Hash Throughput</w:t>
+        <w:t>2.2 Task 1: Hash Throughput</w:t>
       </w:r>
     </w:p>
     <w:p>
       <w:pPr/>
       <w:r>
-        <w:t>Task 1 launches n CUDA threads, each computing one hash of an 8-byte little-endian encoding of its thread index. Three template kernels (template&lt;int ALGO&gt;) specialize at compile time for MD5, SHA-1, and SHA-256, eliminating runtime branches. The GPU hash functions operate entirely in registers — no shared memory, no global memory reads after the index load. Timing uses cudaEvent_t around the kernel call with cudaDeviceSynchronize() inside the called function. The experiment sweeps n from 100K to 10M to show the GPU break-even point relative to serial CPU.</w:t>
+        <w:t>Task 1 launches n CUDA threads, each computing one hash of an 8-byte little-endian encoding of its thread index. Three template kernels (template&lt;int ALGO&gt;) specialize at compile time for MD5, SHA-1, and SHA-256, eliminating runtime branches. The GPU hash functions operate entirely in registers, with no shared memory and no global memory reads after the index load. Timing uses cudaEvent_t around the kernel call with cudaDeviceSynchronize() inside the called function. The experiment sweeps n from 100K to 10M to show the GPU break-even point relative to serial CPU.</w:t>
       </w:r>
     </w:p>
     <w:p>
@@ -245,13 +245,13 @@
         <w:pStyle w:val="Heading2"/>
       </w:pPr>
       <w:r>
-        <w:t>2.3 Task 2 — Threads-per-Block Sweep</w:t>
+        <w:t>2.3 Task 2: Threads-per-Block Sweep</w:t>
       </w:r>
     </w:p>
     <w:p>
       <w:pPr/>
       <w:r>
-        <w:t>Task 2 holds n=10,000,000 fixed and sweeps tpb in {32, 64, 128, 256, 512, 1024}. The same template kernel from Task 1 is reused with the tpb as a launch parameter. The key insight is that each hash kernel is register-heavy (SHA-256 maintains 9 32-bit working variables plus a 64-entry message schedule W[64]), so increasing tpb reduces the number of blocks the SM can schedule concurrently, reducing occupancy and hiding less latency.</w:t>
+        <w:t>Task 2 holds n=10,000,000 fixed and sweeps tpb in {32, 64, 128, 256, 512, 1024}. The same template kernel from Task 1 is reused with the tpb as a launch parameter. The key insight is that each hash kernel is register-heavy. SHA-256 maintains 9 32-bit working variables plus a 64-entry message schedule W[64], so increasing tpb reduces the number of blocks the SM can schedule concurrently, which in turn reduces occupancy and hides less latency.</w:t>
       </w:r>
     </w:p>
     <w:p>
@@ -259,7 +259,7 @@
         <w:pStyle w:val="Heading2"/>
       </w:pPr>
       <w:r>
-        <w:t>2.4 Task 3 — Truncated Collision Search</w:t>
+        <w:t>2.4 Task 3: Truncated Collision Search</w:t>
       </w:r>
     </w:p>
     <w:p>
@@ -271,19 +271,19 @@
     <w:p>
       <w:pPr/>
       <w:r>
-        <w:t>CPU Serial: Sequential scan of inputs 0,1,2,... inserting each truncated hash into an std::unordered_map&lt;uint64_t,uint64_t&gt;. The first duplicate key is a collision. Limited to bits≤56 due to memory (bits=56 requires ~17 GB for the map, accommodated by --mem=96G in SLURM).</w:t>
+        <w:t>CPU Serial: Sequential scan of inputs 0, 1, 2, ... inserting each truncated hash into an std::unordered_map&lt;uint64_t, uint64_t&gt;. The first duplicate key is a collision. Limited to bits ≤ 56 due to memory: bits=56 requires roughly 17 GB for the map, which is accommodated by --mem=96G in SLURM.</w:t>
       </w:r>
     </w:p>
     <w:p>
       <w:pPr/>
       <w:r>
-        <w:t>OpenMP Parallel (12 threads): Two-phase approach per batch. Phase 1 (parallel): threads hash disjoint index ranges into pre-allocated hbuf/ibuf arrays with no synchronization. Phase 2 (serial): merge into the global map, stopping at first duplicate. Thread count is fixed at 12 — a dedicated OMP scaling experiment (sweeping 1–32 threads at bits={40,48}) showed peak performance at 12 due to: (1) NUMA boundary: Euler nodes are dual-socket; threads 13+ cross to the remote socket paying 2× DRAM latency; (2) Amdahl's serial merge: Phase 2 is fully serial, capping parallel speedup; (3) L3 cache pressure: the batch working set (~32 MB at bits=48) saturates per-socket L3 beyond 12 threads.</w:t>
+        <w:t>OpenMP Parallel (12 threads): Two-phase approach per batch. In Phase 1 (parallel), threads hash disjoint index ranges into pre-allocated hbuf/ibuf arrays with no synchronization. In Phase 2 (serial), the merge into the global map stops at the first duplicate. Thread count is fixed at 12. A dedicated OMP scaling experiment swept 1 to 32 threads at bits in {40, 48} and showed peak performance at 12, for three reasons. (1) NUMA boundary: Euler nodes are dual-socket, so threads 13 and above cross to the remote socket and pay 2x DRAM latency. (2) Amdahl's serial merge: Phase 2 is fully serial, capping parallel speedup. (3) L3 cache pressure: the batch working set (about 32 MB at bits=48) saturates per-socket L3 beyond 12 threads.</w:t>
       </w:r>
     </w:p>
     <w:p>
       <w:pPr/>
       <w:r>
-        <w:t>GPU — Pollard's Rho with Distinguished Points: 65,536 CUDA threads each walk an independent Markov chain x_{n+1} = truncate(hash(x_n), N bits). A 'distinguished point' (DP) is any chain value x with its low N/4 bits zero. Two chains reaching the same DP from different starts imply a collision. This uses O(1) memory per thread — only an 8 MB DP buffer — and scales to bits=64 without hitting device memory limits. Template kernels eliminate warp divergence. For bits&gt;64 a 128-bit extension was implemented: a uint128 struct (lo/hi pair), wide hash functions accepting 16-byte inputs, and a pollard_kernel_wide template, enabling bits=72.</w:t>
+        <w:t>GPU Pollard's Rho with Distinguished Points: 65,536 CUDA threads each walk an independent Markov chain x_{n+1} = truncate(hash(x_n), N bits). A 'distinguished point' (DP) is any chain value x with its low N/4 bits zero. Two chains reaching the same DP from different starts imply a collision. This uses O(1) memory per thread and only an 8 MB DP buffer, so it scales to bits=64 without hitting device memory limits. Template kernels eliminate warp divergence. For bits above 64 a 128-bit extension was implemented, with a uint128 struct (lo/hi pair), wide hash functions accepting 16-byte inputs, and a pollard_kernel_wide template, enabling bits=72.</w:t>
       </w:r>
     </w:p>
     <w:p>
@@ -299,7 +299,7 @@
         <w:pStyle w:val="Heading2"/>
       </w:pPr>
       <w:r>
-        <w:t>3.1 Task 1 — Throughput at n=10,000,000</w:t>
+        <w:t>3.1 Task 1: Throughput at n=10,000,000</w:t>
       </w:r>
     </w:p>
     <w:tbl>
@@ -429,7 +429,7 @@
           </w:tcPr>
           <w:p>
             <w:r>
-              <w:t>413×</w:t>
+              <w:t>413x</w:t>
             </w:r>
           </w:p>
         </w:tc>
@@ -481,7 +481,7 @@
           </w:tcPr>
           <w:p>
             <w:r>
-              <w:t>440×</w:t>
+              <w:t>440x</w:t>
             </w:r>
           </w:p>
         </w:tc>
@@ -533,7 +533,7 @@
           </w:tcPr>
           <w:p>
             <w:r>
-              <w:t>167×</w:t>
+              <w:t>167x</w:t>
             </w:r>
           </w:p>
         </w:tc>
@@ -543,7 +543,7 @@
     <w:p>
       <w:pPr/>
       <w:r>
-        <w:t>GPU throughput is 167–440× faster than serial CPU. OpenMP-4 achieves near-linear speedup (3.5×) for MD5 and SHA-1, and 2.4× for SHA-256 (limited by higher register pressure). At n&lt;~200,000 the GPU is slower than serial due to kernel launch overhead (~2 ms); above this threshold GPU parallelism dominates. Plots are in Final/Data/task1/task1_throughput.pdf.</w:t>
+        <w:t>GPU throughput is 167x to 440x faster than serial CPU. OpenMP-4 achieves near-linear speedup (3.5x) for MD5 and SHA-1, and 2.4x for SHA-256, which is limited by higher register pressure. At n below roughly 200,000 the GPU is slower than serial because of kernel launch overhead (about 2 ms). Above that threshold GPU parallelism dominates. Plots are in Final/Data/task1/task1_throughput.pdf.</w:t>
       </w:r>
     </w:p>
     <w:p>
@@ -551,7 +551,7 @@
         <w:pStyle w:val="Heading2"/>
       </w:pPr>
       <w:r>
-        <w:t>3.2 Task 2 — Threads-per-Block</w:t>
+        <w:t>3.2 Task 2: Threads-per-Block</w:t>
       </w:r>
     </w:p>
     <w:tbl>
@@ -877,7 +877,7 @@
     <w:p>
       <w:pPr/>
       <w:r>
-        <w:t>tpb=32 (one warp) is optimal for all three algorithms. Throughput decreases as tpb increases because larger blocks consume more of the SM register file, reducing concurrent warp occupancy. MD5 drops 27% from tpb=32 to tpb=512 (largest impact since it starts with highest occupancy); SHA-256 drops only 6% (already register-starved at tpb=32). Using tpb=32 vs the default tpb=256 gives 7–33% free speedup. Plot: Final/Data/task2/task2_tpb.pdf.</w:t>
+        <w:t>tpb=32 (one warp) is optimal for all three algorithms. Throughput decreases as tpb increases because larger blocks consume more of the SM register file, which reduces concurrent warp occupancy. MD5 drops 27% from tpb=32 to tpb=512, the largest impact, because it starts with the highest occupancy. SHA-256 drops only 6%, since it is already register-starved at tpb=32. Using tpb=32 instead of the default tpb=256 gives a free 7% to 33% speedup. Plot: Final/Data/task2/task2_tpb.pdf.</w:t>
       </w:r>
     </w:p>
     <w:p>
@@ -885,13 +885,13 @@
         <w:pStyle w:val="Heading2"/>
       </w:pPr>
       <w:r>
-        <w:t>3.3 Task 3 — Collision Search Timing</w:t>
+        <w:t>3.3 Task 3: Collision Search Timing</w:t>
       </w:r>
     </w:p>
     <w:p>
       <w:pPr/>
       <w:r>
-        <w:t>Selected results (time in ms). CPU/OMP = -1 for bits≥64 (infeasible).</w:t>
+        <w:t>Selected results, time in ms. CPU and OMP entries are blank where the bit width exceeds the memory budget for the unordered_map approach.</w:t>
       </w:r>
     </w:p>
     <w:tbl>
@@ -1045,7 +1045,7 @@
           </w:tcPr>
           <w:p>
             <w:r>
-              <w:t>0.26×</w:t>
+              <w:t>0.26x</w:t>
             </w:r>
           </w:p>
         </w:tc>
@@ -1107,7 +1107,7 @@
           </w:tcPr>
           <w:p>
             <w:r>
-              <w:t>7.8×</w:t>
+              <w:t>7.8x</w:t>
             </w:r>
           </w:p>
         </w:tc>
@@ -1169,7 +1169,7 @@
           </w:tcPr>
           <w:p>
             <w:r>
-              <w:t>260×</w:t>
+              <w:t>260x</w:t>
             </w:r>
           </w:p>
         </w:tc>
@@ -1201,7 +1201,7 @@
           </w:tcPr>
           <w:p>
             <w:r>
-              <w:t>—</w:t>
+              <w:t>n/a</w:t>
             </w:r>
           </w:p>
         </w:tc>
@@ -1211,7 +1211,7 @@
           </w:tcPr>
           <w:p>
             <w:r>
-              <w:t>—</w:t>
+              <w:t>n/a</w:t>
             </w:r>
           </w:p>
         </w:tc>
@@ -1231,7 +1231,7 @@
           </w:tcPr>
           <w:p>
             <w:r>
-              <w:t>—</w:t>
+              <w:t>n/a</w:t>
             </w:r>
           </w:p>
         </w:tc>
@@ -1293,7 +1293,7 @@
           </w:tcPr>
           <w:p>
             <w:r>
-              <w:t>31×</w:t>
+              <w:t>31x</w:t>
             </w:r>
           </w:p>
         </w:tc>
@@ -1355,7 +1355,7 @@
           </w:tcPr>
           <w:p>
             <w:r>
-              <w:t>164×</w:t>
+              <w:t>164x</w:t>
             </w:r>
           </w:p>
         </w:tc>
@@ -1387,7 +1387,7 @@
           </w:tcPr>
           <w:p>
             <w:r>
-              <w:t>—</w:t>
+              <w:t>n/a</w:t>
             </w:r>
           </w:p>
         </w:tc>
@@ -1397,7 +1397,7 @@
           </w:tcPr>
           <w:p>
             <w:r>
-              <w:t>—</w:t>
+              <w:t>n/a</w:t>
             </w:r>
           </w:p>
         </w:tc>
@@ -1417,7 +1417,7 @@
           </w:tcPr>
           <w:p>
             <w:r>
-              <w:t>—</w:t>
+              <w:t>n/a</w:t>
             </w:r>
           </w:p>
         </w:tc>
@@ -1427,13 +1427,13 @@
     <w:p>
       <w:pPr/>
       <w:r>
-        <w:t>GPU speedup over CPU serial grows dramatically with bit width, from sub-1× at bits=32 (GPU overhead dominates at small search spaces) to 31–260× at bits=56. At bits=64 and bits=72 only the GPU runs — CPU memory requirements (~100 GB for bits=64 with unordered_map) make CPU collision search infeasible on available hardware. The OMP implementation achieves only 1.5–2.1× speedup over serial at bits=56, limited by the serial merge phase (Amdahl's Law) and NUMA penalties. The birthday paradox is validated by CPU data: cpu_count/expected is consistently within 1–2× of 1.0 for all algorithms and bit widths. Plots: Final/Data/task3/task3_time.pdf, task3_speedup.pdf, task3_birthday.pdf.</w:t>
+        <w:t>GPU speedup over CPU serial grows dramatically with bit width, from sub-1x at bits=32 (where GPU overhead dominates the small search space) to 31x to 260x at bits=56. At bits=64 and bits=72 only the GPU runs, because CPU memory requirements (roughly 100 GB for bits=64 with unordered_map) make CPU collision search infeasible on available hardware. The OMP implementation achieves only 1.5x to 2.1x speedup over serial at bits=56, limited by the serial merge phase (Amdahl's Law) and NUMA penalties. The birthday paradox is validated by the CPU data: cpu_count divided by expected is consistently within a factor of 1 to 2 of 1.0 for all algorithms and bit widths. Plots: Final/Data/task3/task3_time.pdf, task3_speedup.pdf, task3_birthday.pdf.</w:t>
       </w:r>
     </w:p>
     <w:p>
       <w:pPr/>
       <w:r>
-        <w:t>The OMP thread-count scaling experiment (Final/Data/task3/omp_scaling.dat) confirmed the 12-thread sweet spot: speedup peaks at 12 and degrades beyond that due to NUMA penalties on the dual-socket Euler node. Plot: Final/Data/task3/omp_scaling_speedup.pdf.</w:t>
+        <w:t>The OMP thread-count scaling experiment (Final/Data/task3/omp_scaling.dat) confirmed the 12-thread sweet spot. Speedup peaks at 12 and degrades beyond that due to NUMA penalties on the dual-socket Euler node. Plot: Final/Data/task3/omp_scaling_speedup.pdf.</w:t>
       </w:r>
     </w:p>
     <w:p>
@@ -1441,13 +1441,13 @@
         <w:pStyle w:val="Heading2"/>
       </w:pPr>
       <w:r>
-        <w:t>3.4 Task 4 — GPU Algorithm Comparison: Thrust Sort vs Pollard's rho</w:t>
+        <w:t>3.4 Task 4: GPU Algorithm Comparison (Thrust Sort vs Pollard's Rho)</w:t>
       </w:r>
     </w:p>
     <w:p>
       <w:pPr/>
       <w:r>
-        <w:t>Task 4 implements an alternative GPU collision search using thrust::sort_by_key to compare against Task 3's Pollard's rho. Three-phase: hash a batch of inputs into device arrays, sort by hash key, scan for first adjacent equal-hash pair. Fully GPU-resident with no CPU-side merge phase. Two memory modes are tested:</w:t>
+        <w:t>Task 4 implements an alternative GPU collision search using thrust::sort_by_key to compare against Task 3's Pollard's rho. The algorithm is three-phase: hash a batch of inputs into device arrays, sort by hash key, then scan for the first adjacent equal-hash pair. It is fully GPU-resident with no CPU-side merge phase. Two memory modes are tested:</w:t>
       </w:r>
     </w:p>
     <w:p>
@@ -1455,7 +1455,7 @@
         <w:pStyle w:val="ListBullet"/>
       </w:pPr>
       <w:r>
-        <w:t>Device mode (cudaMalloc): pure VRAM. Capped at bits=48 because the sort working set (4 × expected × 16 bytes) plus Thrust scratch saturates 8 GB GPU memory at bits ≥ 52.</w:t>
+        <w:t>Device mode (cudaMalloc): pure VRAM. Capped at bits=48 because the sort working set (4x expected, times 16 bytes) plus Thrust scratch saturates 8 GB GPU memory at bits 52 and above.</w:t>
       </w:r>
     </w:p>
     <w:p>
@@ -1463,19 +1463,19 @@
         <w:pStyle w:val="ListBullet"/>
       </w:pPr>
       <w:r>
-        <w:t>Unified memory mode (cudaMallocManaged): the buffers are visible to both GPU and host, with pages migrating across PCIe on demand. Lets us push the sweep to bits=52 and bits=56 — the working set spills into host RAM (--mem=96G) rather than OOMing — at the cost of PCIe-bound performance during sort.</w:t>
+        <w:t>Unified memory mode (cudaMallocManaged): the buffers are visible to both GPU and host, with pages migrating across PCIe on demand. This lets us push the sweep to bits=52 and bits=56, where the working set spills into host RAM (--mem=96G) rather than OOMing. The cost is PCIe-bound performance during the sort.</w:t>
       </w:r>
     </w:p>
     <w:p>
       <w:pPr/>
       <w:r>
-        <w:t>Adaptive over-allocation factor controls the per-round retry rate: 4× expected for bits ≤ 48 (one-shot), 2× for bits=52, 1× for bits ≥ 56 (≈2 rounds on average to find a collision).</w:t>
+        <w:t>An adaptive over-allocation factor controls the per-round retry rate: 4x expected for bits up to 48 (one-shot), 2x for bits=52, and 1x for bits=56 (about 2 rounds on average to find a collision).</w:t>
       </w:r>
     </w:p>
     <w:p>
       <w:pPr/>
       <w:r>
-        <w:t>Code: Final/Code/task4.cu (uses gpu_hashes_narrow.cuh for shared device hash functions). Output: Final/Data/task4/scaling_task4_device.dat and scaling_task4_unified.dat. Plots: task4_compare.pdf, task4_speedup.pdf.</w:t>
+        <w:t>Code: Final/Code/task4.cu, which uses gpu_hashes_narrow.cuh for shared device hash functions. Output: Final/Data/task4/scaling_task4_device.dat and scaling_task4_unified.dat. Plots: task4_compare.pdf, task4_overhead.pdf, task4_trial_spread.pdf, task4_speedup.pdf.</w:t>
       </w:r>
     </w:p>
     <w:p>
@@ -1483,13 +1483,13 @@
         <w:pStyle w:val="Heading2"/>
       </w:pPr>
       <w:r>
-        <w:t>3.4.1 Methodology — Why Multiple Trials Matter</w:t>
+        <w:t>3.4.1 Methodology: Why Multiple Trials Matter</w:t>
       </w:r>
     </w:p>
     <w:p>
       <w:pPr/>
       <w:r>
-        <w:t>Initial Task 4 results were single-trial, which produced misleading conclusions. The birthday-paradox-driven retry distribution (geometric) has variance comparable to its mean — at bits=56 with 1× over-allocation, a single run can take anywhere from 1 to 6+ rounds depending purely on which input value happens to collide first. We re-ran with 10 trials per configuration in BOTH device and unified modes and report median ± IQR. Device mode also has small variance (~1.8% miss rate at 4× allocation, plus 5–10% jitter from GPU clock boost and kernel launch overhead); since device-mode trials are sub-second, repetition is free. Pollard's rho is essentially deterministic given fixed seeds and thread scheduling, so a single trial suffices for Task 3 comparisons.</w:t>
+        <w:t>Initial Task 4 results were single-trial, which produced misleading conclusions. The birthday-paradox-driven retry distribution (geometric) has variance comparable to its mean. At bits=56 with 1x over-allocation, a single run can take anywhere from 1 to 6 or more rounds depending purely on which input value happens to collide first. We re-ran with 10 trials per configuration in both device and unified modes and report median with IQR error bars. Device mode also has small variance: about a 1.8% miss rate at 4x allocation, plus 5% to 10% jitter from GPU clock boost and kernel launch overhead. Since device-mode trials are sub-second, repetition is essentially free. Pollard's rho is essentially deterministic given fixed seeds and thread scheduling, so a single trial suffices for Task 3 comparisons.</w:t>
       </w:r>
     </w:p>
     <w:p>
@@ -1497,7 +1497,7 @@
         <w:pStyle w:val="Heading2"/>
       </w:pPr>
       <w:r>
-        <w:t>3.4.2 Finding — Unified Memory Has Real but Variable Overhead at Small Bits</w:t>
+        <w:t>3.4.2 Finding: Unified Memory Has Real but Variable Overhead at Small Bits</w:t>
       </w:r>
     </w:p>
     <w:p>
@@ -1589,7 +1589,7 @@
           </w:tcPr>
           <w:p>
             <w:r>
-              <w:t>3.7×</w:t>
+              <w:t>3.7x</w:t>
             </w:r>
           </w:p>
         </w:tc>
@@ -1599,7 +1599,7 @@
           </w:tcPr>
           <w:p>
             <w:r>
-              <w:t>4.0×</w:t>
+              <w:t>4.0x</w:t>
             </w:r>
           </w:p>
         </w:tc>
@@ -1609,7 +1609,7 @@
           </w:tcPr>
           <w:p>
             <w:r>
-              <w:t>3.7×</w:t>
+              <w:t>3.7x</w:t>
             </w:r>
           </w:p>
         </w:tc>
@@ -1631,7 +1631,7 @@
           </w:tcPr>
           <w:p>
             <w:r>
-              <w:t>2.3×</w:t>
+              <w:t>2.3x</w:t>
             </w:r>
           </w:p>
         </w:tc>
@@ -1641,7 +1641,7 @@
           </w:tcPr>
           <w:p>
             <w:r>
-              <w:t>0.6× *</w:t>
+              <w:t>0.6x *</w:t>
             </w:r>
           </w:p>
         </w:tc>
@@ -1651,7 +1651,7 @@
           </w:tcPr>
           <w:p>
             <w:r>
-              <w:t>0.6× *</w:t>
+              <w:t>0.6x *</w:t>
             </w:r>
           </w:p>
         </w:tc>
@@ -1673,7 +1673,7 @@
           </w:tcPr>
           <w:p>
             <w:r>
-              <w:t>2.2×</w:t>
+              <w:t>2.2x</w:t>
             </w:r>
           </w:p>
         </w:tc>
@@ -1683,7 +1683,7 @@
           </w:tcPr>
           <w:p>
             <w:r>
-              <w:t>1.6×</w:t>
+              <w:t>1.6x</w:t>
             </w:r>
           </w:p>
         </w:tc>
@@ -1693,7 +1693,7 @@
           </w:tcPr>
           <w:p>
             <w:r>
-              <w:t>1.8×</w:t>
+              <w:t>1.8x</w:t>
             </w:r>
           </w:p>
         </w:tc>
@@ -1715,7 +1715,7 @@
           </w:tcPr>
           <w:p>
             <w:r>
-              <w:t>2.0×</w:t>
+              <w:t>2.0x</w:t>
             </w:r>
           </w:p>
         </w:tc>
@@ -1725,7 +1725,7 @@
           </w:tcPr>
           <w:p>
             <w:r>
-              <w:t>2.3×</w:t>
+              <w:t>2.3x</w:t>
             </w:r>
           </w:p>
         </w:tc>
@@ -1735,7 +1735,7 @@
           </w:tcPr>
           <w:p>
             <w:r>
-              <w:t>2.4×</w:t>
+              <w:t>2.4x</w:t>
             </w:r>
           </w:p>
         </w:tc>
@@ -1745,7 +1745,7 @@
     <w:p>
       <w:pPr/>
       <w:r>
-        <w:t>* SHA-1 and SHA-256 at bits=32 are sub-millisecond; the ratio is dominated by measurement noise. At meaningful problem sizes (bits=48) the page-tracking overhead is consistently 2.0–2.4×. Conclusion: Unified Memory has a real ~2× tax even with no spilling; it is a tool for oversubscription, not a free abstraction.</w:t>
+        <w:t>* SHA-1 and SHA-256 at bits=32 are sub-millisecond; the ratio is dominated by measurement noise. At meaningful problem sizes (bits=48) the page-tracking overhead is consistently 2.0x to 2.4x. The takeaway: Unified Memory has a real 2x tax even with no spilling. It is a tool for oversubscription, not a free abstraction.</w:t>
       </w:r>
     </w:p>
     <w:p>
@@ -1753,7 +1753,7 @@
         <w:pStyle w:val="Heading2"/>
       </w:pPr>
       <w:r>
-        <w:t>3.4.3 Finding — Per-round Thrust Beats Pollard's ρ; Total Time Depends on Retry Luck</w:t>
+        <w:t>3.4.3 Finding: Per-round Thrust Beats Pollard's Rho, Total Time Depends on Retry Luck</w:t>
       </w:r>
     </w:p>
     <w:p>
@@ -1798,7 +1798,7 @@
               <w:rPr>
                 <w:b/>
               </w:rPr>
-              <w:t>Pollard's ρ (ms)</w:t>
+              <w:t>Pollard's rho (ms)</w:t>
             </w:r>
           </w:p>
         </w:tc>
@@ -2003,7 +2003,7 @@
     <w:p>
       <w:pPr/>
       <w:r>
-        <w:t>Per-round Thrust unified time (560–1,161 ms) is consistently FASTER than Pollard's rho's deterministic single-run time (1,930–2,375 ms). However, total wall time depends on how many retry rounds are needed — SHA-1 got lucky in 1 round (2× faster than Pollard), MD5 needed 6 (1.6× slower), SHA-256 needed 3 (tied). The 10-trial median (see task4_trial_spread.pdf) collapses this variance and shows the two algorithms are in the same performance class at bits=56. Pollard's advantage is determinism, not raw speed.</w:t>
+        <w:t>Per-round Thrust unified time (560 to 1,161 ms) is consistently faster than Pollard's rho's deterministic single-run time (1,930 to 2,375 ms). However, total wall time depends on how many retry rounds are needed. SHA-1 got lucky in 1 round and was 2x faster than Pollard. MD5 needed 6 rounds and was 1.6x slower. SHA-256 needed 3 rounds and tied. The 10-trial median (see task4_trial_spread.pdf) collapses this variance and shows the two algorithms are in the same performance class at bits=56. Pollard's advantage is determinism, not raw speed.</w:t>
       </w:r>
     </w:p>
     <w:p>
@@ -2011,7 +2011,7 @@
         <w:pStyle w:val="Heading2"/>
       </w:pPr>
       <w:r>
-        <w:t>3.4.4 Finding — PCIe Spill Boundary is Sharp at bits 52→56</w:t>
+        <w:t>3.4.4 Finding: PCIe Spill Boundary is Sharp at bits 52→56</w:t>
       </w:r>
     </w:p>
     <w:tbl>
@@ -2075,7 +2075,7 @@
               <w:rPr>
                 <w:b/>
               </w:rPr>
-              <w:t>theoretical 2^(bits/2)×</w:t>
+              <w:t>theoretical 2^(bits/2)x</w:t>
             </w:r>
           </w:p>
         </w:tc>
@@ -2107,7 +2107,7 @@
           </w:tcPr>
           <w:p>
             <w:r>
-              <w:t>—</w:t>
+              <w:t>n/a</w:t>
             </w:r>
           </w:p>
         </w:tc>
@@ -2117,7 +2117,7 @@
           </w:tcPr>
           <w:p>
             <w:r>
-              <w:t>—</w:t>
+              <w:t>n/a</w:t>
             </w:r>
           </w:p>
         </w:tc>
@@ -2149,7 +2149,7 @@
           </w:tcPr>
           <w:p>
             <w:r>
-              <w:t>2.1×</w:t>
+              <w:t>2.1x</w:t>
             </w:r>
           </w:p>
         </w:tc>
@@ -2159,7 +2159,7 @@
           </w:tcPr>
           <w:p>
             <w:r>
-              <w:t>2.0× (still fits in VRAM)</w:t>
+              <w:t>2.0x (still fits in VRAM)</w:t>
             </w:r>
           </w:p>
         </w:tc>
@@ -2191,7 +2191,7 @@
           </w:tcPr>
           <w:p>
             <w:r>
-              <w:t>6.5×</w:t>
+              <w:t>6.5x</w:t>
             </w:r>
           </w:p>
         </w:tc>
@@ -2201,7 +2201,7 @@
           </w:tcPr>
           <w:p>
             <w:r>
-              <w:t>4.0× (extra 1.6× = PCIe spill)</w:t>
+              <w:t>4.0x (extra 1.6x = PCIe spill)</w:t>
             </w:r>
           </w:p>
         </w:tc>
@@ -2211,7 +2211,7 @@
     <w:p>
       <w:pPr/>
       <w:r>
-        <w:t>From bits=48 → 52 the slowdown matches theory exactly — sort scratch still fits in VRAM. From bits=52 → 56 the extra 1.6× factor beyond theoretical scaling is the PCIe-bound sort overhead. bits=64 was attempted in unified mode with 0.5× allocation (~34 GB working set) but every trial crashed inside thrust::sort_by_key with an allocation failure for the radix-sort temp scratch space — Thrust's internal allocator cannot satisfy that request even with 96 GB host RAM exposed via Unified Memory. Pollard's rho runs cleanly at bits=64 in ~8–10 sec, so the algorithmic-feasibility argument from Task 3 is reinforced empirically: at bits=64 Pollard's rho is not just faster, it is the only approach that runs at all.</w:t>
+        <w:t>From bits=48 to 52 the slowdown matches theory exactly: sort scratch still fits in VRAM. From bits=52 to 56 the extra 1.6x factor beyond theoretical scaling is the PCIe-bound sort overhead. bits=64 was attempted in unified mode with 0.5x allocation (about 34 GB working set), but every trial crashed inside thrust::sort_by_key with an allocation failure for the radix-sort temp scratch space. Thrust's internal allocator cannot satisfy that request even with 96 GB host RAM exposed via Unified Memory. Pollard's rho runs cleanly at bits=64 in 8 to 10 seconds, so the algorithmic-feasibility argument from Task 3 is reinforced empirically. At bits=64, Pollard's rho is not just faster, it is the only approach that runs at all.</w:t>
       </w:r>
     </w:p>
     <w:p>
@@ -2225,7 +2225,7 @@
         <w:pStyle w:val="ListBullet"/>
       </w:pPr>
       <w:r>
-        <w:t>bits ≤ 48: Thrust device-mode is fastest absolute (5–35× over Pollard's ρ)</w:t>
+        <w:t>bits ≤ 48: Thrust device-mode is fastest absolute (5x to 35x over Pollard's rho)</w:t>
       </w:r>
     </w:p>
     <w:p>
@@ -2233,7 +2233,7 @@
         <w:pStyle w:val="ListBullet"/>
       </w:pPr>
       <w:r>
-        <w:t>bits 52: Both Thrust modes work; unified pays ~2× tax but still beats Pollard's ρ</w:t>
+        <w:t>bits = 52: Both Thrust modes work. Unified pays a roughly 2x tax but still beats Pollard's rho</w:t>
       </w:r>
     </w:p>
     <w:p>
@@ -2241,7 +2241,7 @@
         <w:pStyle w:val="ListBullet"/>
       </w:pPr>
       <w:r>
-        <w:t>bits 56: Comparable performance class — choose by deterministic-time preference</w:t>
+        <w:t>bits = 56: Comparable performance class. Choose by deterministic-time preference</w:t>
       </w:r>
     </w:p>
     <w:p>
@@ -2249,7 +2249,7 @@
         <w:pStyle w:val="ListBullet"/>
       </w:pPr>
       <w:r>
-        <w:t>bits ≥ 64: Pollard's rho only — Thrust unified fails at bits=64 (sort scratch alloc), and at bits ≥ 72 the working set exceeds 96 GB host RAM regardless</w:t>
+        <w:t>bits ≥ 64: Pollard's rho only. Thrust unified fails at bits=64 (sort scratch alloc), and at bits ≥ 72 the working set exceeds 96 GB host RAM regardless</w:t>
       </w:r>
     </w:p>
     <w:p>
@@ -2279,7 +2279,7 @@
         <w:pStyle w:val="ListBullet"/>
       </w:pPr>
       <w:r>
-        <w:t>Final/Code/       — task1.cu, task2.cu, task3.cu, md5/sha1/sha256 CPU sources</w:t>
+        <w:t>Final/Code/: task1.cu, task2.cu, task3.cu, task4.cu, gpu_hashes_narrow.cuh, plus md5/sha1/sha256 CPU sources</w:t>
       </w:r>
     </w:p>
     <w:p>
@@ -2287,7 +2287,7 @@
         <w:pStyle w:val="ListBullet"/>
       </w:pPr>
       <w:r>
-        <w:t>Final/sbatch/     — SLURM sbatch scripts for all tasks (task1/, task2/, task3/)</w:t>
+        <w:t>Final/sbatch/: SLURM sbatch scripts for all tasks (task1/, task2/, task3/, task4/)</w:t>
       </w:r>
     </w:p>
     <w:p>
@@ -2295,7 +2295,7 @@
         <w:pStyle w:val="ListBullet"/>
       </w:pPr>
       <w:r>
-        <w:t>Final/Scripts/    — Python plotting scripts (plot_final_task*.py)</w:t>
+        <w:t>Final/Scripts/: Python plotting scripts (plot_final_task*.py)</w:t>
       </w:r>
     </w:p>
     <w:p>
@@ -2303,7 +2303,7 @@
         <w:pStyle w:val="ListBullet"/>
       </w:pPr>
       <w:r>
-        <w:t>Final/Data/       — Output .dat files and generated PDF/PNG plots</w:t>
+        <w:t>Final/Data/: Output .dat files and generated PDF/PNG plots</w:t>
       </w:r>
     </w:p>
     <w:p>
@@ -2311,7 +2311,7 @@
         <w:pStyle w:val="ListBullet"/>
       </w:pPr>
       <w:r>
-        <w:t>Final/Report/     — task1/2/3 analysis text files and this report</w:t>
+        <w:t>Final/Report/: per-task analysis text files and this report</w:t>
       </w:r>
     </w:p>
     <w:p>
@@ -2363,7 +2363,7 @@
     <w:p>
       <w:pPr/>
       <w:r>
-        <w:t>Task 4 (Thrust ships with CUDA — no extra link flags needed):</w:t>
+        <w:t>Task 4 (Thrust ships with CUDA, no extra link flags needed):</w:t>
       </w:r>
     </w:p>
     <w:p>
@@ -2386,7 +2386,7 @@
     <w:p>
       <w:pPr/>
       <w:r>
-        <w:t>Submit all three Task 3 scaling jobs (one per algorithm):</w:t>
+        <w:t>Submit all three Task 3 scaling jobs (one per algorithm), plus Task 4:</w:t>
       </w:r>
     </w:p>
     <w:p>
@@ -2400,12 +2400,14 @@
         <w:t>sbatch Final/sbatch/task3/task3_sha1_scaling.sh</w:t>
         <w:br/>
         <w:t>sbatch Final/sbatch/task3/task3_sha256_scaling.sh</w:t>
+        <w:br/>
+        <w:t>sbatch Final/sbatch/task4/task4_scaling.sh</w:t>
       </w:r>
     </w:p>
     <w:p>
       <w:pPr/>
       <w:r>
-        <w:t>SLURM parameters: -p instruction, --gres=gpu:1, --cpus-per-task=12, --mem=96G, -t 0-00:40:00. Data written to Final/Data/task3/.</w:t>
+        <w:t>SLURM parameters for Task 3 jobs: -p instruction, --gres=gpu:1, --cpus-per-task=12, --mem=96G, -t 0-00:40:00. Data written to Final/Data/task3/.</w:t>
       </w:r>
     </w:p>
     <w:p>
@@ -2429,6 +2431,8 @@
         <w:t>python3 Final/Scripts/task3/plot_final_task3.py</w:t>
         <w:br/>
         <w:t>python3 Final/Scripts/task3/plot_omp_scaling.py</w:t>
+        <w:br/>
+        <w:t>python3 Final/Scripts/task4/plot_final_task4.py</w:t>
       </w:r>
     </w:p>
     <w:p>
@@ -2442,7 +2446,7 @@
     <w:p>
       <w:pPr/>
       <w:r>
-        <w:t>This project demonstrates three distinct regimes of GPU advantage for hash computations:</w:t>
+        <w:t>This project shows three distinct regimes where the GPU helps with hash computations:</w:t>
       </w:r>
     </w:p>
     <w:p>
@@ -2450,7 +2454,7 @@
         <w:pStyle w:val="ListBullet"/>
       </w:pPr>
       <w:r>
-        <w:t>Raw throughput (Tasks 1–2): The GPU achieves 167–440× throughput over serial CPU for large batches, driven by thread-level parallelism over embarrassingly parallel independent hashes. Register pressure determines per-algorithm sensitivity to configuration, and tpb=32 is universally optimal for register-heavy hash kernels.</w:t>
+        <w:t>Raw throughput (Tasks 1 and 2): The GPU achieves 167x to 440x throughput over serial CPU for large batches, driven by thread-level parallelism over independent hashes. Register pressure determines per-algorithm sensitivity to configuration, and tpb=32 is universally optimal for register-heavy hash kernels.</w:t>
       </w:r>
     </w:p>
     <w:p>
@@ -2458,7 +2462,7 @@
         <w:pStyle w:val="ListBullet"/>
       </w:pPr>
       <w:r>
-        <w:t>Parallel CPU ceiling (Task 3, OpenMP): OpenMP parallelization of collision search is limited to ~2× speedup over serial at large bit widths due to the serial merge phase (Amdahl's Law) and NUMA topology. The 12-thread sweet spot is hardware-specific to Euler's dual-socket node and would differ on NUMA-free hardware.</w:t>
+        <w:t>Parallel CPU ceiling (Task 3, OpenMP): OpenMP parallelization of collision search is limited to about 2x speedup over serial at large bit widths due to the serial merge phase (Amdahl's Law) and NUMA topology. The 12-thread sweet spot is hardware-specific to Euler's dual-socket node and would differ on NUMA-free hardware.</w:t>
       </w:r>
     </w:p>
     <w:p>
@@ -2466,7 +2470,7 @@
         <w:pStyle w:val="ListBullet"/>
       </w:pPr>
       <w:r>
-        <w:t>Algorithmic advantage (Task 3, GPU): The GPU's decisive advantage at bits≥48 is not just raw speed but algorithmic — Pollard's rho with distinguished points uses O(1) memory per thread, while any birthday-paradox CPU approach requires O(2^(N/2)) memory. At bits=64 the CPU needs ~100 GB; the GPU uses 8 MB. This makes bits=64–72 GPU-only regardless of CPU clock speed or parallelism level.</w:t>
+        <w:t>Algorithmic advantage (Task 3, GPU): The GPU's main advantage at bits ≥ 48 is not raw speed but algorithmic. Pollard's rho with distinguished points uses O(1) memory per thread, while any birthday-paradox CPU approach requires O(2^(N/2)) memory. At bits=64 the CPU needs about 100 GB while the GPU uses 8 MB. This makes bits=64 to 72 GPU-only regardless of CPU clock speed or parallelism level.</w:t>
       </w:r>
     </w:p>
     <w:p>
@@ -2474,7 +2478,7 @@
         <w:pStyle w:val="ListBullet"/>
       </w:pPr>
       <w:r>
-        <w:t>Empirical confirmation via Task 4 (10-trial median methodology): With Unified Memory exposing host RAM to the GPU, the Thrust sort approach falls into the same performance class as Pollard's rho at bits=56 — per-round Thrust is faster, but retry variance makes total time comparable. Pollard's rho's advantage at bits=56 is determinism and predictable timing, not raw speed. At bits ≥ 72 the Thrust working set exceeds available host RAM and Pollard's rho is the only feasible option. The lesson: O(1)-memory algorithms are valuable above the VRAM boundary not just for feasibility, but for predictability and graceful scaling.</w:t>
+        <w:t>Empirical confirmation via Task 4 (10-trial median methodology): With Unified Memory exposing host RAM to the GPU, the Thrust sort approach falls into the same performance class as Pollard's rho at bits=56. Per-round Thrust is faster, but retry variance makes total time comparable. Pollard's rho's advantage at bits=56 is determinism and predictable timing, not raw speed. At bits ≥ 72 the Thrust working set exceeds available host RAM and Pollard's rho is the only feasible option. The lesson is that O(1)-memory algorithms are valuable above the VRAM boundary not just for feasibility, but for predictability and graceful scaling.</w:t>
       </w:r>
     </w:p>
     <w:p>
@@ -2488,7 +2492,7 @@
         <w:pStyle w:val="ListBullet"/>
       </w:pPr>
       <w:r>
-        <w:t>CUDA kernel design: template specialization for zero warp divergence, cudaEvent_t timing, cudaMalloc/cudaFree memory management</w:t>
+        <w:t>CUDA kernel design: template specialization for zero warp divergence, cudaEvent_t timing, cudaMalloc/cudaFree memory management.</w:t>
       </w:r>
     </w:p>
     <w:p>
@@ -2496,7 +2500,7 @@
         <w:pStyle w:val="ListBullet"/>
       </w:pPr>
       <w:r>
-        <w:t>Occupancy and register pressure: SM register file limits, occupancy analysis, tpb tuning for register-heavy kernels</w:t>
+        <w:t>Occupancy and register pressure: SM register file limits, occupancy analysis, tpb tuning for register-heavy kernels.</w:t>
       </w:r>
     </w:p>
     <w:p>
@@ -2504,7 +2508,7 @@
         <w:pStyle w:val="ListBullet"/>
       </w:pPr>
       <w:r>
-        <w:t>OpenMP: parallel-for with schedule(static), omp_get_max_threads(), phase-parallel/serial-merge pattern</w:t>
+        <w:t>OpenMP: parallel-for with schedule(static), omp_get_max_threads(), phase-parallel/serial-merge pattern.</w:t>
       </w:r>
     </w:p>
     <w:p>
@@ -2512,7 +2516,7 @@
         <w:pStyle w:val="ListBullet"/>
       </w:pPr>
       <w:r>
-        <w:t>NUMA awareness: dual-socket topology, cross-socket memory latency, thread affinity and sweet spot analysis</w:t>
+        <w:t>NUMA awareness: dual-socket topology, cross-socket memory latency, thread affinity and sweet spot analysis.</w:t>
       </w:r>
     </w:p>
     <w:p>
@@ -2520,7 +2524,15 @@
         <w:pStyle w:val="ListBullet"/>
       </w:pPr>
       <w:r>
-        <w:t>Amdahl's Law: serial fraction identification, theoretical speedup ceiling calculation for the two-phase parallel algorithm</w:t>
+        <w:t>Amdahl's Law: serial fraction identification, theoretical speedup ceiling calculation for the two-phase parallel algorithm.</w:t>
+      </w:r>
+    </w:p>
+    <w:p>
+      <w:pPr>
+        <w:pStyle w:val="ListBullet"/>
+      </w:pPr>
+      <w:r>
+        <w:t>Memory hierarchy and oversubscription: comparing cudaMalloc vs cudaMallocManaged, page-tracking overhead, PCIe-bound performance under spill.</w:t>
       </w:r>
     </w:p>
     <w:p>
@@ -2534,7 +2546,7 @@
         <w:pStyle w:val="ListBullet"/>
       </w:pPr>
       <w:r>
-        <w:t>bits=80 GPU: achievable in ~30 minutes but exceeds Euler's 40-minute instruction partition limit. Running on a partition with longer wall-clock limits would extend the speedup curve one more data point to bits=80.</w:t>
+        <w:t>bits=80 GPU: achievable in roughly 30 minutes but exceeds Euler's 40-minute instruction partition limit. Running on a partition with longer wall-clock limits would extend the speedup curve one more data point to bits=80.</w:t>
       </w:r>
     </w:p>
     <w:p>
@@ -2542,13 +2554,7 @@
         <w:pStyle w:val="ListBullet"/>
       </w:pPr>
       <w:r>
-        <w:t>Parallel sort-based CPU collision search: replacing unordered_map with a flat sorted array reduces memory to ~43 GB at bits=64. A fully parallel radix sort + linear scan could reach bits=64 on CPU in 20–30 seconds on a high-memory server, narrowing the algorithmic gap with Pollard's rho.</w:t>
-      </w:r>
-    </w:p>
-    <w:p>
-      <w:pPr/>
-      <w:r>
-        <w:t>Implemented Task 4 — GPU Thrust Sort variant — and proposed extension: Task 4's Thrust-based GPU collision search is implemented and benchmarked (see Section 3.4); it complements Pollard's rho by using sort_by_key + adjacent-duplicate scan, demonstrating where each algorithm provides maximum speedup as a function of bit width. A natural further extension is the third GPU strategy not yet implemented:</w:t>
+        <w:t>Parallel sort-based CPU collision search: replacing unordered_map with a flat sorted array reduces memory to about 43 GB at bits=64. A fully parallel radix sort plus linear scan could reach bits=64 on CPU in 20 to 30 seconds on a high-memory server, narrowing the algorithmic gap with Pollard's rho.</w:t>
       </w:r>
     </w:p>
     <w:p>
@@ -2556,21 +2562,7 @@
         <w:pStyle w:val="ListBullet"/>
       </w:pPr>
       <w:r>
-        <w:t>GPU Birthday Attack with device-side concurrent hash table. Allocate a large open-addressing hash table directly in GPU VRAM and have all 65,536 threads insert (truncated_hash → index) pairs in parallel using atomicCAS for lock-free collision detection. No CPU-side merge step is needed — the collision is detected on-device the moment two threads map to the same slot. Expected behavior: at small bit widths (bits≤48) where the entire table fits in GPU VRAM (8 GB GPU holds 2^29 × 8B = 4 GB), this approach should be faster than Pollard's rho because it eliminates the chain-walking overhead and the DP detection round-trips. At bits≥56 the table exceeds VRAM and Pollard's rho with O(1) memory wins. The crossover point is the main finding. Implementation: a flat uint64_t[2^(bits/2+2)] device array, atomicCAS for insert, a single __global__ kernel with early-exit via a device-side flag.</w:t>
-      </w:r>
-    </w:p>
-    <w:p>
-      <w:pPr>
-        <w:pStyle w:val="ListBullet"/>
-      </w:pPr>
-      <w:r>
-        <w:t>GPU Thrust Parallel Sort. Hash a full batch of N = sqrt(pi/2) * 2^(bits/2) inputs on GPU, store (hash, index) pairs in device memory, then use thrust::sort_by_key to sort by hash, and a final kernel to scan for adjacent equal-hash pairs. This is entirely GPU-resident — no CPU merge bottleneck — and directly parallelizes the sort-based approach that would improve CPU performance. Expected behavior: faster than Pollard's rho at small bits (sort is O(N log N) but fully parallel and cache-friendly); slower at large bits where N exceeds VRAM. Thrust radix sort on GPU achieves ~1 GB/s for 64-bit keys, placing bits=48 (16M pairs × 16B = 256 MB) at ~0.3 seconds sort time, well under Pollard's 544 ms. The crossover with Pollard's rho is expected around bits=52–56, where the Thrust sort working set saturates VRAM. Implementation: thrust::device_vector&lt;thrust::pair&lt;uint64_t,uint64_t&gt;&gt;, thrust::sort_by_key, then thrust::adjacent_difference to flag duplicates.</w:t>
-      </w:r>
-    </w:p>
-    <w:p>
-      <w:pPr/>
-      <w:r>
-        <w:t>Together, Tasks 3 and 4 would establish a complete GPU algorithm selection guide: Thrust sort wins at bits≤50, GPU birthday table wins at bits≤56 (given sufficient VRAM), and Pollard's rho with distinguished points wins at bits≥56 where O(1) memory is the only feasible approach.</w:t>
+        <w:t>GPU Birthday Attack with device-side concurrent hash table. Allocate a large open-addressing hash table directly in GPU VRAM and have all 65,536 threads insert (truncated_hash, index) pairs in parallel using atomicCAS for lock-free collision detection. No CPU-side merge step is needed because the collision is detected on-device the moment two threads map to the same slot. At small bit widths (bits ≤ 48) where the entire table fits in GPU VRAM, this approach should be faster than Pollard's rho because it eliminates the chain-walking overhead. At bits ≥ 56 the table exceeds VRAM and Pollard's rho with O(1) memory wins. The crossover point is the main finding.</w:t>
       </w:r>
     </w:p>
     <w:p>
@@ -2596,13 +2588,13 @@
     <w:p>
       <w:pPr/>
       <w:r>
-        <w:t>[3] van Oorschot, P. C., &amp; Wiener, M. J. (1999). Parallel Collision Search with Cryptanalytic Applications. Journal of Cryptology, 12(1), 1–28. (Pollard's rho with distinguished points.)</w:t>
+        <w:t>[3] van Oorschot, P. C., and Wiener, M. J. (1999). Parallel Collision Search with Cryptanalytic Applications. Journal of Cryptology, 12(1), 1-28. (Pollard's rho with distinguished points.)</w:t>
       </w:r>
     </w:p>
     <w:p>
       <w:pPr/>
       <w:r>
-        <w:t>[4] Kirk, D. B., &amp; Hwu, W.-m. W. (2016). Programming Massively Parallel Processors: A Hands-on Approach (3rd ed.). Morgan Kaufmann.</w:t>
+        <w:t>[4] Kirk, D. B., and Hwu, W.-m. W. (2016). Programming Massively Parallel Processors: A Hands-on Approach (3rd ed.). Morgan Kaufmann.</w:t>
       </w:r>
     </w:p>
     <w:p>
@@ -2620,19 +2612,19 @@
     <w:p>
       <w:pPr/>
       <w:r>
-        <w:t>[7] Pollard, J. M. (1978). Monte Carlo methods for index computation mod p. Mathematics of Computation, 32(143), 918–924. (Original rho cycle-detection algorithm; extended by van Oorschot &amp; Wiener [3].)</w:t>
+        <w:t>[7] Pollard, J. M. (1978). Monte Carlo methods for index computation mod p. Mathematics of Computation, 32(143), 918-924. (Original rho cycle-detection algorithm; extended by van Oorschot and Wiener [3].)</w:t>
       </w:r>
     </w:p>
     <w:p>
       <w:pPr/>
       <w:r>
-        <w:t>[8] Flajolet, P., &amp; Odlyzko, A. (1990). Random mapping statistics. Advances in Cryptology – EUROCRYPT '89, Lecture Notes in Computer Science, vol. 434, pp. 329–354. Springer. (Source for birthday paradox collision expectation E ≈ √(π/2) · 2^(N/2).)</w:t>
+        <w:t>[8] Flajolet, P., and Odlyzko, A. (1990). Random mapping statistics. Advances in Cryptology, EUROCRYPT '89, Lecture Notes in Computer Science, vol. 434, pp. 329-354. Springer. (Source for birthday paradox collision expectation E ≈ sqrt(π/2) · 2^(N/2).)</w:t>
       </w:r>
     </w:p>
     <w:p>
       <w:pPr/>
       <w:r>
-        <w:t>[9] Bell, N., &amp; Hoberock, J. (2011). Thrust: A productivity-oriented library for CUDA. GPU Computing Gems Jade Edition, pp. 359–371. Morgan Kaufmann. (Referenced in Task 4 proposal for GPU parallel sort-based collision search.)</w:t>
+        <w:t>[9] Bell, N., and Hoberock, J. (2011). Thrust: A productivity-oriented library for CUDA. GPU Computing Gems Jade Edition, pp. 359-371. Morgan Kaufmann.</w:t>
       </w:r>
     </w:p>
     <w:p>

</xml_diff>

<commit_message>
Add Section 2.5: Task 4 implementation description (3-phase Thrust sort, dual memory modes)
</commit_message>
<xml_diff>
--- a/Final/Report/FinalProject_Arsov.docx
+++ b/Final/Report/FinalProject_Arsov.docx
@@ -284,6 +284,44 @@
       <w:pPr/>
       <w:r>
         <w:t>GPU Pollard's Rho with Distinguished Points: 65,536 CUDA threads each walk an independent Markov chain x_{n+1} = truncate(hash(x_n), N bits). A 'distinguished point' (DP) is any chain value x with its low N/4 bits zero. Two chains reaching the same DP from different starts imply a collision. This uses O(1) memory per thread and only an 8 MB DP buffer, so it scales to bits=64 without hitting device memory limits. Template kernels eliminate warp divergence. For bits above 64 a 128-bit extension was implemented, with a uint128 struct (lo/hi pair), wide hash functions accepting 16-byte inputs, and a pollard_kernel_wide template, enabling bits=72.</w:t>
+      </w:r>
+    </w:p>
+    <w:p>
+      <w:pPr>
+        <w:pStyle w:val="Heading2"/>
+      </w:pPr>
+      <w:r>
+        <w:t>2.5 Task 4: GPU Algorithm Comparison via Thrust Sort</w:t>
+      </w:r>
+    </w:p>
+    <w:p>
+      <w:pPr/>
+      <w:r>
+        <w:t>Task 4 implements a second GPU collision search strategy and benchmarks it against Pollard's rho from Task 3. The goal is to identify which GPU algorithm is fastest at each bit width, and where each one breaks down. The implementation is in Final/Code/task4.cu and reuses the per-algorithm device hash functions from Final/Code/gpu_hashes_narrow.cuh.</w:t>
+      </w:r>
+    </w:p>
+    <w:p>
+      <w:pPr/>
+      <w:r>
+        <w:t>The algorithm has three phases. Phase 1 launches a parallel hash kernel that computes batch_n hashes and stores (truncated_hash, input_index) pairs in two device arrays. Phase 2 calls thrust::sort_by_key on the (hash, index) pairs, sorted by the hash key. Phase 3 launches a parallel kernel that scans adjacent elements of the sorted array and uses atomicMin to record the lowest input index at which a duplicate hash was found. If no duplicate is found in a given batch, the search retries with a new starting offset and accumulates the count.</w:t>
+      </w:r>
+    </w:p>
+    <w:p>
+      <w:pPr/>
+      <w:r>
+        <w:t>Two memory modes are supported via a CLI flag. The default mode allocates the device arrays with cudaMalloc, keeping all data in pure VRAM. The bits sweep is capped at 48 because the working set (4x expected pairs at 16 bytes each, plus Thrust's internal radix-sort scratch) saturates the 8 GB GPU at bits &gt;= 52. The unified-memory mode allocates the same arrays with cudaMallocManaged, so the buffers are visible to both GPU and host and pages migrate across PCIe on demand. This lets the sweep extend to bits=52 and bits=56, where the working set spills into the SLURM-allocated 96 GB host RAM. The cost is that the sort becomes PCIe-bound during page migrations.</w:t>
+      </w:r>
+    </w:p>
+    <w:p>
+      <w:pPr/>
+      <w:r>
+        <w:t>Over-allocation is adaptive based on bit width. At bits &lt;= 48 the binary allocates 4x the expected count (about 99% chance of finding a collision in one round). At bits=52 it allocates 2x (about 86% find rate per round). At bits=56 it allocates 1x (about 63% find rate per round, averaging 1.6 rounds). Lower over-allocation factors trade higher retry-driven variance for smaller working sets, which matters because the sort working set scales as the bit width grows. bits=64 was attempted in unified mode with 0.5x allocation but thrust::sort_by_key crashed inside its temp-buffer allocation on every trial and was dropped from the sweep.</w:t>
+      </w:r>
+    </w:p>
+    <w:p>
+      <w:pPr/>
+      <w:r>
+        <w:t>Each algorithm-bits combination runs 10 trials in both memory modes. The geometric retry distribution at sub-1x allocation has variance comparable to its mean, so single-trial measurements are not representative. Reported numbers are median across the 10 trials, with IQR error bars on the time-vs-bits plots.</w:t>
       </w:r>
     </w:p>
     <w:p>

</xml_diff>

<commit_message>
Embed all plots inline; substantially trim report prose
- Added figure() helper that uses doc.add_picture(width=Inches(6)) with
  italic centered captions
- Embedded 9 figures: task1_throughput, task2_tpb, task3_time/speedup/
  birthday/omp_scaling_speedup, task4_compare/overhead/trial_spread
- Collapsed Section 3.4.1-3.4.4 into a single 3.4 with figures carrying
  the variance + overhead + spill story instead of separate tables
- Cut Section 2 prose roughly in half; merged tasks 1+2 descriptions
- Conclusions reduced from 4 long bullets + paragraph to 4 short bullets
- Removed redundant prose where figures already convey the takeaway
- Doc size went from ~50 KB to ~780 KB (the figures)
</commit_message>
<xml_diff>
--- a/Final/Report/FinalProject_Arsov.docx
+++ b/Final/Report/FinalProject_Arsov.docx
@@ -58,7 +58,7 @@
     <w:p>
       <w:pPr/>
       <w:r>
-        <w:t>This project benchmarks MD5, SHA-1, and SHA-256 cryptographic hash functions across three execution models (CPU serial, CPU parallel via OpenMP, and GPU via CUDA), and uses truncated-collision search as a vehicle for showing where the GPU's algorithmic advantages become decisive at scale. Task 1 measures raw hash throughput as a function of batch size n and establishes GPU vs CPU speedup baselines (up to 440x for SHA-1 at n=10M). Task 2 sweeps threads-per-block (tpb) from 32 to 1024 and finds that register pressure limits occupancy, making tpb=32 optimal for all three algorithms. Task 3 implements truncated collision search over bit widths {16, 24, 32, 40, 48, 56, 64, 72} using three approaches: a sequential CPU unordered_map scan, a two-phase OpenMP parallel scan with 12 threads on a single socket, and GPU Pollard's rho with distinguished points using 65,536 CUDA threads and O(1) memory per thread. The GPU is the only implementation capable of running at bit widths of 64 or higher, and at bits=56 it achieves 260x speedup over CPU serial for MD5. A 128-bit arithmetic extension lets the GPU reach bits=72, a range that is completely infeasible for any CPU approach. The OpenMP sweet spot at 12 threads is explained by NUMA topology, the Amdahl's serial merge bottleneck, and L3 cache pressure. Task 4 compares Pollard's rho against an alternative GPU strategy (Thrust parallel sort) in two memory modes, with 10 trials each, and shows that Pollard's rho's main advantage above the VRAM boundary is determinism rather than raw speed. All experiments ran on the UW-Madison Euler cluster with an NVIDIA GPU, CUDA 13.0, and a dual-socket CPU node.</w:t>
+        <w:t>This project benchmarks MD5, SHA-1, and SHA-256 across CPU serial, OpenMP, and CUDA, and uses truncated-collision search to identify where the GPU's algorithmic advantage becomes decisive. Task 1 measures raw hash throughput vs batch size, establishing GPU vs CPU baselines (up to 440x for SHA-1 at n=10M). Task 2 sweeps threads-per-block and finds tpb=32 optimal for all three algorithms because of register pressure. Task 3 implements collision search across bit widths {16..72} with three approaches (CPU serial, OpenMP-12, GPU Pollard's rho with distinguished points). The GPU is the only implementation that runs at bits &gt;= 64, and at bits=56 it achieves 260x over CPU serial for MD5. A 128-bit extension lets the GPU reach bits=72. Task 4 adds a second GPU strategy (Thrust parallel sort) in two memory modes (device-only and unified) with 10-trial median methodology, and shows that above the VRAM boundary Pollard's rho's main advantage is determinism rather than raw speed. All experiments ran on the UW-Madison Euler cluster (NVIDIA GPU, CUDA 13.0, dual-socket CPU node, 96 GB host RAM).</w:t>
       </w:r>
     </w:p>
     <w:p>
@@ -139,13 +139,13 @@
     <w:p>
       <w:pPr/>
       <w:r>
-        <w:t>Cryptographic hash functions (MD5, SHA-1, SHA-256) are the computational backbone of password hashing, digital signatures, file integrity verification, and certificate chains. Their security rests on two properties: preimage resistance (hard to find input given output) and collision resistance (hard to find two inputs with the same output). While the full-length versions of these algorithms are cryptographically strong, truncated variants appear in many practical systems. SSH host key fingerprints use truncated MD5 or SHA-256. Git object IDs use truncated SHA-1. Many authentication protocols use only the first N bits of a digest to reduce bandwidth.</w:t>
+        <w:t>Cryptographic hash functions are the computational backbone of password hashing, digital signatures, file integrity verification, and certificate chains. Their security rests on preimage and collision resistance. While the full-length versions are cryptographically strong, truncated variants are common in practice: SSH host key fingerprints use truncated MD5 or SHA-256, Git object IDs use truncated SHA-1, and many authentication protocols use only the first N bits to reduce bandwidth.</w:t>
       </w:r>
     </w:p>
     <w:p>
       <w:pPr/>
       <w:r>
-        <w:t>This project asks two questions. First, how does GPU parallelism affect raw hash throughput relative to serial and OpenMP CPU implementations, and how does the answer vary by algorithm complexity and configuration? Second, how does GPU parallelism change the feasibility of truncated collision search (finding two distinct inputs whose N-bit truncated hashes collide), and at what bit width does the GPU's algorithmic advantage become decisive? The motivation is to understand the practical boundary between CPU-feasible and GPU-only cryptanalysis tasks, which is directly relevant to password cracking, rainbow table construction, and certificate spoofing scenarios.</w:t>
+        <w:t>This project asks two questions. First, how does GPU parallelism affect raw hash throughput relative to CPU implementations, and how does it vary by algorithm and configuration? Second, at what bit width does GPU parallelism make truncated collision search possible where CPU approaches break down? The motivation is to draw a clear line between CPU-feasible and GPU-only cryptanalysis tasks, which is directly relevant to password cracking, rainbow table construction, and certificate spoofing.</w:t>
       </w:r>
     </w:p>
     <w:p>
@@ -175,7 +175,7 @@
         <w:pStyle w:val="ListBullet"/>
       </w:pPr>
       <w:r>
-        <w:t>task1.cu: GPU throughput benchmark. Launches n parallel hash kernels, measures time via cudaEvent_t, reports MH/s for each algorithm at tpb=256.</w:t>
+        <w:t>task1.cu: launches n parallel hash kernels, cudaEvent_t timing, reports MH/s.</w:t>
       </w:r>
     </w:p>
     <w:p>
@@ -183,7 +183,7 @@
         <w:pStyle w:val="ListBullet"/>
       </w:pPr>
       <w:r>
-        <w:t>task2.cu: tpb sweep. Same workload as Task 1 but varies threads-per-block from 32 to 1024, reporting throughput at each configuration.</w:t>
+        <w:t>task2.cu: same kernel, sweeps tpb in {32, 64, 128, 256, 512, 1024}.</w:t>
       </w:r>
     </w:p>
     <w:p>
@@ -191,7 +191,7 @@
         <w:pStyle w:val="ListBullet"/>
       </w:pPr>
       <w:r>
-        <w:t>task3.cu: collision search. CPU serial, OpenMP parallel, and GPU Pollard's rho implementations for bits in {16, 24, 32, 40, 48, 56, 64, 72}.</w:t>
+        <w:t>task3.cu: CPU serial, OpenMP, and GPU Pollard's rho collision search.</w:t>
       </w:r>
     </w:p>
     <w:p>
@@ -199,7 +199,7 @@
         <w:pStyle w:val="ListBullet"/>
       </w:pPr>
       <w:r>
-        <w:t>task4.cu: GPU Thrust-sort collision search. Hash, then thrust::sort_by_key, then adjacent-duplicate kernel. Bits in {16, 24, 32, 40, 48} for device mode and {16, 24, 32, 40, 48, 52, 56} for unified-memory mode.</w:t>
+        <w:t>task4.cu: GPU Thrust-sort collision search, device and unified memory modes.</w:t>
       </w:r>
     </w:p>
     <w:p>
@@ -207,7 +207,7 @@
         <w:pStyle w:val="ListBullet"/>
       </w:pPr>
       <w:r>
-        <w:t>gpu_hashes_narrow.cuh: shared device hash functions used by task4.cu.</w:t>
+        <w:t>gpu_hashes_narrow.cuh: shared device hash functions for Task 4.</w:t>
       </w:r>
     </w:p>
     <w:p>
@@ -215,7 +215,41 @@
         <w:pStyle w:val="ListBullet"/>
       </w:pPr>
       <w:r>
-        <w:t>md5_cpu.cpp / sha1_cpu.cpp / sha256_cpu.cpp: portable CPU reference implementations used by both CPU and OpenMP paths in Task 3.</w:t>
+        <w:t>md5_cpu.cpp / sha1_cpu.cpp / sha256_cpu.cpp: CPU reference implementations.</w:t>
+      </w:r>
+    </w:p>
+    <w:p>
+      <w:pPr>
+        <w:pStyle w:val="Heading2"/>
+      </w:pPr>
+      <w:r>
+        <w:t>2.2 Tasks 1 and 2: Throughput and tpb Sweep</w:t>
+      </w:r>
+    </w:p>
+    <w:p>
+      <w:pPr/>
+      <w:r>
+        <w:t>Task 1 launches n CUDA threads, each computing one hash of an 8-byte little-endian encoding of its thread index. Three template kernels (template&lt;int ALGO&gt;) specialize at compile time so there are no runtime branches inside the kernels, and the GPU hash functions operate entirely in registers. Timing uses cudaEvent_t around the kernel call. The experiment sweeps n from 100K to 10M to find the GPU break-even point relative to serial CPU.</w:t>
+      </w:r>
+    </w:p>
+    <w:p>
+      <w:pPr/>
+      <w:r>
+        <w:t>Task 2 holds n=10,000,000 fixed and sweeps tpb to test occupancy effects. The hash kernels are register-heavy (SHA-256 keeps 9 32-bit working variables plus a 64-entry message schedule), so larger blocks reduce concurrent warp count and hide less latency.</w:t>
+      </w:r>
+    </w:p>
+    <w:p>
+      <w:pPr>
+        <w:pStyle w:val="Heading2"/>
+      </w:pPr>
+      <w:r>
+        <w:t>2.3 Task 3: Truncated Collision Search</w:t>
+      </w:r>
+    </w:p>
+    <w:p>
+      <w:pPr/>
+      <w:r>
+        <w:t>Task 3 finds two distinct inputs i and j whose N-bit truncated hashes match. Three approaches are implemented and compared:</w:t>
       </w:r>
     </w:p>
     <w:p>
@@ -223,7 +257,23 @@
         <w:pStyle w:val="ListBullet"/>
       </w:pPr>
       <w:r>
-        <w:t>md5_cpu.h / sha1_cpu.h / sha256_cpu.h: headers for the above.</w:t>
+        <w:t>CPU serial: sequential scan inserting each truncated hash into std::unordered_map&lt;uint64_t, uint64_t&gt;; first duplicate key is the collision. Limited to bits &lt;= 56 due to memory (about 17 GB at bits=56).</w:t>
+      </w:r>
+    </w:p>
+    <w:p>
+      <w:pPr>
+        <w:pStyle w:val="ListBullet"/>
+      </w:pPr>
+      <w:r>
+        <w:t>OpenMP (12 threads): two-phase per batch. Phase 1 is a parallel hash into pre-allocated buffers (no synchronization). Phase 2 is a serial merge into the global map, stopping at the first duplicate. Thread count is fixed at 12 because a dedicated scaling experiment from 1 to 32 threads showed peak performance there (NUMA boundary on the dual-socket node, plus Amdahl's serial merge ceiling and L3 cache pressure beyond 12 threads).</w:t>
+      </w:r>
+    </w:p>
+    <w:p>
+      <w:pPr>
+        <w:pStyle w:val="ListBullet"/>
+      </w:pPr>
+      <w:r>
+        <w:t>GPU Pollard's rho with distinguished points: 65,536 CUDA threads each walk an independent Markov chain x_{n+1} = truncate(hash(x_n), N). A 'distinguished point' is any chain value with its low N/4 bits zero. Two chains reaching the same DP from different starts imply a collision. Uses O(1) memory per thread (8 MB DP buffer total). A 128-bit extension (uint128 struct, wide hash functions, pollard_kernel_wide template) enables bits=72.</w:t>
       </w:r>
     </w:p>
     <w:p>
@@ -231,97 +281,19 @@
         <w:pStyle w:val="Heading2"/>
       </w:pPr>
       <w:r>
-        <w:t>2.2 Task 1: Hash Throughput</w:t>
+        <w:t>2.4 Task 4: GPU Algorithm Comparison via Thrust Sort</w:t>
       </w:r>
     </w:p>
     <w:p>
       <w:pPr/>
       <w:r>
-        <w:t>Task 1 launches n CUDA threads, each computing one hash of an 8-byte little-endian encoding of its thread index. Three template kernels (template&lt;int ALGO&gt;) specialize at compile time for MD5, SHA-1, and SHA-256, eliminating runtime branches. The GPU hash functions operate entirely in registers, with no shared memory and no global memory reads after the index load. Timing uses cudaEvent_t around the kernel call with cudaDeviceSynchronize() inside the called function. The experiment sweeps n from 100K to 10M to show the GPU break-even point relative to serial CPU.</w:t>
-      </w:r>
-    </w:p>
-    <w:p>
-      <w:pPr>
-        <w:pStyle w:val="Heading2"/>
-      </w:pPr>
-      <w:r>
-        <w:t>2.3 Task 2: Threads-per-Block Sweep</w:t>
+        <w:t>Task 4 implements a second GPU collision search and benchmarks it against Task 3's Pollard's rho. Three phases per round: a parallel hash kernel writes (hash, index) pairs to device arrays, thrust::sort_by_key sorts by hash, and a parallel find-duplicate kernel uses atomicMin to record the smallest input index where two adjacent sorted hashes match. If no duplicate is found, a new round retries with a fresh starting offset.</w:t>
       </w:r>
     </w:p>
     <w:p>
       <w:pPr/>
       <w:r>
-        <w:t>Task 2 holds n=10,000,000 fixed and sweeps tpb in {32, 64, 128, 256, 512, 1024}. The same template kernel from Task 1 is reused with the tpb as a launch parameter. The key insight is that each hash kernel is register-heavy. SHA-256 maintains 9 32-bit working variables plus a 64-entry message schedule W[64], so increasing tpb reduces the number of blocks the SM can schedule concurrently, which in turn reduces occupancy and hides less latency.</w:t>
-      </w:r>
-    </w:p>
-    <w:p>
-      <w:pPr>
-        <w:pStyle w:val="Heading2"/>
-      </w:pPr>
-      <w:r>
-        <w:t>2.4 Task 3: Truncated Collision Search</w:t>
-      </w:r>
-    </w:p>
-    <w:p>
-      <w:pPr/>
-      <w:r>
-        <w:t>Task 3 implements three independent collision search strategies for truncated N-bit hashes, where a collision is two distinct inputs i ≠ j such that truncate(hash(i), N) == truncate(hash(j), N).</w:t>
-      </w:r>
-    </w:p>
-    <w:p>
-      <w:pPr/>
-      <w:r>
-        <w:t>CPU Serial: Sequential scan of inputs 0, 1, 2, ... inserting each truncated hash into an std::unordered_map&lt;uint64_t, uint64_t&gt;. The first duplicate key is a collision. Limited to bits ≤ 56 due to memory: bits=56 requires roughly 17 GB for the map, which is accommodated by --mem=96G in SLURM.</w:t>
-      </w:r>
-    </w:p>
-    <w:p>
-      <w:pPr/>
-      <w:r>
-        <w:t>OpenMP Parallel (12 threads): Two-phase approach per batch. In Phase 1 (parallel), threads hash disjoint index ranges into pre-allocated hbuf/ibuf arrays with no synchronization. In Phase 2 (serial), the merge into the global map stops at the first duplicate. Thread count is fixed at 12. A dedicated OMP scaling experiment swept 1 to 32 threads at bits in {40, 48} and showed peak performance at 12, for three reasons. (1) NUMA boundary: Euler nodes are dual-socket, so threads 13 and above cross to the remote socket and pay 2x DRAM latency. (2) Amdahl's serial merge: Phase 2 is fully serial, capping parallel speedup. (3) L3 cache pressure: the batch working set (about 32 MB at bits=48) saturates per-socket L3 beyond 12 threads.</w:t>
-      </w:r>
-    </w:p>
-    <w:p>
-      <w:pPr/>
-      <w:r>
-        <w:t>GPU Pollard's Rho with Distinguished Points: 65,536 CUDA threads each walk an independent Markov chain x_{n+1} = truncate(hash(x_n), N bits). A 'distinguished point' (DP) is any chain value x with its low N/4 bits zero. Two chains reaching the same DP from different starts imply a collision. This uses O(1) memory per thread and only an 8 MB DP buffer, so it scales to bits=64 without hitting device memory limits. Template kernels eliminate warp divergence. For bits above 64 a 128-bit extension was implemented, with a uint128 struct (lo/hi pair), wide hash functions accepting 16-byte inputs, and a pollard_kernel_wide template, enabling bits=72.</w:t>
-      </w:r>
-    </w:p>
-    <w:p>
-      <w:pPr>
-        <w:pStyle w:val="Heading2"/>
-      </w:pPr>
-      <w:r>
-        <w:t>2.5 Task 4: GPU Algorithm Comparison via Thrust Sort</w:t>
-      </w:r>
-    </w:p>
-    <w:p>
-      <w:pPr/>
-      <w:r>
-        <w:t>Task 4 implements a second GPU collision search strategy and benchmarks it against Pollard's rho from Task 3. The goal is to identify which GPU algorithm is fastest at each bit width, and where each one breaks down. The implementation is in Final/Code/task4.cu and reuses the per-algorithm device hash functions from Final/Code/gpu_hashes_narrow.cuh.</w:t>
-      </w:r>
-    </w:p>
-    <w:p>
-      <w:pPr/>
-      <w:r>
-        <w:t>The algorithm has three phases. Phase 1 launches a parallel hash kernel that computes batch_n hashes and stores (truncated_hash, input_index) pairs in two device arrays. Phase 2 calls thrust::sort_by_key on the (hash, index) pairs, sorted by the hash key. Phase 3 launches a parallel kernel that scans adjacent elements of the sorted array and uses atomicMin to record the lowest input index at which a duplicate hash was found. If no duplicate is found in a given batch, the search retries with a new starting offset and accumulates the count.</w:t>
-      </w:r>
-    </w:p>
-    <w:p>
-      <w:pPr/>
-      <w:r>
-        <w:t>Two memory modes are supported via a CLI flag. The default mode allocates the device arrays with cudaMalloc, keeping all data in pure VRAM. The bits sweep is capped at 48 because the working set (4x expected pairs at 16 bytes each, plus Thrust's internal radix-sort scratch) saturates the 8 GB GPU at bits &gt;= 52. The unified-memory mode allocates the same arrays with cudaMallocManaged, so the buffers are visible to both GPU and host and pages migrate across PCIe on demand. This lets the sweep extend to bits=52 and bits=56, where the working set spills into the SLURM-allocated 96 GB host RAM. The cost is that the sort becomes PCIe-bound during page migrations.</w:t>
-      </w:r>
-    </w:p>
-    <w:p>
-      <w:pPr/>
-      <w:r>
-        <w:t>Over-allocation is adaptive based on bit width. At bits &lt;= 48 the binary allocates 4x the expected count (about 99% chance of finding a collision in one round). At bits=52 it allocates 2x (about 86% find rate per round). At bits=56 it allocates 1x (about 63% find rate per round, averaging 1.6 rounds). Lower over-allocation factors trade higher retry-driven variance for smaller working sets, which matters because the sort working set scales as the bit width grows. bits=64 was attempted in unified mode with 0.5x allocation but thrust::sort_by_key crashed inside its temp-buffer allocation on every trial and was dropped from the sweep.</w:t>
-      </w:r>
-    </w:p>
-    <w:p>
-      <w:pPr/>
-      <w:r>
-        <w:t>Each algorithm-bits combination runs 10 trials in both memory modes. The geometric retry distribution at sub-1x allocation has variance comparable to its mean, so single-trial measurements are not representative. Reported numbers are median across the 10 trials, with IQR error bars on the time-vs-bits plots.</w:t>
+        <w:t>Two memory modes are supported. Device mode uses cudaMalloc and is capped at bits=48 because the working set saturates the 8 GB GPU at bits &gt;= 52. Unified memory mode uses cudaMallocManaged so buffers spill into host RAM via PCIe page migration, extending the sweep to bits=52 and bits=56 at the cost of PCIe-bound sort performance. An adaptive over-allocation factor (4x at bits &lt;= 48, 2x at bits=52, 1x at bits=56) controls the find rate per round. Each configuration runs 10 trials and the median is reported, because the geometric retry distribution at sub-1x allocation has variance comparable to its mean.</w:t>
       </w:r>
     </w:p>
     <w:p>
@@ -337,7 +309,7 @@
         <w:pStyle w:val="Heading2"/>
       </w:pPr>
       <w:r>
-        <w:t>3.1 Task 1: Throughput at n=10,000,000</w:t>
+        <w:t>3.1 Task 1: Throughput</w:t>
       </w:r>
     </w:p>
     <w:tbl>
@@ -415,7 +387,7 @@
               <w:rPr>
                 <w:b/>
               </w:rPr>
-              <w:t>GPU/Serial Speedup</w:t>
+              <w:t>GPU/Serial</w:t>
             </w:r>
           </w:p>
         </w:tc>
@@ -579,9 +551,60 @@
     </w:tbl>
     <w:p/>
     <w:p>
+      <w:pPr>
+        <w:jc w:val="center"/>
+      </w:pPr>
+      <w:r>
+        <w:drawing>
+          <wp:inline xmlns:a="http://schemas.openxmlformats.org/drawingml/2006/main" xmlns:pic="http://schemas.openxmlformats.org/drawingml/2006/picture">
+            <wp:extent cx="5486400" cy="3352800"/>
+            <wp:docPr id="1" name="Picture 1"/>
+            <wp:cNvGraphicFramePr>
+              <a:graphicFrameLocks noChangeAspect="1"/>
+            </wp:cNvGraphicFramePr>
+            <a:graphic>
+              <a:graphicData uri="http://schemas.openxmlformats.org/drawingml/2006/picture">
+                <pic:pic>
+                  <pic:nvPicPr>
+                    <pic:cNvPr id="0" name="task1_throughput.png"/>
+                    <pic:cNvPicPr/>
+                  </pic:nvPicPr>
+                  <pic:blipFill>
+                    <a:blip r:embed="rId9"/>
+                    <a:stretch>
+                      <a:fillRect/>
+                    </a:stretch>
+                  </pic:blipFill>
+                  <pic:spPr>
+                    <a:xfrm>
+                      <a:off x="0" y="0"/>
+                      <a:ext cx="5486400" cy="3352800"/>
+                    </a:xfrm>
+                    <a:prstGeom prst="rect"/>
+                  </pic:spPr>
+                </pic:pic>
+              </a:graphicData>
+            </a:graphic>
+          </wp:inline>
+        </w:drawing>
+      </w:r>
+    </w:p>
+    <w:p>
+      <w:pPr>
+        <w:jc w:val="center"/>
+      </w:pPr>
+      <w:r>
+        <w:rPr>
+          <w:i/>
+          <w:sz w:val="20"/>
+        </w:rPr>
+        <w:t>Figure 1. Hash throughput vs batch size n. GPU breaks even with serial CPU around n = 200,000.</w:t>
+      </w:r>
+    </w:p>
+    <w:p>
       <w:pPr/>
       <w:r>
-        <w:t>GPU throughput is 167x to 440x faster than serial CPU. OpenMP-4 achieves near-linear speedup (3.5x) for MD5 and SHA-1, and 2.4x for SHA-256, which is limited by higher register pressure. At n below roughly 200,000 the GPU is slower than serial because of kernel launch overhead (about 2 ms). Above that threshold GPU parallelism dominates. Plots are in Final/Data/task1/task1_throughput.pdf.</w:t>
+        <w:t>OpenMP-4 achieves near-linear 3.5x speedup for MD5 and SHA-1, and 2.4x for SHA-256 (limited by register pressure). Below n ≈ 200,000 the GPU is slower than serial because the ~2 ms kernel launch overhead dominates.</w:t>
       </w:r>
     </w:p>
     <w:p>
@@ -665,7 +688,7 @@
           </w:tcPr>
           <w:p>
             <w:r>
-              <w:t>32</w:t>
+              <w:t>32 (optimal)</w:t>
             </w:r>
           </w:p>
         </w:tc>
@@ -707,91 +730,7 @@
           </w:tcPr>
           <w:p>
             <w:r>
-              <w:t>64</w:t>
-            </w:r>
-          </w:p>
-        </w:tc>
-        <w:tc>
-          <w:tcPr>
-            <w:tcW w:type="dxa" w:w="2160"/>
-          </w:tcPr>
-          <w:p>
-            <w:r>
-              <w:t>2840.9</w:t>
-            </w:r>
-          </w:p>
-        </w:tc>
-        <w:tc>
-          <w:tcPr>
-            <w:tcW w:type="dxa" w:w="2160"/>
-          </w:tcPr>
-          <w:p>
-            <w:r>
-              <w:t>1052.6</w:t>
-            </w:r>
-          </w:p>
-        </w:tc>
-        <w:tc>
-          <w:tcPr>
-            <w:tcW w:type="dxa" w:w="2160"/>
-          </w:tcPr>
-          <w:p>
-            <w:r>
-              <w:t>559.3</w:t>
-            </w:r>
-          </w:p>
-        </w:tc>
-      </w:tr>
-      <w:tr>
-        <w:tc>
-          <w:tcPr>
-            <w:tcW w:type="dxa" w:w="2160"/>
-          </w:tcPr>
-          <w:p>
-            <w:r>
-              <w:t>128</w:t>
-            </w:r>
-          </w:p>
-        </w:tc>
-        <w:tc>
-          <w:tcPr>
-            <w:tcW w:type="dxa" w:w="2160"/>
-          </w:tcPr>
-          <w:p>
-            <w:r>
-              <w:t>2717.4</w:t>
-            </w:r>
-          </w:p>
-        </w:tc>
-        <w:tc>
-          <w:tcPr>
-            <w:tcW w:type="dxa" w:w="2160"/>
-          </w:tcPr>
-          <w:p>
-            <w:r>
-              <w:t>1066.1</w:t>
-            </w:r>
-          </w:p>
-        </w:tc>
-        <w:tc>
-          <w:tcPr>
-            <w:tcW w:type="dxa" w:w="2160"/>
-          </w:tcPr>
-          <w:p>
-            <w:r>
-              <w:t>557.7</w:t>
-            </w:r>
-          </w:p>
-        </w:tc>
-      </w:tr>
-      <w:tr>
-        <w:tc>
-          <w:tcPr>
-            <w:tcW w:type="dxa" w:w="2160"/>
-          </w:tcPr>
-          <w:p>
-            <w:r>
-              <w:t>256</w:t>
+              <w:t>256 (default)</w:t>
             </w:r>
           </w:p>
         </w:tc>
@@ -822,48 +761,6 @@
           <w:p>
             <w:r>
               <w:t>537.3</w:t>
-            </w:r>
-          </w:p>
-        </w:tc>
-      </w:tr>
-      <w:tr>
-        <w:tc>
-          <w:tcPr>
-            <w:tcW w:type="dxa" w:w="2160"/>
-          </w:tcPr>
-          <w:p>
-            <w:r>
-              <w:t>512</w:t>
-            </w:r>
-          </w:p>
-        </w:tc>
-        <w:tc>
-          <w:tcPr>
-            <w:tcW w:type="dxa" w:w="2160"/>
-          </w:tcPr>
-          <w:p>
-            <w:r>
-              <w:t>2197.8</w:t>
-            </w:r>
-          </w:p>
-        </w:tc>
-        <w:tc>
-          <w:tcPr>
-            <w:tcW w:type="dxa" w:w="2160"/>
-          </w:tcPr>
-          <w:p>
-            <w:r>
-              <w:t>1003.0</w:t>
-            </w:r>
-          </w:p>
-        </w:tc>
-        <w:tc>
-          <w:tcPr>
-            <w:tcW w:type="dxa" w:w="2160"/>
-          </w:tcPr>
-          <w:p>
-            <w:r>
-              <w:t>540.8</w:t>
             </w:r>
           </w:p>
         </w:tc>
@@ -913,9 +810,60 @@
     </w:tbl>
     <w:p/>
     <w:p>
+      <w:pPr>
+        <w:jc w:val="center"/>
+      </w:pPr>
+      <w:r>
+        <w:drawing>
+          <wp:inline xmlns:a="http://schemas.openxmlformats.org/drawingml/2006/main" xmlns:pic="http://schemas.openxmlformats.org/drawingml/2006/picture">
+            <wp:extent cx="5486400" cy="3429000"/>
+            <wp:docPr id="2" name="Picture 2"/>
+            <wp:cNvGraphicFramePr>
+              <a:graphicFrameLocks noChangeAspect="1"/>
+            </wp:cNvGraphicFramePr>
+            <a:graphic>
+              <a:graphicData uri="http://schemas.openxmlformats.org/drawingml/2006/picture">
+                <pic:pic>
+                  <pic:nvPicPr>
+                    <pic:cNvPr id="0" name="task2_tpb.png"/>
+                    <pic:cNvPicPr/>
+                  </pic:nvPicPr>
+                  <pic:blipFill>
+                    <a:blip r:embed="rId10"/>
+                    <a:stretch>
+                      <a:fillRect/>
+                    </a:stretch>
+                  </pic:blipFill>
+                  <pic:spPr>
+                    <a:xfrm>
+                      <a:off x="0" y="0"/>
+                      <a:ext cx="5486400" cy="3429000"/>
+                    </a:xfrm>
+                    <a:prstGeom prst="rect"/>
+                  </pic:spPr>
+                </pic:pic>
+              </a:graphicData>
+            </a:graphic>
+          </wp:inline>
+        </w:drawing>
+      </w:r>
+    </w:p>
+    <w:p>
+      <w:pPr>
+        <w:jc w:val="center"/>
+      </w:pPr>
+      <w:r>
+        <w:rPr>
+          <w:i/>
+          <w:sz w:val="20"/>
+        </w:rPr>
+        <w:t>Figure 2. GPU throughput vs threads-per-block. tpb=32 is optimal for all three algorithms because larger blocks reduce SM occupancy.</w:t>
+      </w:r>
+    </w:p>
+    <w:p>
       <w:pPr/>
       <w:r>
-        <w:t>tpb=32 (one warp) is optimal for all three algorithms. Throughput decreases as tpb increases because larger blocks consume more of the SM register file, which reduces concurrent warp occupancy. MD5 drops 27% from tpb=32 to tpb=512, the largest impact, because it starts with the highest occupancy. SHA-256 drops only 6%, since it is already register-starved at tpb=32. Using tpb=32 instead of the default tpb=256 gives a free 7% to 33% speedup. Plot: Final/Data/task2/task2_tpb.pdf.</w:t>
+        <w:t>MD5 drops 27% from tpb=32 to tpb=512 (most sensitive, since it starts with highest occupancy). SHA-256 drops only 6% (already register-starved). The default tpb=256 leaves a free 7% to 33% on the table.</w:t>
       </w:r>
     </w:p>
     <w:p>
@@ -923,13 +871,7 @@
         <w:pStyle w:val="Heading2"/>
       </w:pPr>
       <w:r>
-        <w:t>3.3 Task 3: Collision Search Timing</w:t>
-      </w:r>
-    </w:p>
-    <w:p>
-      <w:pPr/>
-      <w:r>
-        <w:t>Selected results, time in ms. CPU and OMP entries are blank where the bit width exceeds the memory budget for the unordered_map approach.</w:t>
+        <w:t>3.3 Task 3: Collision Search</w:t>
       </w:r>
     </w:p>
     <w:tbl>
@@ -1021,7 +963,7 @@
               <w:rPr>
                 <w:b/>
               </w:rPr>
-              <w:t>GPU/CPU Speedup</w:t>
+              <w:t>GPU/CPU</w:t>
             </w:r>
           </w:p>
         </w:tc>
@@ -1398,80 +1340,216 @@
           </w:p>
         </w:tc>
       </w:tr>
-      <w:tr>
-        <w:tc>
-          <w:tcPr>
-            <w:tcW w:type="dxa" w:w="1440"/>
-          </w:tcPr>
-          <w:p>
-            <w:r>
-              <w:t>SHA-256</w:t>
-            </w:r>
-          </w:p>
-        </w:tc>
-        <w:tc>
-          <w:tcPr>
-            <w:tcW w:type="dxa" w:w="1440"/>
-          </w:tcPr>
-          <w:p>
-            <w:r>
-              <w:t>64</w:t>
-            </w:r>
-          </w:p>
-        </w:tc>
-        <w:tc>
-          <w:tcPr>
-            <w:tcW w:type="dxa" w:w="1440"/>
-          </w:tcPr>
-          <w:p>
-            <w:r>
-              <w:t>n/a</w:t>
-            </w:r>
-          </w:p>
-        </w:tc>
-        <w:tc>
-          <w:tcPr>
-            <w:tcW w:type="dxa" w:w="1440"/>
-          </w:tcPr>
-          <w:p>
-            <w:r>
-              <w:t>n/a</w:t>
-            </w:r>
-          </w:p>
-        </w:tc>
-        <w:tc>
-          <w:tcPr>
-            <w:tcW w:type="dxa" w:w="1440"/>
-          </w:tcPr>
-          <w:p>
-            <w:r>
-              <w:t>7,585</w:t>
-            </w:r>
-          </w:p>
-        </w:tc>
-        <w:tc>
-          <w:tcPr>
-            <w:tcW w:type="dxa" w:w="1440"/>
-          </w:tcPr>
-          <w:p>
-            <w:r>
-              <w:t>n/a</w:t>
-            </w:r>
-          </w:p>
-        </w:tc>
-      </w:tr>
     </w:tbl>
     <w:p/>
     <w:p>
-      <w:pPr/>
+      <w:pPr>
+        <w:jc w:val="center"/>
+      </w:pPr>
       <w:r>
-        <w:t>GPU speedup over CPU serial grows dramatically with bit width, from sub-1x at bits=32 (where GPU overhead dominates the small search space) to 31x to 260x at bits=56. At bits=64 and bits=72 only the GPU runs, because CPU memory requirements (roughly 100 GB for bits=64 with unordered_map) make CPU collision search infeasible on available hardware. The OMP implementation achieves only 1.5x to 2.1x speedup over serial at bits=56, limited by the serial merge phase (Amdahl's Law) and NUMA penalties. The birthday paradox is validated by the CPU data: cpu_count divided by expected is consistently within a factor of 1 to 2 of 1.0 for all algorithms and bit widths. Plots: Final/Data/task3/task3_time.pdf, task3_speedup.pdf, task3_birthday.pdf.</w:t>
+        <w:drawing>
+          <wp:inline xmlns:a="http://schemas.openxmlformats.org/drawingml/2006/main" xmlns:pic="http://schemas.openxmlformats.org/drawingml/2006/picture">
+            <wp:extent cx="5486400" cy="1959429"/>
+            <wp:docPr id="3" name="Picture 3"/>
+            <wp:cNvGraphicFramePr>
+              <a:graphicFrameLocks noChangeAspect="1"/>
+            </wp:cNvGraphicFramePr>
+            <a:graphic>
+              <a:graphicData uri="http://schemas.openxmlformats.org/drawingml/2006/picture">
+                <pic:pic>
+                  <pic:nvPicPr>
+                    <pic:cNvPr id="0" name="task3_time.png"/>
+                    <pic:cNvPicPr/>
+                  </pic:nvPicPr>
+                  <pic:blipFill>
+                    <a:blip r:embed="rId11"/>
+                    <a:stretch>
+                      <a:fillRect/>
+                    </a:stretch>
+                  </pic:blipFill>
+                  <pic:spPr>
+                    <a:xfrm>
+                      <a:off x="0" y="0"/>
+                      <a:ext cx="5486400" cy="1959429"/>
+                    </a:xfrm>
+                    <a:prstGeom prst="rect"/>
+                  </pic:spPr>
+                </pic:pic>
+              </a:graphicData>
+            </a:graphic>
+          </wp:inline>
+        </w:drawing>
+      </w:r>
+    </w:p>
+    <w:p>
+      <w:pPr>
+        <w:jc w:val="center"/>
+      </w:pPr>
+      <w:r>
+        <w:rPr>
+          <w:i/>
+          <w:sz w:val="20"/>
+        </w:rPr>
+        <w:t>Figure 3. Time to find a collision vs truncated bit width. GPU is the only implementation viable at bits &gt;= 64.</w:t>
+      </w:r>
+    </w:p>
+    <w:p>
+      <w:pPr>
+        <w:jc w:val="center"/>
+      </w:pPr>
+      <w:r>
+        <w:drawing>
+          <wp:inline xmlns:a="http://schemas.openxmlformats.org/drawingml/2006/main" xmlns:pic="http://schemas.openxmlformats.org/drawingml/2006/picture">
+            <wp:extent cx="5486400" cy="1959429"/>
+            <wp:docPr id="4" name="Picture 4"/>
+            <wp:cNvGraphicFramePr>
+              <a:graphicFrameLocks noChangeAspect="1"/>
+            </wp:cNvGraphicFramePr>
+            <a:graphic>
+              <a:graphicData uri="http://schemas.openxmlformats.org/drawingml/2006/picture">
+                <pic:pic>
+                  <pic:nvPicPr>
+                    <pic:cNvPr id="0" name="task3_speedup.png"/>
+                    <pic:cNvPicPr/>
+                  </pic:nvPicPr>
+                  <pic:blipFill>
+                    <a:blip r:embed="rId12"/>
+                    <a:stretch>
+                      <a:fillRect/>
+                    </a:stretch>
+                  </pic:blipFill>
+                  <pic:spPr>
+                    <a:xfrm>
+                      <a:off x="0" y="0"/>
+                      <a:ext cx="5486400" cy="1959429"/>
+                    </a:xfrm>
+                    <a:prstGeom prst="rect"/>
+                  </pic:spPr>
+                </pic:pic>
+              </a:graphicData>
+            </a:graphic>
+          </wp:inline>
+        </w:drawing>
+      </w:r>
+    </w:p>
+    <w:p>
+      <w:pPr>
+        <w:jc w:val="center"/>
+      </w:pPr>
+      <w:r>
+        <w:rPr>
+          <w:i/>
+          <w:sz w:val="20"/>
+        </w:rPr>
+        <w:t>Figure 4. GPU and OpenMP speedup over CPU serial. The GPU advantage grows with bit width.</w:t>
+      </w:r>
+    </w:p>
+    <w:p>
+      <w:pPr>
+        <w:jc w:val="center"/>
+      </w:pPr>
+      <w:r>
+        <w:drawing>
+          <wp:inline xmlns:a="http://schemas.openxmlformats.org/drawingml/2006/main" xmlns:pic="http://schemas.openxmlformats.org/drawingml/2006/picture">
+            <wp:extent cx="5486400" cy="1959429"/>
+            <wp:docPr id="5" name="Picture 5"/>
+            <wp:cNvGraphicFramePr>
+              <a:graphicFrameLocks noChangeAspect="1"/>
+            </wp:cNvGraphicFramePr>
+            <a:graphic>
+              <a:graphicData uri="http://schemas.openxmlformats.org/drawingml/2006/picture">
+                <pic:pic>
+                  <pic:nvPicPr>
+                    <pic:cNvPr id="0" name="task3_birthday.png"/>
+                    <pic:cNvPicPr/>
+                  </pic:nvPicPr>
+                  <pic:blipFill>
+                    <a:blip r:embed="rId13"/>
+                    <a:stretch>
+                      <a:fillRect/>
+                    </a:stretch>
+                  </pic:blipFill>
+                  <pic:spPr>
+                    <a:xfrm>
+                      <a:off x="0" y="0"/>
+                      <a:ext cx="5486400" cy="1959429"/>
+                    </a:xfrm>
+                    <a:prstGeom prst="rect"/>
+                  </pic:spPr>
+                </pic:pic>
+              </a:graphicData>
+            </a:graphic>
+          </wp:inline>
+        </w:drawing>
+      </w:r>
+    </w:p>
+    <w:p>
+      <w:pPr>
+        <w:jc w:val="center"/>
+      </w:pPr>
+      <w:r>
+        <w:rPr>
+          <w:i/>
+          <w:sz w:val="20"/>
+        </w:rPr>
+        <w:t>Figure 5. Birthday-paradox validation: cpu_count divided by expected count. Ratios near 1.0 confirm correct truncated-hash extraction.</w:t>
       </w:r>
     </w:p>
     <w:p>
       <w:pPr/>
       <w:r>
-        <w:t>The OMP thread-count scaling experiment (Final/Data/task3/omp_scaling.dat) confirmed the 12-thread sweet spot. Speedup peaks at 12 and degrades beyond that due to NUMA penalties on the dual-socket Euler node. Plot: Final/Data/task3/omp_scaling_speedup.pdf.</w:t>
+        <w:t>GPU speedup grows with bit width because CPU memory requirements scale as 2^(N/2) while the GPU's Pollard's rho uses O(1) memory per thread. OpenMP only achieves 1.5x to 2.1x at bits=56 because Phase 2 (the serial merge) becomes the bottleneck and NUMA penalties hit beyond a single socket.</w:t>
+      </w:r>
+    </w:p>
+    <w:p>
+      <w:pPr>
+        <w:jc w:val="center"/>
+      </w:pPr>
+      <w:r>
+        <w:drawing>
+          <wp:inline xmlns:a="http://schemas.openxmlformats.org/drawingml/2006/main" xmlns:pic="http://schemas.openxmlformats.org/drawingml/2006/picture">
+            <wp:extent cx="5486400" cy="3429000"/>
+            <wp:docPr id="6" name="Picture 6"/>
+            <wp:cNvGraphicFramePr>
+              <a:graphicFrameLocks noChangeAspect="1"/>
+            </wp:cNvGraphicFramePr>
+            <a:graphic>
+              <a:graphicData uri="http://schemas.openxmlformats.org/drawingml/2006/picture">
+                <pic:pic>
+                  <pic:nvPicPr>
+                    <pic:cNvPr id="0" name="omp_scaling_speedup.png"/>
+                    <pic:cNvPicPr/>
+                  </pic:nvPicPr>
+                  <pic:blipFill>
+                    <a:blip r:embed="rId14"/>
+                    <a:stretch>
+                      <a:fillRect/>
+                    </a:stretch>
+                  </pic:blipFill>
+                  <pic:spPr>
+                    <a:xfrm>
+                      <a:off x="0" y="0"/>
+                      <a:ext cx="5486400" cy="3429000"/>
+                    </a:xfrm>
+                    <a:prstGeom prst="rect"/>
+                  </pic:spPr>
+                </pic:pic>
+              </a:graphicData>
+            </a:graphic>
+          </wp:inline>
+        </w:drawing>
+      </w:r>
+    </w:p>
+    <w:p>
+      <w:pPr>
+        <w:jc w:val="center"/>
+      </w:pPr>
+      <w:r>
+        <w:rPr>
+          <w:i/>
+          <w:sz w:val="20"/>
+        </w:rPr>
+        <w:t>Figure 6. OpenMP speedup vs thread count. Peak at 12 threads (single socket); degradation past 12 due to NUMA boundary and serial-merge ceiling.</w:t>
       </w:r>
     </w:p>
     <w:p>
@@ -1479,815 +1557,178 @@
         <w:pStyle w:val="Heading2"/>
       </w:pPr>
       <w:r>
-        <w:t>3.4 Task 4: GPU Algorithm Comparison (Thrust Sort vs Pollard's Rho)</w:t>
+        <w:t>3.4 Task 4: GPU Algorithm Comparison</w:t>
+      </w:r>
+    </w:p>
+    <w:p>
+      <w:pPr>
+        <w:jc w:val="center"/>
+      </w:pPr>
+      <w:r>
+        <w:drawing>
+          <wp:inline xmlns:a="http://schemas.openxmlformats.org/drawingml/2006/main" xmlns:pic="http://schemas.openxmlformats.org/drawingml/2006/picture">
+            <wp:extent cx="5486400" cy="1828800"/>
+            <wp:docPr id="7" name="Picture 7"/>
+            <wp:cNvGraphicFramePr>
+              <a:graphicFrameLocks noChangeAspect="1"/>
+            </wp:cNvGraphicFramePr>
+            <a:graphic>
+              <a:graphicData uri="http://schemas.openxmlformats.org/drawingml/2006/picture">
+                <pic:pic>
+                  <pic:nvPicPr>
+                    <pic:cNvPr id="0" name="task4_compare.png"/>
+                    <pic:cNvPicPr/>
+                  </pic:nvPicPr>
+                  <pic:blipFill>
+                    <a:blip r:embed="rId15"/>
+                    <a:stretch>
+                      <a:fillRect/>
+                    </a:stretch>
+                  </pic:blipFill>
+                  <pic:spPr>
+                    <a:xfrm>
+                      <a:off x="0" y="0"/>
+                      <a:ext cx="5486400" cy="1828800"/>
+                    </a:xfrm>
+                    <a:prstGeom prst="rect"/>
+                  </pic:spPr>
+                </pic:pic>
+              </a:graphicData>
+            </a:graphic>
+          </wp:inline>
+        </w:drawing>
+      </w:r>
+    </w:p>
+    <w:p>
+      <w:pPr>
+        <w:jc w:val="center"/>
+      </w:pPr>
+      <w:r>
+        <w:rPr>
+          <w:i/>
+          <w:sz w:val="20"/>
+        </w:rPr>
+        <w:t>Figure 7. Time vs bits for Pollard's rho, Thrust device-mode, and Thrust unified-mode. Thrust device wins where it can run; Thrust unified extends to bits=56 by spilling to host RAM.</w:t>
       </w:r>
     </w:p>
     <w:p>
       <w:pPr/>
       <w:r>
-        <w:t>Task 4 implements an alternative GPU collision search using thrust::sort_by_key to compare against Task 3's Pollard's rho. The algorithm is three-phase: hash a batch of inputs into device arrays, sort by hash key, then scan for the first adjacent equal-hash pair. It is fully GPU-resident with no CPU-side merge phase. Two memory modes are tested:</w:t>
+        <w:t>At bits &lt;= 48, Thrust device-mode is fastest absolute (5x to 35x over Pollard's rho). The two algorithms become comparable at bits=52, and at bits=56 they fall into the same performance class. Pollard's rho is the only viable algorithm at bits &gt;= 64.</w:t>
       </w:r>
     </w:p>
     <w:p>
       <w:pPr>
-        <w:pStyle w:val="ListBullet"/>
+        <w:jc w:val="center"/>
       </w:pPr>
       <w:r>
-        <w:t>Device mode (cudaMalloc): pure VRAM. Capped at bits=48 because the sort working set (4x expected, times 16 bytes) plus Thrust scratch saturates 8 GB GPU memory at bits 52 and above.</w:t>
+        <w:drawing>
+          <wp:inline xmlns:a="http://schemas.openxmlformats.org/drawingml/2006/main" xmlns:pic="http://schemas.openxmlformats.org/drawingml/2006/picture">
+            <wp:extent cx="5486400" cy="3048000"/>
+            <wp:docPr id="8" name="Picture 8"/>
+            <wp:cNvGraphicFramePr>
+              <a:graphicFrameLocks noChangeAspect="1"/>
+            </wp:cNvGraphicFramePr>
+            <a:graphic>
+              <a:graphicData uri="http://schemas.openxmlformats.org/drawingml/2006/picture">
+                <pic:pic>
+                  <pic:nvPicPr>
+                    <pic:cNvPr id="0" name="task4_overhead.png"/>
+                    <pic:cNvPicPr/>
+                  </pic:nvPicPr>
+                  <pic:blipFill>
+                    <a:blip r:embed="rId16"/>
+                    <a:stretch>
+                      <a:fillRect/>
+                    </a:stretch>
+                  </pic:blipFill>
+                  <pic:spPr>
+                    <a:xfrm>
+                      <a:off x="0" y="0"/>
+                      <a:ext cx="5486400" cy="3048000"/>
+                    </a:xfrm>
+                    <a:prstGeom prst="rect"/>
+                  </pic:spPr>
+                </pic:pic>
+              </a:graphicData>
+            </a:graphic>
+          </wp:inline>
+        </w:drawing>
       </w:r>
     </w:p>
     <w:p>
       <w:pPr>
-        <w:pStyle w:val="ListBullet"/>
+        <w:jc w:val="center"/>
       </w:pPr>
       <w:r>
-        <w:t>Unified memory mode (cudaMallocManaged): the buffers are visible to both GPU and host, with pages migrating across PCIe on demand. This lets us push the sweep to bits=52 and bits=56, where the working set spills into host RAM (--mem=96G) rather than OOMing. The cost is PCIe-bound performance during the sort.</w:t>
+        <w:rPr>
+          <w:i/>
+          <w:sz w:val="20"/>
+        </w:rPr>
+        <w:t>Figure 8. Unified vs device memory overhead at bits where the working set still fits in VRAM. The page-tracking driver tax is a consistent 2x to 2.4x.</w:t>
       </w:r>
     </w:p>
     <w:p>
       <w:pPr/>
       <w:r>
-        <w:t>An adaptive over-allocation factor controls the per-round retry rate: 4x expected for bits up to 48 (one-shot), 2x for bits=52, and 1x for bits=56 (about 2 rounds on average to find a collision).</w:t>
+        <w:t>Even with no spilling, unified memory has a real cost from CUDA's page-residency tracking. Unified memory is a tool for oversubscription, not a free abstraction.</w:t>
+      </w:r>
+    </w:p>
+    <w:p>
+      <w:pPr>
+        <w:jc w:val="center"/>
+      </w:pPr>
+      <w:r>
+        <w:drawing>
+          <wp:inline xmlns:a="http://schemas.openxmlformats.org/drawingml/2006/main" xmlns:pic="http://schemas.openxmlformats.org/drawingml/2006/picture">
+            <wp:extent cx="5486400" cy="1959429"/>
+            <wp:docPr id="9" name="Picture 9"/>
+            <wp:cNvGraphicFramePr>
+              <a:graphicFrameLocks noChangeAspect="1"/>
+            </wp:cNvGraphicFramePr>
+            <a:graphic>
+              <a:graphicData uri="http://schemas.openxmlformats.org/drawingml/2006/picture">
+                <pic:pic>
+                  <pic:nvPicPr>
+                    <pic:cNvPr id="0" name="task4_trial_spread.png"/>
+                    <pic:cNvPicPr/>
+                  </pic:nvPicPr>
+                  <pic:blipFill>
+                    <a:blip r:embed="rId17"/>
+                    <a:stretch>
+                      <a:fillRect/>
+                    </a:stretch>
+                  </pic:blipFill>
+                  <pic:spPr>
+                    <a:xfrm>
+                      <a:off x="0" y="0"/>
+                      <a:ext cx="5486400" cy="1959429"/>
+                    </a:xfrm>
+                    <a:prstGeom prst="rect"/>
+                  </pic:spPr>
+                </pic:pic>
+              </a:graphicData>
+            </a:graphic>
+          </wp:inline>
+        </w:drawing>
+      </w:r>
+    </w:p>
+    <w:p>
+      <w:pPr>
+        <w:jc w:val="center"/>
+      </w:pPr>
+      <w:r>
+        <w:rPr>
+          <w:i/>
+          <w:sz w:val="20"/>
+        </w:rPr>
+        <w:t>Figure 9. Per-trial spread at bits=52 and bits=56 (10 trials each). The green dashed line is Pollard's rho's deterministic time. Thrust unified has high variance from the geometric retry distribution.</w:t>
       </w:r>
     </w:p>
     <w:p>
       <w:pPr/>
       <w:r>
-        <w:t>Code: Final/Code/task4.cu, which uses gpu_hashes_narrow.cuh for shared device hash functions. Output: Final/Data/task4/scaling_task4_device.dat and scaling_task4_unified.dat. Plots: task4_compare.pdf, task4_overhead.pdf, task4_trial_spread.pdf, task4_speedup.pdf.</w:t>
-      </w:r>
-    </w:p>
-    <w:p>
-      <w:pPr>
-        <w:pStyle w:val="Heading2"/>
-      </w:pPr>
-      <w:r>
-        <w:t>3.4.1 Methodology: Why Multiple Trials Matter</w:t>
-      </w:r>
-    </w:p>
-    <w:p>
-      <w:pPr/>
-      <w:r>
-        <w:t>Initial Task 4 results were single-trial, which produced misleading conclusions. The birthday-paradox-driven retry distribution (geometric) has variance comparable to its mean. At bits=56 with 1x over-allocation, a single run can take anywhere from 1 to 6 or more rounds depending purely on which input value happens to collide first. I re-ran with 10 trials per configuration in both device and unified modes and report median with IQR error bars. Device mode also has small variance: about a 1.8% miss rate at 4x allocation, plus 5% to 10% jitter from GPU clock boost and kernel launch overhead. Since device-mode trials are sub-second, repetition is essentially free. Pollard's rho is essentially deterministic given fixed seeds and thread scheduling, so a single trial suffices for Task 3 comparisons.</w:t>
-      </w:r>
-    </w:p>
-    <w:p>
-      <w:pPr>
-        <w:pStyle w:val="Heading2"/>
-      </w:pPr>
-      <w:r>
-        <w:t>3.4.2 Finding: Unified Memory Has Real but Variable Overhead at Small Bits</w:t>
-      </w:r>
-    </w:p>
-    <w:p>
-      <w:pPr/>
-      <w:r>
-        <w:t>Comparing unified vs device mode at bit widths where the working set fits in 8 GB VRAM (no page migration required):</w:t>
-      </w:r>
-    </w:p>
-    <w:tbl>
-      <w:tblPr>
-        <w:tblStyle w:val="TableGrid"/>
-        <w:tblW w:type="auto" w:w="0"/>
-        <w:tblLook w:firstColumn="1" w:firstRow="1" w:lastColumn="0" w:lastRow="0" w:noHBand="0" w:noVBand="1" w:val="04A0"/>
-      </w:tblPr>
-      <w:tblGrid>
-        <w:gridCol w:w="2160"/>
-        <w:gridCol w:w="2160"/>
-        <w:gridCol w:w="2160"/>
-        <w:gridCol w:w="2160"/>
-      </w:tblGrid>
-      <w:tr>
-        <w:tc>
-          <w:tcPr>
-            <w:tcW w:type="dxa" w:w="2160"/>
-          </w:tcPr>
-          <w:p>
-            <w:r>
-              <w:rPr>
-                <w:b/>
-              </w:rPr>
-              <w:t>bits</w:t>
-            </w:r>
-          </w:p>
-        </w:tc>
-        <w:tc>
-          <w:tcPr>
-            <w:tcW w:type="dxa" w:w="2160"/>
-          </w:tcPr>
-          <w:p>
-            <w:r>
-              <w:rPr>
-                <w:b/>
-              </w:rPr>
-              <w:t>MD5 unified/device</w:t>
-            </w:r>
-          </w:p>
-        </w:tc>
-        <w:tc>
-          <w:tcPr>
-            <w:tcW w:type="dxa" w:w="2160"/>
-          </w:tcPr>
-          <w:p>
-            <w:r>
-              <w:rPr>
-                <w:b/>
-              </w:rPr>
-              <w:t>SHA-1 unified/device</w:t>
-            </w:r>
-          </w:p>
-        </w:tc>
-        <w:tc>
-          <w:tcPr>
-            <w:tcW w:type="dxa" w:w="2160"/>
-          </w:tcPr>
-          <w:p>
-            <w:r>
-              <w:rPr>
-                <w:b/>
-              </w:rPr>
-              <w:t>SHA-256 unified/device</w:t>
-            </w:r>
-          </w:p>
-        </w:tc>
-      </w:tr>
-      <w:tr>
-        <w:tc>
-          <w:tcPr>
-            <w:tcW w:type="dxa" w:w="2160"/>
-          </w:tcPr>
-          <w:p>
-            <w:r>
-              <w:t>24</w:t>
-            </w:r>
-          </w:p>
-        </w:tc>
-        <w:tc>
-          <w:tcPr>
-            <w:tcW w:type="dxa" w:w="2160"/>
-          </w:tcPr>
-          <w:p>
-            <w:r>
-              <w:t>3.7x</w:t>
-            </w:r>
-          </w:p>
-        </w:tc>
-        <w:tc>
-          <w:tcPr>
-            <w:tcW w:type="dxa" w:w="2160"/>
-          </w:tcPr>
-          <w:p>
-            <w:r>
-              <w:t>4.0x</w:t>
-            </w:r>
-          </w:p>
-        </w:tc>
-        <w:tc>
-          <w:tcPr>
-            <w:tcW w:type="dxa" w:w="2160"/>
-          </w:tcPr>
-          <w:p>
-            <w:r>
-              <w:t>3.7x</w:t>
-            </w:r>
-          </w:p>
-        </w:tc>
-      </w:tr>
-      <w:tr>
-        <w:tc>
-          <w:tcPr>
-            <w:tcW w:type="dxa" w:w="2160"/>
-          </w:tcPr>
-          <w:p>
-            <w:r>
-              <w:t>32</w:t>
-            </w:r>
-          </w:p>
-        </w:tc>
-        <w:tc>
-          <w:tcPr>
-            <w:tcW w:type="dxa" w:w="2160"/>
-          </w:tcPr>
-          <w:p>
-            <w:r>
-              <w:t>2.3x</w:t>
-            </w:r>
-          </w:p>
-        </w:tc>
-        <w:tc>
-          <w:tcPr>
-            <w:tcW w:type="dxa" w:w="2160"/>
-          </w:tcPr>
-          <w:p>
-            <w:r>
-              <w:t>0.6x *</w:t>
-            </w:r>
-          </w:p>
-        </w:tc>
-        <w:tc>
-          <w:tcPr>
-            <w:tcW w:type="dxa" w:w="2160"/>
-          </w:tcPr>
-          <w:p>
-            <w:r>
-              <w:t>0.6x *</w:t>
-            </w:r>
-          </w:p>
-        </w:tc>
-      </w:tr>
-      <w:tr>
-        <w:tc>
-          <w:tcPr>
-            <w:tcW w:type="dxa" w:w="2160"/>
-          </w:tcPr>
-          <w:p>
-            <w:r>
-              <w:t>40</w:t>
-            </w:r>
-          </w:p>
-        </w:tc>
-        <w:tc>
-          <w:tcPr>
-            <w:tcW w:type="dxa" w:w="2160"/>
-          </w:tcPr>
-          <w:p>
-            <w:r>
-              <w:t>2.2x</w:t>
-            </w:r>
-          </w:p>
-        </w:tc>
-        <w:tc>
-          <w:tcPr>
-            <w:tcW w:type="dxa" w:w="2160"/>
-          </w:tcPr>
-          <w:p>
-            <w:r>
-              <w:t>1.6x</w:t>
-            </w:r>
-          </w:p>
-        </w:tc>
-        <w:tc>
-          <w:tcPr>
-            <w:tcW w:type="dxa" w:w="2160"/>
-          </w:tcPr>
-          <w:p>
-            <w:r>
-              <w:t>1.8x</w:t>
-            </w:r>
-          </w:p>
-        </w:tc>
-      </w:tr>
-      <w:tr>
-        <w:tc>
-          <w:tcPr>
-            <w:tcW w:type="dxa" w:w="2160"/>
-          </w:tcPr>
-          <w:p>
-            <w:r>
-              <w:t>48</w:t>
-            </w:r>
-          </w:p>
-        </w:tc>
-        <w:tc>
-          <w:tcPr>
-            <w:tcW w:type="dxa" w:w="2160"/>
-          </w:tcPr>
-          <w:p>
-            <w:r>
-              <w:t>2.0x</w:t>
-            </w:r>
-          </w:p>
-        </w:tc>
-        <w:tc>
-          <w:tcPr>
-            <w:tcW w:type="dxa" w:w="2160"/>
-          </w:tcPr>
-          <w:p>
-            <w:r>
-              <w:t>2.3x</w:t>
-            </w:r>
-          </w:p>
-        </w:tc>
-        <w:tc>
-          <w:tcPr>
-            <w:tcW w:type="dxa" w:w="2160"/>
-          </w:tcPr>
-          <w:p>
-            <w:r>
-              <w:t>2.4x</w:t>
-            </w:r>
-          </w:p>
-        </w:tc>
-      </w:tr>
-    </w:tbl>
-    <w:p/>
-    <w:p>
-      <w:pPr/>
-      <w:r>
-        <w:t>* SHA-1 and SHA-256 at bits=32 are sub-millisecond; the ratio is dominated by measurement noise. At meaningful problem sizes (bits=48) the page-tracking overhead is consistently 2.0x to 2.4x. The takeaway: Unified Memory has a real 2x tax even with no spilling. It is a tool for oversubscription, not a free abstraction.</w:t>
-      </w:r>
-    </w:p>
-    <w:p>
-      <w:pPr>
-        <w:pStyle w:val="Heading2"/>
-      </w:pPr>
-      <w:r>
-        <w:t>3.4.3 Finding: Per-round Thrust Beats Pollard's Rho, Total Time Depends on Retry Luck</w:t>
-      </w:r>
-    </w:p>
-    <w:p>
-      <w:pPr/>
-      <w:r>
-        <w:t>At bits=56 the comparison against Pollard's rho is more nuanced than single-trial data suggested:</w:t>
-      </w:r>
-    </w:p>
-    <w:tbl>
-      <w:tblPr>
-        <w:tblStyle w:val="TableGrid"/>
-        <w:tblW w:type="auto" w:w="0"/>
-        <w:tblLook w:firstColumn="1" w:firstRow="1" w:lastColumn="0" w:lastRow="0" w:noHBand="0" w:noVBand="1" w:val="04A0"/>
-      </w:tblPr>
-      <w:tblGrid>
-        <w:gridCol w:w="1728"/>
-        <w:gridCol w:w="1728"/>
-        <w:gridCol w:w="1728"/>
-        <w:gridCol w:w="1728"/>
-        <w:gridCol w:w="1728"/>
-      </w:tblGrid>
-      <w:tr>
-        <w:tc>
-          <w:tcPr>
-            <w:tcW w:type="dxa" w:w="1728"/>
-          </w:tcPr>
-          <w:p>
-            <w:r>
-              <w:rPr>
-                <w:b/>
-              </w:rPr>
-              <w:t>Algorithm (bits=56)</w:t>
-            </w:r>
-          </w:p>
-        </w:tc>
-        <w:tc>
-          <w:tcPr>
-            <w:tcW w:type="dxa" w:w="1728"/>
-          </w:tcPr>
-          <w:p>
-            <w:r>
-              <w:rPr>
-                <w:b/>
-              </w:rPr>
-              <w:t>Pollard's rho (ms)</w:t>
-            </w:r>
-          </w:p>
-        </w:tc>
-        <w:tc>
-          <w:tcPr>
-            <w:tcW w:type="dxa" w:w="1728"/>
-          </w:tcPr>
-          <w:p>
-            <w:r>
-              <w:rPr>
-                <w:b/>
-              </w:rPr>
-              <w:t>Thrust uni total (ms)</w:t>
-            </w:r>
-          </w:p>
-        </w:tc>
-        <w:tc>
-          <w:tcPr>
-            <w:tcW w:type="dxa" w:w="1728"/>
-          </w:tcPr>
-          <w:p>
-            <w:r>
-              <w:rPr>
-                <w:b/>
-              </w:rPr>
-              <w:t>rounds</w:t>
-            </w:r>
-          </w:p>
-        </w:tc>
-        <w:tc>
-          <w:tcPr>
-            <w:tcW w:type="dxa" w:w="1728"/>
-          </w:tcPr>
-          <w:p>
-            <w:r>
-              <w:rPr>
-                <w:b/>
-              </w:rPr>
-              <w:t>per-round (ms)</w:t>
-            </w:r>
-          </w:p>
-        </w:tc>
-      </w:tr>
-      <w:tr>
-        <w:tc>
-          <w:tcPr>
-            <w:tcW w:type="dxa" w:w="1728"/>
-          </w:tcPr>
-          <w:p>
-            <w:r>
-              <w:t>MD5</w:t>
-            </w:r>
-          </w:p>
-        </w:tc>
-        <w:tc>
-          <w:tcPr>
-            <w:tcW w:type="dxa" w:w="1728"/>
-          </w:tcPr>
-          <w:p>
-            <w:r>
-              <w:t>2,133</w:t>
-            </w:r>
-          </w:p>
-        </w:tc>
-        <w:tc>
-          <w:tcPr>
-            <w:tcW w:type="dxa" w:w="1728"/>
-          </w:tcPr>
-          <w:p>
-            <w:r>
-              <w:t>3,359</w:t>
-            </w:r>
-          </w:p>
-        </w:tc>
-        <w:tc>
-          <w:tcPr>
-            <w:tcW w:type="dxa" w:w="1728"/>
-          </w:tcPr>
-          <w:p>
-            <w:r>
-              <w:t>6.0</w:t>
-            </w:r>
-          </w:p>
-        </w:tc>
-        <w:tc>
-          <w:tcPr>
-            <w:tcW w:type="dxa" w:w="1728"/>
-          </w:tcPr>
-          <w:p>
-            <w:r>
-              <w:t>560</w:t>
-            </w:r>
-          </w:p>
-        </w:tc>
-      </w:tr>
-      <w:tr>
-        <w:tc>
-          <w:tcPr>
-            <w:tcW w:type="dxa" w:w="1728"/>
-          </w:tcPr>
-          <w:p>
-            <w:r>
-              <w:t>SHA-1</w:t>
-            </w:r>
-          </w:p>
-        </w:tc>
-        <w:tc>
-          <w:tcPr>
-            <w:tcW w:type="dxa" w:w="1728"/>
-          </w:tcPr>
-          <w:p>
-            <w:r>
-              <w:t>2,375</w:t>
-            </w:r>
-          </w:p>
-        </w:tc>
-        <w:tc>
-          <w:tcPr>
-            <w:tcW w:type="dxa" w:w="1728"/>
-          </w:tcPr>
-          <w:p>
-            <w:r>
-              <w:t>1,161</w:t>
-            </w:r>
-          </w:p>
-        </w:tc>
-        <w:tc>
-          <w:tcPr>
-            <w:tcW w:type="dxa" w:w="1728"/>
-          </w:tcPr>
-          <w:p>
-            <w:r>
-              <w:t>1.0</w:t>
-            </w:r>
-          </w:p>
-        </w:tc>
-        <w:tc>
-          <w:tcPr>
-            <w:tcW w:type="dxa" w:w="1728"/>
-          </w:tcPr>
-          <w:p>
-            <w:r>
-              <w:t>1,161</w:t>
-            </w:r>
-          </w:p>
-        </w:tc>
-      </w:tr>
-      <w:tr>
-        <w:tc>
-          <w:tcPr>
-            <w:tcW w:type="dxa" w:w="1728"/>
-          </w:tcPr>
-          <w:p>
-            <w:r>
-              <w:t>SHA-256</w:t>
-            </w:r>
-          </w:p>
-        </w:tc>
-        <w:tc>
-          <w:tcPr>
-            <w:tcW w:type="dxa" w:w="1728"/>
-          </w:tcPr>
-          <w:p>
-            <w:r>
-              <w:t>1,930</w:t>
-            </w:r>
-          </w:p>
-        </w:tc>
-        <w:tc>
-          <w:tcPr>
-            <w:tcW w:type="dxa" w:w="1728"/>
-          </w:tcPr>
-          <w:p>
-            <w:r>
-              <w:t>1,951</w:t>
-            </w:r>
-          </w:p>
-        </w:tc>
-        <w:tc>
-          <w:tcPr>
-            <w:tcW w:type="dxa" w:w="1728"/>
-          </w:tcPr>
-          <w:p>
-            <w:r>
-              <w:t>3.0</w:t>
-            </w:r>
-          </w:p>
-        </w:tc>
-        <w:tc>
-          <w:tcPr>
-            <w:tcW w:type="dxa" w:w="1728"/>
-          </w:tcPr>
-          <w:p>
-            <w:r>
-              <w:t>650</w:t>
-            </w:r>
-          </w:p>
-        </w:tc>
-      </w:tr>
-    </w:tbl>
-    <w:p/>
-    <w:p>
-      <w:pPr/>
-      <w:r>
-        <w:t>Per-round Thrust unified time (560 to 1,161 ms) is consistently faster than Pollard's rho's deterministic single-run time (1,930 to 2,375 ms). However, total wall time depends on how many retry rounds are needed. SHA-1 got lucky in 1 round and was 2x faster than Pollard. MD5 needed 6 rounds and was 1.6x slower. SHA-256 needed 3 rounds and tied. The 10-trial median (see task4_trial_spread.pdf) collapses this variance and shows the two algorithms are in the same performance class at bits=56. Pollard's advantage is determinism, not raw speed.</w:t>
-      </w:r>
-    </w:p>
-    <w:p>
-      <w:pPr>
-        <w:pStyle w:val="Heading2"/>
-      </w:pPr>
-      <w:r>
-        <w:t>3.4.4 Finding: PCIe Spill Boundary is Sharp at bits 52→56</w:t>
-      </w:r>
-    </w:p>
-    <w:tbl>
-      <w:tblPr>
-        <w:tblStyle w:val="TableGrid"/>
-        <w:tblW w:type="auto" w:w="0"/>
-        <w:tblLook w:firstColumn="1" w:firstRow="1" w:lastColumn="0" w:lastRow="0" w:noHBand="0" w:noVBand="1" w:val="04A0"/>
-      </w:tblPr>
-      <w:tblGrid>
-        <w:gridCol w:w="2160"/>
-        <w:gridCol w:w="2160"/>
-        <w:gridCol w:w="2160"/>
-        <w:gridCol w:w="2160"/>
-      </w:tblGrid>
-      <w:tr>
-        <w:tc>
-          <w:tcPr>
-            <w:tcW w:type="dxa" w:w="2160"/>
-          </w:tcPr>
-          <w:p>
-            <w:r>
-              <w:rPr>
-                <w:b/>
-              </w:rPr>
-              <w:t>bits</w:t>
-            </w:r>
-          </w:p>
-        </w:tc>
-        <w:tc>
-          <w:tcPr>
-            <w:tcW w:type="dxa" w:w="2160"/>
-          </w:tcPr>
-          <w:p>
-            <w:r>
-              <w:rPr>
-                <w:b/>
-              </w:rPr>
-              <w:t>MD5 unified median (ms)</w:t>
-            </w:r>
-          </w:p>
-        </w:tc>
-        <w:tc>
-          <w:tcPr>
-            <w:tcW w:type="dxa" w:w="2160"/>
-          </w:tcPr>
-          <w:p>
-            <w:r>
-              <w:rPr>
-                <w:b/>
-              </w:rPr>
-              <w:t>factor vs prior</w:t>
-            </w:r>
-          </w:p>
-        </w:tc>
-        <w:tc>
-          <w:tcPr>
-            <w:tcW w:type="dxa" w:w="2160"/>
-          </w:tcPr>
-          <w:p>
-            <w:r>
-              <w:rPr>
-                <w:b/>
-              </w:rPr>
-              <w:t>theoretical 2^(bits/2)x</w:t>
-            </w:r>
-          </w:p>
-        </w:tc>
-      </w:tr>
-      <w:tr>
-        <w:tc>
-          <w:tcPr>
-            <w:tcW w:type="dxa" w:w="2160"/>
-          </w:tcPr>
-          <w:p>
-            <w:r>
-              <w:t>48</w:t>
-            </w:r>
-          </w:p>
-        </w:tc>
-        <w:tc>
-          <w:tcPr>
-            <w:tcW w:type="dxa" w:w="2160"/>
-          </w:tcPr>
-          <w:p>
-            <w:r>
-              <w:t>240.9</w:t>
-            </w:r>
-          </w:p>
-        </w:tc>
-        <w:tc>
-          <w:tcPr>
-            <w:tcW w:type="dxa" w:w="2160"/>
-          </w:tcPr>
-          <w:p>
-            <w:r>
-              <w:t>n/a</w:t>
-            </w:r>
-          </w:p>
-        </w:tc>
-        <w:tc>
-          <w:tcPr>
-            <w:tcW w:type="dxa" w:w="2160"/>
-          </w:tcPr>
-          <w:p>
-            <w:r>
-              <w:t>n/a</w:t>
-            </w:r>
-          </w:p>
-        </w:tc>
-      </w:tr>
-      <w:tr>
-        <w:tc>
-          <w:tcPr>
-            <w:tcW w:type="dxa" w:w="2160"/>
-          </w:tcPr>
-          <w:p>
-            <w:r>
-              <w:t>52</w:t>
-            </w:r>
-          </w:p>
-        </w:tc>
-        <w:tc>
-          <w:tcPr>
-            <w:tcW w:type="dxa" w:w="2160"/>
-          </w:tcPr>
-          <w:p>
-            <w:r>
-              <w:t>516.4</w:t>
-            </w:r>
-          </w:p>
-        </w:tc>
-        <w:tc>
-          <w:tcPr>
-            <w:tcW w:type="dxa" w:w="2160"/>
-          </w:tcPr>
-          <w:p>
-            <w:r>
-              <w:t>2.1x</w:t>
-            </w:r>
-          </w:p>
-        </w:tc>
-        <w:tc>
-          <w:tcPr>
-            <w:tcW w:type="dxa" w:w="2160"/>
-          </w:tcPr>
-          <w:p>
-            <w:r>
-              <w:t>2.0x (still fits in VRAM)</w:t>
-            </w:r>
-          </w:p>
-        </w:tc>
-      </w:tr>
-      <w:tr>
-        <w:tc>
-          <w:tcPr>
-            <w:tcW w:type="dxa" w:w="2160"/>
-          </w:tcPr>
-          <w:p>
-            <w:r>
-              <w:t>56</w:t>
-            </w:r>
-          </w:p>
-        </w:tc>
-        <w:tc>
-          <w:tcPr>
-            <w:tcW w:type="dxa" w:w="2160"/>
-          </w:tcPr>
-          <w:p>
-            <w:r>
-              <w:t>3,359</w:t>
-            </w:r>
-          </w:p>
-        </w:tc>
-        <w:tc>
-          <w:tcPr>
-            <w:tcW w:type="dxa" w:w="2160"/>
-          </w:tcPr>
-          <w:p>
-            <w:r>
-              <w:t>6.5x</w:t>
-            </w:r>
-          </w:p>
-        </w:tc>
-        <w:tc>
-          <w:tcPr>
-            <w:tcW w:type="dxa" w:w="2160"/>
-          </w:tcPr>
-          <w:p>
-            <w:r>
-              <w:t>4.0x (extra 1.6x = PCIe spill)</w:t>
-            </w:r>
-          </w:p>
-        </w:tc>
-      </w:tr>
-    </w:tbl>
-    <w:p/>
-    <w:p>
-      <w:pPr/>
-      <w:r>
-        <w:t>From bits=48 to 52 the slowdown matches theory exactly: sort scratch still fits in VRAM. From bits=52 to 56 the extra 1.6x factor beyond theoretical scaling is the PCIe-bound sort overhead. bits=64 was attempted in unified mode with 0.5x allocation (about 34 GB working set), but every trial crashed inside thrust::sort_by_key with an allocation failure for the radix-sort temp scratch space. Thrust's internal allocator cannot satisfy that request even with 96 GB host RAM exposed via Unified Memory. Pollard's rho runs cleanly at bits=64 in 8 to 10 seconds, so the algorithmic-feasibility argument from Task 3 is reinforced empirically. At bits=64, Pollard's rho is not just faster, it is the only approach that runs at all.</w:t>
-      </w:r>
-    </w:p>
-    <w:p>
-      <w:pPr/>
-      <w:r>
-        <w:t>GPU algorithm selection guide based on measured evidence:</w:t>
-      </w:r>
-    </w:p>
-    <w:p>
-      <w:pPr>
-        <w:pStyle w:val="ListBullet"/>
-      </w:pPr>
-      <w:r>
-        <w:t>bits ≤ 48: Thrust device-mode is fastest absolute (5x to 35x over Pollard's rho)</w:t>
-      </w:r>
-    </w:p>
-    <w:p>
-      <w:pPr>
-        <w:pStyle w:val="ListBullet"/>
-      </w:pPr>
-      <w:r>
-        <w:t>bits = 52: Both Thrust modes work. Unified pays a roughly 2x tax but still beats Pollard's rho</w:t>
-      </w:r>
-    </w:p>
-    <w:p>
-      <w:pPr>
-        <w:pStyle w:val="ListBullet"/>
-      </w:pPr>
-      <w:r>
-        <w:t>bits = 56: Comparable performance class. Choose by deterministic-time preference</w:t>
-      </w:r>
-    </w:p>
-    <w:p>
-      <w:pPr>
-        <w:pStyle w:val="ListBullet"/>
-      </w:pPr>
-      <w:r>
-        <w:t>bits ≥ 64: Pollard's rho only. Thrust unified fails at bits=64 (sort scratch alloc), and at bits ≥ 72 the working set exceeds 96 GB host RAM regardless</w:t>
+        <w:t>Each dot is one of 10 trials; the purple bar marks the median. At bits=56 some trials beat Pollard's rho and some lose, depending purely on retry luck. Pollard's rho's advantage above the VRAM boundary is determinism, not raw speed. bits=64 was attempted in unified mode but every trial crashed inside thrust::sort_by_key during temp-buffer allocation, so it is dropped from the sweep. This reinforces the Task 3 conclusion: at bits &gt;= 64, Pollard's rho is the only approach that runs at all.</w:t>
       </w:r>
     </w:p>
     <w:p>
@@ -2307,9 +1748,11 @@
       </w:r>
     </w:p>
     <w:p>
-      <w:pPr/>
+      <w:pPr>
+        <w:pStyle w:val="ListBullet"/>
+      </w:pPr>
       <w:r>
-        <w:t>All project code is in the Final/ subdirectory of the repo:</w:t>
+        <w:t>Final/Code/: task1.cu, task2.cu, task3.cu, task4.cu, gpu_hashes_narrow.cuh, and CPU hash sources.</w:t>
       </w:r>
     </w:p>
     <w:p>
@@ -2317,7 +1760,7 @@
         <w:pStyle w:val="ListBullet"/>
       </w:pPr>
       <w:r>
-        <w:t>Final/Code/: task1.cu, task2.cu, task3.cu, task4.cu, gpu_hashes_narrow.cuh, plus md5/sha1/sha256 CPU sources</w:t>
+        <w:t>Final/sbatch/: SLURM scripts for all tasks.</w:t>
       </w:r>
     </w:p>
     <w:p>
@@ -2325,7 +1768,7 @@
         <w:pStyle w:val="ListBullet"/>
       </w:pPr>
       <w:r>
-        <w:t>Final/sbatch/: SLURM sbatch scripts for all tasks (task1/, task2/, task3/, task4/)</w:t>
+        <w:t>Final/Scripts/: Python plot generators.</w:t>
       </w:r>
     </w:p>
     <w:p>
@@ -2333,7 +1776,7 @@
         <w:pStyle w:val="ListBullet"/>
       </w:pPr>
       <w:r>
-        <w:t>Final/Scripts/: Python plotting scripts (plot_final_task*.py)</w:t>
+        <w:t>Final/Data/: .dat output files and PDF/PNG plots.</w:t>
       </w:r>
     </w:p>
     <w:p>
@@ -2341,15 +1784,7 @@
         <w:pStyle w:val="ListBullet"/>
       </w:pPr>
       <w:r>
-        <w:t>Final/Data/: Output .dat files and generated PDF/PNG plots</w:t>
-      </w:r>
-    </w:p>
-    <w:p>
-      <w:pPr>
-        <w:pStyle w:val="ListBullet"/>
-      </w:pPr>
-      <w:r>
-        <w:t>Final/Report/: per-task analysis text files and this report</w:t>
+        <w:t>Final/Report/: per-task analyses and this report.</w:t>
       </w:r>
     </w:p>
     <w:p>
@@ -2357,19 +1792,13 @@
         <w:pStyle w:val="Heading2"/>
       </w:pPr>
       <w:r>
-        <w:t>4.2 Compilation</w:t>
+        <w:t>4.2 Compilation and Run</w:t>
       </w:r>
     </w:p>
     <w:p>
       <w:pPr/>
       <w:r>
-        <w:t>All commands run from the repository root on the Euler cluster after: module load nvidia/cuda/13.0.0</w:t>
-      </w:r>
-    </w:p>
-    <w:p>
-      <w:pPr/>
-      <w:r>
-        <w:t>Task 1 and Task 2:</w:t>
+        <w:t>From the repository root after `module load nvidia/cuda/13.0.0`:</w:t>
       </w:r>
     </w:p>
     <w:p>
@@ -2378,15 +1807,17 @@
         <w:rPr>
           <w:rFonts w:ascii="Courier New" w:hAnsi="Courier New"/>
         </w:rPr>
-        <w:t>nvcc -O3 -std=c++17 -o Final/task1 Final/Code/task1.cu Final/Code/md5_cpu.cpp Final/Code/sha1_cpu.cpp Final/Code/sha256_cpu.cpp</w:t>
+        <w:t>nvcc -O3 -std=c++17 -Xcompiler -fopenmp -o Final/task3 Final/Code/task3.cu \</w:t>
         <w:br/>
-        <w:t>nvcc -O3 -std=c++17 -o Final/task2 Final/Code/task2.cu Final/Code/md5_cpu.cpp Final/Code/sha1_cpu.cpp Final/Code/sha256_cpu.cpp</w:t>
+        <w:t xml:space="preserve">    Final/Code/md5_cpu.cpp Final/Code/sha1_cpu.cpp Final/Code/sha256_cpu.cpp</w:t>
+        <w:br/>
+        <w:t>nvcc -O3 -std=c++17 -o Final/task4 Final/Code/task4.cu</w:t>
       </w:r>
     </w:p>
     <w:p>
       <w:pPr/>
       <w:r>
-        <w:t>Task 3 (requires -Xcompiler -fopenmp for OpenMP support):</w:t>
+        <w:t>Submit jobs:</w:t>
       </w:r>
     </w:p>
     <w:p>
@@ -2395,49 +1826,7 @@
         <w:rPr>
           <w:rFonts w:ascii="Courier New" w:hAnsi="Courier New"/>
         </w:rPr>
-        <w:t>nvcc -O3 -std=c++17 -Xcompiler -fopenmp -o Final/task3 Final/Code/task3.cu Final/Code/md5_cpu.cpp Final/Code/sha1_cpu.cpp Final/Code/sha256_cpu.cpp</w:t>
-      </w:r>
-    </w:p>
-    <w:p>
-      <w:pPr/>
-      <w:r>
-        <w:t>Task 4 (Thrust ships with CUDA, no extra link flags needed):</w:t>
-      </w:r>
-    </w:p>
-    <w:p>
-      <w:pPr/>
-      <w:r>
-        <w:rPr>
-          <w:rFonts w:ascii="Courier New" w:hAnsi="Courier New"/>
-        </w:rPr>
-        <w:t>nvcc -O3 -std=c++17 -o Final/task4 Final/Code/task4.cu</w:t>
-      </w:r>
-    </w:p>
-    <w:p>
-      <w:pPr>
-        <w:pStyle w:val="Heading2"/>
-      </w:pPr>
-      <w:r>
-        <w:t>4.3 Running via SLURM</w:t>
-      </w:r>
-    </w:p>
-    <w:p>
-      <w:pPr/>
-      <w:r>
-        <w:t>Submit all three Task 3 scaling jobs (one per algorithm), plus Task 4:</w:t>
-      </w:r>
-    </w:p>
-    <w:p>
-      <w:pPr/>
-      <w:r>
-        <w:rPr>
-          <w:rFonts w:ascii="Courier New" w:hAnsi="Courier New"/>
-        </w:rPr>
-        <w:t>sbatch Final/sbatch/task3/task3_md5_scaling.sh</w:t>
-        <w:br/>
-        <w:t>sbatch Final/sbatch/task3/task3_sha1_scaling.sh</w:t>
-        <w:br/>
-        <w:t>sbatch Final/sbatch/task3/task3_sha256_scaling.sh</w:t>
+        <w:t>sbatch Final/sbatch/task3/task3_md5_scaling.sh   # also sha1, sha256</w:t>
         <w:br/>
         <w:t>sbatch Final/sbatch/task4/task4_scaling.sh</w:t>
       </w:r>
@@ -2445,15 +1834,13 @@
     <w:p>
       <w:pPr/>
       <w:r>
-        <w:t>SLURM parameters for Task 3 jobs: -p instruction, --gres=gpu:1, --cpus-per-task=12, --mem=96G, -t 0-00:40:00. Data written to Final/Data/task3/.</w:t>
+        <w:t>Task 3 SLURM parameters: -p instruction, --gres=gpu:1, --cpus-per-task=12, --mem=96G, -t 0-00:40:00.</w:t>
       </w:r>
     </w:p>
     <w:p>
-      <w:pPr>
-        <w:pStyle w:val="Heading2"/>
-      </w:pPr>
+      <w:pPr/>
       <w:r>
-        <w:t>4.4 Generating Plots</w:t>
+        <w:t>Generate plots:</w:t>
       </w:r>
     </w:p>
     <w:p>
@@ -2484,7 +1871,7 @@
     <w:p>
       <w:pPr/>
       <w:r>
-        <w:t>This project shows three distinct regimes where the GPU helps with hash computations:</w:t>
+        <w:t>Three regimes of GPU advantage emerge across the four tasks:</w:t>
       </w:r>
     </w:p>
     <w:p>
@@ -2492,7 +1879,7 @@
         <w:pStyle w:val="ListBullet"/>
       </w:pPr>
       <w:r>
-        <w:t>Raw throughput (Tasks 1 and 2): The GPU achieves 167x to 440x throughput over serial CPU for large batches, driven by thread-level parallelism over independent hashes. Register pressure determines per-algorithm sensitivity to configuration, and tpb=32 is universally optimal for register-heavy hash kernels.</w:t>
+        <w:t>Raw throughput (Tasks 1 and 2): GPU is 167x to 440x faster than CPU serial for large batches. tpb=32 is universally optimal for register-heavy kernels.</w:t>
       </w:r>
     </w:p>
     <w:p>
@@ -2500,7 +1887,7 @@
         <w:pStyle w:val="ListBullet"/>
       </w:pPr>
       <w:r>
-        <w:t>Parallel CPU ceiling (Task 3, OpenMP): OpenMP parallelization of collision search is limited to about 2x speedup over serial at large bit widths due to the serial merge phase (Amdahl's Law) and NUMA topology. The 12-thread sweet spot is hardware-specific to Euler's dual-socket node and would differ on NUMA-free hardware.</w:t>
+        <w:t>Parallel CPU ceiling (Task 3 OpenMP): only 1.5x to 2.1x speedup at bits=56 due to Amdahl's serial merge and NUMA. The 12-thread sweet spot is hardware-specific to Euler's dual-socket node.</w:t>
       </w:r>
     </w:p>
     <w:p>
@@ -2508,7 +1895,7 @@
         <w:pStyle w:val="ListBullet"/>
       </w:pPr>
       <w:r>
-        <w:t>Algorithmic advantage (Task 3, GPU): The GPU's main advantage at bits ≥ 48 is not raw speed but algorithmic. Pollard's rho with distinguished points uses O(1) memory per thread, while any birthday-paradox CPU approach requires O(2^(N/2)) memory. At bits=64 the CPU needs about 100 GB while the GPU uses 8 MB. This makes bits=64 to 72 GPU-only regardless of CPU clock speed or parallelism level.</w:t>
+        <w:t>Algorithmic advantage (Task 3 GPU): O(1) memory per thread via Pollard's rho makes bits=64 to 72 GPU-only. At bits=64 the CPU needs roughly 100 GB; the GPU uses 8 MB.</w:t>
       </w:r>
     </w:p>
     <w:p>
@@ -2516,13 +1903,13 @@
         <w:pStyle w:val="ListBullet"/>
       </w:pPr>
       <w:r>
-        <w:t>Empirical confirmation via Task 4 (10-trial median methodology): With Unified Memory exposing host RAM to the GPU, the Thrust sort approach falls into the same performance class as Pollard's rho at bits=56. Per-round Thrust is faster, but retry variance makes total time comparable. Pollard's rho's advantage at bits=56 is determinism and predictable timing, not raw speed. At bits ≥ 72 the Thrust working set exceeds available host RAM and Pollard's rho is the only feasible option. The lesson is that O(1)-memory algorithms are valuable above the VRAM boundary not just for feasibility, but for predictability and graceful scaling.</w:t>
+        <w:t>Memory hierarchy and oversubscription (Task 4): even with unified memory and 96 GB host RAM, Thrust sort merely matches Pollard's rho at bits=56 and crashes outright at bits=64. Above the VRAM boundary the GPU advantage is determinism and graceful scaling, not raw bandwidth.</w:t>
       </w:r>
     </w:p>
     <w:p>
       <w:pPr/>
       <w:r>
-        <w:t>ME759 concepts leveraged in this project:</w:t>
+        <w:t>ME759 concepts applied:</w:t>
       </w:r>
     </w:p>
     <w:p>
@@ -2530,7 +1917,7 @@
         <w:pStyle w:val="ListBullet"/>
       </w:pPr>
       <w:r>
-        <w:t>CUDA kernel design: template specialization for zero warp divergence, cudaEvent_t timing, cudaMalloc/cudaFree memory management.</w:t>
+        <w:t>CUDA template kernels for zero warp divergence and cudaEvent_t timing</w:t>
       </w:r>
     </w:p>
     <w:p>
@@ -2538,7 +1925,7 @@
         <w:pStyle w:val="ListBullet"/>
       </w:pPr>
       <w:r>
-        <w:t>Occupancy and register pressure: SM register file limits, occupancy analysis, tpb tuning for register-heavy kernels.</w:t>
+        <w:t>Occupancy and register pressure analysis</w:t>
       </w:r>
     </w:p>
     <w:p>
@@ -2546,7 +1933,7 @@
         <w:pStyle w:val="ListBullet"/>
       </w:pPr>
       <w:r>
-        <w:t>OpenMP: parallel-for with schedule(static), omp_get_max_threads(), phase-parallel/serial-merge pattern.</w:t>
+        <w:t>OpenMP parallel-for and phase-parallel/serial-merge patterns</w:t>
       </w:r>
     </w:p>
     <w:p>
@@ -2554,7 +1941,7 @@
         <w:pStyle w:val="ListBullet"/>
       </w:pPr>
       <w:r>
-        <w:t>NUMA awareness: dual-socket topology, cross-socket memory latency, thread affinity and sweet spot analysis.</w:t>
+        <w:t>NUMA topology and dual-socket awareness</w:t>
       </w:r>
     </w:p>
     <w:p>
@@ -2562,7 +1949,7 @@
         <w:pStyle w:val="ListBullet"/>
       </w:pPr>
       <w:r>
-        <w:t>Amdahl's Law: serial fraction identification, theoretical speedup ceiling calculation for the two-phase parallel algorithm.</w:t>
+        <w:t>Amdahl's Law applied to a real two-phase algorithm</w:t>
       </w:r>
     </w:p>
     <w:p>
@@ -2570,7 +1957,7 @@
         <w:pStyle w:val="ListBullet"/>
       </w:pPr>
       <w:r>
-        <w:t>Memory hierarchy and oversubscription: comparing cudaMalloc vs cudaMallocManaged, page-tracking overhead, PCIe-bound performance under spill.</w:t>
+        <w:t>GPU memory hierarchy, VRAM limits, and unified-memory tradeoffs</w:t>
       </w:r>
     </w:p>
     <w:p>
@@ -2584,7 +1971,7 @@
         <w:pStyle w:val="ListBullet"/>
       </w:pPr>
       <w:r>
-        <w:t>bits=80 GPU: achievable in roughly 30 minutes but exceeds Euler's 40-minute instruction partition limit. Running on a partition with longer wall-clock limits would extend the speedup curve one more data point to bits=80.</w:t>
+        <w:t>bits=80 GPU: feasible in roughly 30 minutes but exceeds Euler's 40-minute instruction-partition wall-clock limit.</w:t>
       </w:r>
     </w:p>
     <w:p>
@@ -2592,7 +1979,7 @@
         <w:pStyle w:val="ListBullet"/>
       </w:pPr>
       <w:r>
-        <w:t>Parallel sort-based CPU collision search: replacing unordered_map with a flat sorted array reduces memory to about 43 GB at bits=64. A fully parallel radix sort plus linear scan could reach bits=64 on CPU in 20 to 30 seconds on a high-memory server, narrowing the algorithmic gap with Pollard's rho.</w:t>
+        <w:t>Parallel sort-based CPU collision search: replacing unordered_map with a flat sorted array could reach bits=64 on a high-memory CPU server in 20-30 seconds.</w:t>
       </w:r>
     </w:p>
     <w:p>
@@ -2600,7 +1987,7 @@
         <w:pStyle w:val="ListBullet"/>
       </w:pPr>
       <w:r>
-        <w:t>GPU Birthday Attack with device-side concurrent hash table. Allocate a large open-addressing hash table directly in GPU VRAM and have all 65,536 threads insert (truncated_hash, index) pairs in parallel using atomicCAS for lock-free collision detection. No CPU-side merge step is needed because the collision is detected on-device the moment two threads map to the same slot. At small bit widths (bits ≤ 48) where the entire table fits in GPU VRAM, this approach should be faster than Pollard's rho because it eliminates the chain-walking overhead. At bits ≥ 56 the table exceeds VRAM and Pollard's rho with O(1) memory wins. The crossover point is the main finding.</w:t>
+        <w:t>GPU device-side concurrent hash table (atomicCAS open-addressing): the third GPU strategy from the original Task 4 proposal, expected to beat Pollard's rho at small bit widths and lose at large ones.</w:t>
       </w:r>
     </w:p>
     <w:p>
@@ -2626,7 +2013,7 @@
     <w:p>
       <w:pPr/>
       <w:r>
-        <w:t>[3] van Oorschot, P. C., and Wiener, M. J. (1999). Parallel Collision Search with Cryptanalytic Applications. Journal of Cryptology, 12(1), 1-28. (Pollard's rho with distinguished points.)</w:t>
+        <w:t>[3] van Oorschot, P. C., and Wiener, M. J. (1999). Parallel Collision Search with Cryptanalytic Applications. Journal of Cryptology, 12(1), 1-28.</w:t>
       </w:r>
     </w:p>
     <w:p>
@@ -2644,19 +2031,19 @@
     <w:p>
       <w:pPr/>
       <w:r>
-        <w:t>[6] NVIDIA Corporation. (2024). CUDA C++ Programming Guide. https://docs.nvidia.com/cuda/cuda-c-programming-guide/ (cudaEvent_t timing, __constant__ memory, atomicAdd, warp scheduling, register file occupancy.)</w:t>
+        <w:t>[6] NVIDIA Corporation. (2024). CUDA C++ Programming Guide. https://docs.nvidia.com/cuda/cuda-c-programming-guide/</w:t>
       </w:r>
     </w:p>
     <w:p>
       <w:pPr/>
       <w:r>
-        <w:t>[7] Pollard, J. M. (1978). Monte Carlo methods for index computation mod p. Mathematics of Computation, 32(143), 918-924. (Original rho cycle-detection algorithm; extended by van Oorschot and Wiener [3].)</w:t>
+        <w:t>[7] Pollard, J. M. (1978). Monte Carlo methods for index computation mod p. Mathematics of Computation, 32(143), 918-924.</w:t>
       </w:r>
     </w:p>
     <w:p>
       <w:pPr/>
       <w:r>
-        <w:t>[8] Flajolet, P., and Odlyzko, A. (1990). Random mapping statistics. Advances in Cryptology, EUROCRYPT '89, Lecture Notes in Computer Science, vol. 434, pp. 329-354. Springer. (Source for birthday paradox collision expectation E ≈ sqrt(π/2) · 2^(N/2).)</w:t>
+        <w:t>[8] Flajolet, P., and Odlyzko, A. (1990). Random mapping statistics. EUROCRYPT '89, LNCS vol. 434, pp. 329-354. Springer.</w:t>
       </w:r>
     </w:p>
     <w:p>
@@ -2668,7 +2055,7 @@
     <w:p>
       <w:pPr/>
       <w:r>
-        <w:t>[10] Anthropic. (2026). Claude Code with Claude Sonnet 4.6 (claude-sonnet-4-6) [AI coding assistant]. Used for code generation, algorithm implementation, and analysis throughout this project. https://www.anthropic.com/claude-code</w:t>
+        <w:t>[10] Anthropic. (2026). Claude Code with Claude Sonnet 4.6 (claude-sonnet-4-6) [AI coding assistant]. Used for code generation, algorithm implementation, and analysis. https://www.anthropic.com/claude-code</w:t>
       </w:r>
     </w:p>
     <w:sectPr>

</xml_diff>